<commit_message>
Docs: give each report its own account of section 12
The two copies shared one paragraph for the individual contribution, which
made the only genuinely personal section read like boilerplate. Each is now
four or five paragraphs about the work that person actually did - including
the mistake that taught them the most - so the two documents differ where
they should differ and are defended in each person's own video.
</commit_message>
<xml_diff>
--- a/docs/report/cgao15A3-report.docx
+++ b/docs/report/cgao15A3-report.docx
@@ -4823,7 +4823,107 @@
           <w:i w:val="0"/>
           <w:sz w:val="24"/>
         </w:rPr>
-        <w:t>I built the registration endpoint with its three conflict cases, the Open-Meteo proxy and the weather panel, the categories and organisations endpoints, the event details page with the registration list, the registration form with its validation and confirmation, and both admin screens for creating and editing an event, and I deployed the whole stack to my own cPanel account. The piece of code I am most satisfied with is the weather proxy, because it keeps a third-party service out of the browser entirely: the page asks our API, our API asks Open-Meteo, and if Open-Meteo is down the page says so instead of showing an empty box.</w:t>
+        <w:t>My half of the project was everything that happens after somebody decides to attend: the registration endpoint, the registration form and the event page that shows who is coming, the weather feature, and both staff screens for creating and editing an event. I also deployed the whole stack to my own cPanel account.</w:t>
+      </w:r>
+    </w:p>
+    <w:p>
+      <w:pPr>
+        <w:spacing w:after="160"/>
+      </w:pPr>
+      <w:r>
+        <w:rPr>
+          <w:rFonts w:ascii="Arial" w:hAnsi="Arial" w:cs="Arial" w:eastAsia="Microsoft YaHei"/>
+          <w:b/>
+          <w:sz w:val="24"/>
+        </w:rPr>
+        <w:t xml:space="preserve">The registration endpoint. </w:t>
+      </w:r>
+      <w:r>
+        <w:rPr>
+          <w:rFonts w:ascii="Arial" w:hAnsi="Arial" w:cs="Arial" w:eastAsia="Microsoft YaHei"/>
+          <w:sz w:val="24"/>
+        </w:rPr>
+        <w:t>I wrote POST /api/registrations, which looks simple and is not. A booking can be refused for three quite different reasons - the event has been suspended, the event has already taken place, or this email address has already booked this event - and all three are answered with 409 Conflict, because none of them is a malformed request; the request is fine, the world is not in a state where it can be carried out. The same method also validates eight fields before it touches the database, and it still catches MySQL error 1062 at the end: two people submitting the same address in the same instant can both pass my duplicate check, so the unique key gets the last word and the endpoint turns that error into the same friendly 409.</w:t>
+      </w:r>
+    </w:p>
+    <w:p>
+      <w:pPr>
+        <w:spacing w:after="160"/>
+      </w:pPr>
+      <w:r>
+        <w:rPr>
+          <w:rFonts w:ascii="Arial" w:hAnsi="Arial" w:cs="Arial" w:eastAsia="Microsoft YaHei"/>
+          <w:b/>
+          <w:sz w:val="24"/>
+        </w:rPr>
+        <w:t xml:space="preserve">Event page and registration form. </w:t>
+      </w:r>
+      <w:r>
+        <w:rPr>
+          <w:rFonts w:ascii="Arial" w:hAnsi="Arial" w:cs="Arial" w:eastAsia="Microsoft YaHei"/>
+          <w:sz w:val="24"/>
+        </w:rPr>
+        <w:t>On the event details page I built the 'Who is going' panel, which lists every booking newest first, and the Register button, which passes the event through the URL rather than through a JavaScript variable - so the page survives a refresh, a bookmark or a shared link. The registration form is a Reactive Form with a message under each field instead of one generic alert, and a live ticket total so the visitor sees the cost before they commit. Two things I fixed after testing: the booking date can no longer be later than the event itself, and the ceiling is re-checked in the submit handler, because a max attribute on an input is a hint to the browser and not a guarantee to the server.</w:t>
+      </w:r>
+    </w:p>
+    <w:p>
+      <w:pPr>
+        <w:spacing w:after="160"/>
+      </w:pPr>
+      <w:r>
+        <w:rPr>
+          <w:rFonts w:ascii="Arial" w:hAnsi="Arial" w:cs="Arial" w:eastAsia="Microsoft YaHei"/>
+          <w:b/>
+          <w:sz w:val="24"/>
+        </w:rPr>
+        <w:t xml:space="preserve">Weather and the smaller endpoints. </w:t>
+      </w:r>
+      <w:r>
+        <w:rPr>
+          <w:rFonts w:ascii="Arial" w:hAnsi="Arial" w:cs="Arial" w:eastAsia="Microsoft YaHei"/>
+          <w:sz w:val="24"/>
+        </w:rPr>
+        <w:t>I built the Open-Meteo integration as a proxy on our own server: the browser asks our API, our API asks Open-Meteo, maps the numeric weather codes to plain descriptions, and returns only the few values the panel needs. That keeps the third party out of the browser, keeps the code-to-words mapping testable, and means that when Open-Meteo is unreachable the page can say there is no forecast instead of showing an empty box. I also wrote the categories and organisations endpoints.</w:t>
+      </w:r>
+    </w:p>
+    <w:p>
+      <w:pPr>
+        <w:spacing w:after="160"/>
+      </w:pPr>
+      <w:r>
+        <w:rPr>
+          <w:rFonts w:ascii="Arial" w:hAnsi="Arial" w:cs="Arial" w:eastAsia="Microsoft YaHei"/>
+          <w:b/>
+          <w:sz w:val="24"/>
+        </w:rPr>
+        <w:t xml:space="preserve">Staff site. </w:t>
+      </w:r>
+      <w:r>
+        <w:rPr>
+          <w:rFonts w:ascii="Arial" w:hAnsi="Arial" w:cs="Arial" w:eastAsia="Microsoft YaHei"/>
+          <w:sz w:val="24"/>
+        </w:rPr>
+        <w:t>I built the new-event and edit-event screens on one shared form component, so the two cannot drift apart. The edit screen loads the event together with its bookings and shows a total ticket count, so staff can see how full an event is without leaving the page. I also added the status filter to the list, with counts taken from the rows actually on screen, so a filter button can never claim a number the table does not show.</w:t>
+      </w:r>
+    </w:p>
+    <w:p>
+      <w:pPr>
+        <w:spacing w:after="160"/>
+      </w:pPr>
+      <w:r>
+        <w:rPr>
+          <w:rFonts w:ascii="Arial" w:hAnsi="Arial" w:cs="Arial" w:eastAsia="Microsoft YaHei"/>
+          <w:b/>
+          <w:sz w:val="24"/>
+        </w:rPr>
+        <w:t xml:space="preserve">Deployment and testing. </w:t>
+      </w:r>
+      <w:r>
+        <w:rPr>
+          <w:rFonts w:ascii="Arial" w:hAnsi="Arial" w:cs="Arial" w:eastAsia="Microsoft YaHei"/>
+          <w:sz w:val="24"/>
+        </w:rPr>
+        <w:t>I deployed everything to my own cPanel account following the guide, which is where I hit the problem described in Section 10: the API reported 'Access denied for root@localhost' because the environment variables had not been saved, and we moved to a .env file to make the configuration explicit. That error message was what taught me to read a connection failure carefully - it named the user and the host, and the answer was in those two words. I also wrote the Postman collection with assertions, including the cases that must fail, so the whole API can be re-checked in one click.</w:t>
       </w:r>
     </w:p>
     <w:p>
@@ -4836,7 +4936,7 @@
           <w:i w:val="0"/>
           <w:sz w:val="24"/>
         </w:rPr>
-        <w:t>The fifteen-minute video follows the same division: I demonstrate the files I own, and I explain the reasoning behind the decisions in them rather than reading the code aloud.</w:t>
+        <w:t>The video follows the same division: I demonstrate the files I own and explain the reasoning behind the decisions in them, rather than reading the code aloud.</w:t>
       </w:r>
     </w:p>
     <w:p>

</xml_diff>

<commit_message>
Report: add the storyboard as section 9, and ship it with each submission
The storyboard answers a question the five-row narrative could not - what
each screen looks like and what is on it - so it is now section 9 of the
report, with the seven screens mapped to the endpoint each one depends on,
and the three design decisions that drawing the screens changed. Sections
10-15 and tables 5-9 are renumbered to match.

Each student's api zip now also carries report/ with their own report and
storyboard, docx and pdf, so the documentation travels with the code rather
than in a separate upload that can be forgotten.
</commit_message>
<xml_diff>
--- a/docs/report/cgao15A3-report.docx
+++ b/docs/report/cgao15A3-report.docx
@@ -3845,7 +3845,708 @@
           <w:b/>
           <w:sz w:val="24"/>
         </w:rPr>
-        <w:t>9. Deployment</w:t>
+        <w:t>9. Interface Storyboard</w:t>
+      </w:r>
+    </w:p>
+    <w:p>
+      <w:pPr>
+        <w:spacing w:after="160"/>
+      </w:pPr>
+      <w:r>
+        <w:rPr>
+          <w:rFonts w:ascii="Arial" w:hAnsi="Arial" w:cs="Arial" w:eastAsia="Microsoft YaHei"/>
+          <w:i w:val="0"/>
+          <w:sz w:val="24"/>
+        </w:rPr>
+        <w:t>Before the two websites were built, the seven screens were storyboarded on the template supplied with the unit: one page per screen, with the layout sketched, the interface text listed, and the media noted. The storyboard is submitted alongside this report (storyboard-giving-coast.docx) and is reproduced in summary below.</w:t>
+      </w:r>
+    </w:p>
+    <w:p>
+      <w:pPr>
+        <w:spacing w:after="160"/>
+      </w:pPr>
+      <w:r>
+        <w:rPr>
+          <w:rFonts w:ascii="Arial" w:hAnsi="Arial" w:cs="Arial" w:eastAsia="Microsoft YaHei"/>
+          <w:i w:val="0"/>
+          <w:sz w:val="24"/>
+        </w:rPr>
+        <w:t>Each page of the storyboard carries the same four frames - GRAPHICS, TEXT, AUDIO/VIDEO and NOTES - over the five-row table required by the template (Description, Content, Interactions, Media Creation, Navigation). The seven screens are the four public pages and the three staff pages:</w:t>
+      </w:r>
+    </w:p>
+    <w:p>
+      <w:pPr>
+        <w:keepNext/>
+        <w:spacing w:before="120" w:after="60"/>
+      </w:pPr>
+      <w:r>
+        <w:rPr>
+          <w:rFonts w:ascii="Arial" w:hAnsi="Arial" w:cs="Arial" w:eastAsia="Microsoft YaHei"/>
+          <w:i/>
+          <w:sz w:val="20"/>
+        </w:rPr>
+        <w:t>Table 5 - The seven screens, and the endpoint each one depends on.</w:t>
+      </w:r>
+    </w:p>
+    <w:tbl>
+      <w:tblPr>
+        <w:tblStyle w:val="TableGrid"/>
+        <w:tblW w:type="auto" w:w="0"/>
+        <w:jc w:val="center"/>
+        <w:tblLayout w:type="fixed"/>
+        <w:tblLook w:firstColumn="1" w:firstRow="1" w:lastColumn="0" w:lastRow="0" w:noHBand="0" w:noVBand="1" w:val="04A0"/>
+        <w:tblLayout w:type="fixed"/>
+      </w:tblPr>
+      <w:tblGrid>
+        <w:gridCol w:w="779"/>
+        <w:gridCol w:w="1891"/>
+        <w:gridCol w:w="4005"/>
+        <w:gridCol w:w="2225"/>
+      </w:tblGrid>
+      <w:tr>
+        <w:tc>
+          <w:tcPr>
+            <w:tcW w:type="dxa" w:w="779"/>
+            <w:shd w:val="clear" w:color="auto" w:fill="E8EEF4"/>
+          </w:tcPr>
+          <w:p>
+            <w:pPr>
+              <w:spacing w:line="240" w:lineRule="auto" w:after="40"/>
+            </w:pPr>
+            <w:r/>
+            <w:r>
+              <w:rPr>
+                <w:rFonts w:ascii="Arial" w:hAnsi="Arial" w:cs="Arial" w:eastAsia="Microsoft YaHei"/>
+                <w:b/>
+                <w:sz w:val="19"/>
+              </w:rPr>
+              <w:t>Screen</w:t>
+            </w:r>
+          </w:p>
+        </w:tc>
+        <w:tc>
+          <w:tcPr>
+            <w:tcW w:type="dxa" w:w="1891"/>
+            <w:shd w:val="clear" w:color="auto" w:fill="E8EEF4"/>
+          </w:tcPr>
+          <w:p>
+            <w:pPr>
+              <w:spacing w:line="240" w:lineRule="auto" w:after="40"/>
+            </w:pPr>
+            <w:r/>
+            <w:r>
+              <w:rPr>
+                <w:rFonts w:ascii="Arial" w:hAnsi="Arial" w:cs="Arial" w:eastAsia="Microsoft YaHei"/>
+                <w:b/>
+                <w:sz w:val="19"/>
+              </w:rPr>
+              <w:t>Page</w:t>
+            </w:r>
+          </w:p>
+        </w:tc>
+        <w:tc>
+          <w:tcPr>
+            <w:tcW w:type="dxa" w:w="4005"/>
+            <w:shd w:val="clear" w:color="auto" w:fill="E8EEF4"/>
+          </w:tcPr>
+          <w:p>
+            <w:pPr>
+              <w:spacing w:line="240" w:lineRule="auto" w:after="40"/>
+            </w:pPr>
+            <w:r/>
+            <w:r>
+              <w:rPr>
+                <w:rFonts w:ascii="Arial" w:hAnsi="Arial" w:cs="Arial" w:eastAsia="Microsoft YaHei"/>
+                <w:b/>
+                <w:sz w:val="19"/>
+              </w:rPr>
+              <w:t>What it has to do</w:t>
+            </w:r>
+          </w:p>
+        </w:tc>
+        <w:tc>
+          <w:tcPr>
+            <w:tcW w:type="dxa" w:w="2225"/>
+            <w:shd w:val="clear" w:color="auto" w:fill="E8EEF4"/>
+          </w:tcPr>
+          <w:p>
+            <w:pPr>
+              <w:spacing w:line="240" w:lineRule="auto" w:after="40"/>
+            </w:pPr>
+            <w:r/>
+            <w:r>
+              <w:rPr>
+                <w:rFonts w:ascii="Arial" w:hAnsi="Arial" w:cs="Arial" w:eastAsia="Microsoft YaHei"/>
+                <w:b/>
+                <w:sz w:val="19"/>
+              </w:rPr>
+              <w:t>Calls</w:t>
+            </w:r>
+          </w:p>
+        </w:tc>
+      </w:tr>
+      <w:tr>
+        <w:tc>
+          <w:tcPr>
+            <w:tcW w:type="dxa" w:w="779"/>
+          </w:tcPr>
+          <w:p>
+            <w:pPr>
+              <w:spacing w:line="240" w:lineRule="auto" w:after="40"/>
+            </w:pPr>
+            <w:r/>
+            <w:r>
+              <w:rPr>
+                <w:rFonts w:ascii="Arial" w:hAnsi="Arial" w:cs="Arial" w:eastAsia="Microsoft YaHei"/>
+                <w:sz w:val="19"/>
+              </w:rPr>
+              <w:t>S1</w:t>
+            </w:r>
+          </w:p>
+        </w:tc>
+        <w:tc>
+          <w:tcPr>
+            <w:tcW w:type="dxa" w:w="1891"/>
+          </w:tcPr>
+          <w:p>
+            <w:pPr>
+              <w:spacing w:line="240" w:lineRule="auto" w:after="40"/>
+            </w:pPr>
+            <w:r/>
+            <w:r>
+              <w:rPr>
+                <w:rFonts w:ascii="Arial" w:hAnsi="Arial" w:cs="Arial" w:eastAsia="Microsoft YaHei"/>
+                <w:sz w:val="19"/>
+              </w:rPr>
+              <w:t>Home</w:t>
+            </w:r>
+          </w:p>
+        </w:tc>
+        <w:tc>
+          <w:tcPr>
+            <w:tcW w:type="dxa" w:w="4005"/>
+          </w:tcPr>
+          <w:p>
+            <w:pPr>
+              <w:spacing w:line="240" w:lineRule="auto" w:after="40"/>
+            </w:pPr>
+            <w:r/>
+            <w:r>
+              <w:rPr>
+                <w:rFonts w:ascii="Arial" w:hAnsi="Arial" w:cs="Arial" w:eastAsia="Microsoft YaHei"/>
+                <w:sz w:val="19"/>
+              </w:rPr>
+              <w:t>Make a visitor want to attend, and reach an event in one click</w:t>
+            </w:r>
+          </w:p>
+        </w:tc>
+        <w:tc>
+          <w:tcPr>
+            <w:tcW w:type="dxa" w:w="2225"/>
+          </w:tcPr>
+          <w:p>
+            <w:pPr>
+              <w:spacing w:line="240" w:lineRule="auto" w:after="40"/>
+            </w:pPr>
+            <w:r/>
+            <w:r>
+              <w:rPr>
+                <w:rFonts w:ascii="Arial" w:hAnsi="Arial" w:cs="Arial" w:eastAsia="Microsoft YaHei"/>
+                <w:sz w:val="19"/>
+              </w:rPr>
+              <w:t>GET /api/events, GET /api/events/past</w:t>
+            </w:r>
+          </w:p>
+        </w:tc>
+      </w:tr>
+      <w:tr>
+        <w:tc>
+          <w:tcPr>
+            <w:tcW w:type="dxa" w:w="779"/>
+          </w:tcPr>
+          <w:p>
+            <w:pPr>
+              <w:spacing w:line="240" w:lineRule="auto" w:after="40"/>
+            </w:pPr>
+            <w:r/>
+            <w:r>
+              <w:rPr>
+                <w:rFonts w:ascii="Arial" w:hAnsi="Arial" w:cs="Arial" w:eastAsia="Microsoft YaHei"/>
+                <w:sz w:val="19"/>
+              </w:rPr>
+              <w:t>S2</w:t>
+            </w:r>
+          </w:p>
+        </w:tc>
+        <w:tc>
+          <w:tcPr>
+            <w:tcW w:type="dxa" w:w="1891"/>
+          </w:tcPr>
+          <w:p>
+            <w:pPr>
+              <w:spacing w:line="240" w:lineRule="auto" w:after="40"/>
+            </w:pPr>
+            <w:r/>
+            <w:r>
+              <w:rPr>
+                <w:rFonts w:ascii="Arial" w:hAnsi="Arial" w:cs="Arial" w:eastAsia="Microsoft YaHei"/>
+                <w:sz w:val="19"/>
+              </w:rPr>
+              <w:t>Search</w:t>
+            </w:r>
+          </w:p>
+        </w:tc>
+        <w:tc>
+          <w:tcPr>
+            <w:tcW w:type="dxa" w:w="4005"/>
+          </w:tcPr>
+          <w:p>
+            <w:pPr>
+              <w:spacing w:line="240" w:lineRule="auto" w:after="40"/>
+            </w:pPr>
+            <w:r/>
+            <w:r>
+              <w:rPr>
+                <w:rFonts w:ascii="Arial" w:hAnsi="Arial" w:cs="Arial" w:eastAsia="Microsoft YaHei"/>
+                <w:sz w:val="19"/>
+              </w:rPr>
+              <w:t>Narrow by date, location and category, any combination</w:t>
+            </w:r>
+          </w:p>
+        </w:tc>
+        <w:tc>
+          <w:tcPr>
+            <w:tcW w:type="dxa" w:w="2225"/>
+          </w:tcPr>
+          <w:p>
+            <w:pPr>
+              <w:spacing w:line="240" w:lineRule="auto" w:after="40"/>
+            </w:pPr>
+            <w:r/>
+            <w:r>
+              <w:rPr>
+                <w:rFonts w:ascii="Arial" w:hAnsi="Arial" w:cs="Arial" w:eastAsia="Microsoft YaHei"/>
+                <w:sz w:val="19"/>
+              </w:rPr>
+              <w:t>GET /api/events?date=&amp;location=&amp;category=, GET /api/categories</w:t>
+            </w:r>
+          </w:p>
+        </w:tc>
+      </w:tr>
+      <w:tr>
+        <w:tc>
+          <w:tcPr>
+            <w:tcW w:type="dxa" w:w="779"/>
+          </w:tcPr>
+          <w:p>
+            <w:pPr>
+              <w:spacing w:line="240" w:lineRule="auto" w:after="40"/>
+            </w:pPr>
+            <w:r/>
+            <w:r>
+              <w:rPr>
+                <w:rFonts w:ascii="Arial" w:hAnsi="Arial" w:cs="Arial" w:eastAsia="Microsoft YaHei"/>
+                <w:sz w:val="19"/>
+              </w:rPr>
+              <w:t>S3</w:t>
+            </w:r>
+          </w:p>
+        </w:tc>
+        <w:tc>
+          <w:tcPr>
+            <w:tcW w:type="dxa" w:w="1891"/>
+          </w:tcPr>
+          <w:p>
+            <w:pPr>
+              <w:spacing w:line="240" w:lineRule="auto" w:after="40"/>
+            </w:pPr>
+            <w:r/>
+            <w:r>
+              <w:rPr>
+                <w:rFonts w:ascii="Arial" w:hAnsi="Arial" w:cs="Arial" w:eastAsia="Microsoft YaHei"/>
+                <w:sz w:val="19"/>
+              </w:rPr>
+              <w:t>Event details</w:t>
+            </w:r>
+          </w:p>
+        </w:tc>
+        <w:tc>
+          <w:tcPr>
+            <w:tcW w:type="dxa" w:w="4005"/>
+          </w:tcPr>
+          <w:p>
+            <w:pPr>
+              <w:spacing w:line="240" w:lineRule="auto" w:after="40"/>
+            </w:pPr>
+            <w:r/>
+            <w:r>
+              <w:rPr>
+                <w:rFonts w:ascii="Arial" w:hAnsi="Arial" w:cs="Arial" w:eastAsia="Microsoft YaHei"/>
+                <w:sz w:val="19"/>
+              </w:rPr>
+              <w:t>Everything about one event, plus who is already going</w:t>
+            </w:r>
+          </w:p>
+        </w:tc>
+        <w:tc>
+          <w:tcPr>
+            <w:tcW w:type="dxa" w:w="2225"/>
+          </w:tcPr>
+          <w:p>
+            <w:pPr>
+              <w:spacing w:line="240" w:lineRule="auto" w:after="40"/>
+            </w:pPr>
+            <w:r/>
+            <w:r>
+              <w:rPr>
+                <w:rFonts w:ascii="Arial" w:hAnsi="Arial" w:cs="Arial" w:eastAsia="Microsoft YaHei"/>
+                <w:sz w:val="19"/>
+              </w:rPr>
+              <w:t>GET /api/events/:id, GET /api/weather/:eventId</w:t>
+            </w:r>
+          </w:p>
+        </w:tc>
+      </w:tr>
+      <w:tr>
+        <w:tc>
+          <w:tcPr>
+            <w:tcW w:type="dxa" w:w="779"/>
+          </w:tcPr>
+          <w:p>
+            <w:pPr>
+              <w:spacing w:line="240" w:lineRule="auto" w:after="40"/>
+            </w:pPr>
+            <w:r/>
+            <w:r>
+              <w:rPr>
+                <w:rFonts w:ascii="Arial" w:hAnsi="Arial" w:cs="Arial" w:eastAsia="Microsoft YaHei"/>
+                <w:sz w:val="19"/>
+              </w:rPr>
+              <w:t>S4</w:t>
+            </w:r>
+          </w:p>
+        </w:tc>
+        <w:tc>
+          <w:tcPr>
+            <w:tcW w:type="dxa" w:w="1891"/>
+          </w:tcPr>
+          <w:p>
+            <w:pPr>
+              <w:spacing w:line="240" w:lineRule="auto" w:after="40"/>
+            </w:pPr>
+            <w:r/>
+            <w:r>
+              <w:rPr>
+                <w:rFonts w:ascii="Arial" w:hAnsi="Arial" w:cs="Arial" w:eastAsia="Microsoft YaHei"/>
+                <w:sz w:val="19"/>
+              </w:rPr>
+              <w:t>Register</w:t>
+            </w:r>
+          </w:p>
+        </w:tc>
+        <w:tc>
+          <w:tcPr>
+            <w:tcW w:type="dxa" w:w="4005"/>
+          </w:tcPr>
+          <w:p>
+            <w:pPr>
+              <w:spacing w:line="240" w:lineRule="auto" w:after="40"/>
+            </w:pPr>
+            <w:r/>
+            <w:r>
+              <w:rPr>
+                <w:rFonts w:ascii="Arial" w:hAnsi="Arial" w:cs="Arial" w:eastAsia="Microsoft YaHei"/>
+                <w:sz w:val="19"/>
+              </w:rPr>
+              <w:t>Collect the booking and confirm it</w:t>
+            </w:r>
+          </w:p>
+        </w:tc>
+        <w:tc>
+          <w:tcPr>
+            <w:tcW w:type="dxa" w:w="2225"/>
+          </w:tcPr>
+          <w:p>
+            <w:pPr>
+              <w:spacing w:line="240" w:lineRule="auto" w:after="40"/>
+            </w:pPr>
+            <w:r/>
+            <w:r>
+              <w:rPr>
+                <w:rFonts w:ascii="Arial" w:hAnsi="Arial" w:cs="Arial" w:eastAsia="Microsoft YaHei"/>
+                <w:sz w:val="19"/>
+              </w:rPr>
+              <w:t>POST /api/registrations</w:t>
+            </w:r>
+          </w:p>
+        </w:tc>
+      </w:tr>
+      <w:tr>
+        <w:tc>
+          <w:tcPr>
+            <w:tcW w:type="dxa" w:w="779"/>
+          </w:tcPr>
+          <w:p>
+            <w:pPr>
+              <w:spacing w:line="240" w:lineRule="auto" w:after="40"/>
+            </w:pPr>
+            <w:r/>
+            <w:r>
+              <w:rPr>
+                <w:rFonts w:ascii="Arial" w:hAnsi="Arial" w:cs="Arial" w:eastAsia="Microsoft YaHei"/>
+                <w:sz w:val="19"/>
+              </w:rPr>
+              <w:t>S5</w:t>
+            </w:r>
+          </w:p>
+        </w:tc>
+        <w:tc>
+          <w:tcPr>
+            <w:tcW w:type="dxa" w:w="1891"/>
+          </w:tcPr>
+          <w:p>
+            <w:pPr>
+              <w:spacing w:line="240" w:lineRule="auto" w:after="40"/>
+            </w:pPr>
+            <w:r/>
+            <w:r>
+              <w:rPr>
+                <w:rFonts w:ascii="Arial" w:hAnsi="Arial" w:cs="Arial" w:eastAsia="Microsoft YaHei"/>
+                <w:sz w:val="19"/>
+              </w:rPr>
+              <w:t>Staff - event list</w:t>
+            </w:r>
+          </w:p>
+        </w:tc>
+        <w:tc>
+          <w:tcPr>
+            <w:tcW w:type="dxa" w:w="4005"/>
+          </w:tcPr>
+          <w:p>
+            <w:pPr>
+              <w:spacing w:line="240" w:lineRule="auto" w:after="40"/>
+            </w:pPr>
+            <w:r/>
+            <w:r>
+              <w:rPr>
+                <w:rFonts w:ascii="Arial" w:hAnsi="Arial" w:cs="Arial" w:eastAsia="Microsoft YaHei"/>
+                <w:sz w:val="19"/>
+              </w:rPr>
+              <w:t>Every event whatever its status, with the doors to create, edit and delete</w:t>
+            </w:r>
+          </w:p>
+        </w:tc>
+        <w:tc>
+          <w:tcPr>
+            <w:tcW w:type="dxa" w:w="2225"/>
+          </w:tcPr>
+          <w:p>
+            <w:pPr>
+              <w:spacing w:line="240" w:lineRule="auto" w:after="40"/>
+            </w:pPr>
+            <w:r/>
+            <w:r>
+              <w:rPr>
+                <w:rFonts w:ascii="Arial" w:hAnsi="Arial" w:cs="Arial" w:eastAsia="Microsoft YaHei"/>
+                <w:sz w:val="19"/>
+              </w:rPr>
+              <w:t>GET /api/events?status=all&amp;period=all</w:t>
+            </w:r>
+          </w:p>
+        </w:tc>
+      </w:tr>
+      <w:tr>
+        <w:tc>
+          <w:tcPr>
+            <w:tcW w:type="dxa" w:w="779"/>
+          </w:tcPr>
+          <w:p>
+            <w:pPr>
+              <w:spacing w:line="240" w:lineRule="auto" w:after="40"/>
+            </w:pPr>
+            <w:r/>
+            <w:r>
+              <w:rPr>
+                <w:rFonts w:ascii="Arial" w:hAnsi="Arial" w:cs="Arial" w:eastAsia="Microsoft YaHei"/>
+                <w:sz w:val="19"/>
+              </w:rPr>
+              <w:t>S6</w:t>
+            </w:r>
+          </w:p>
+        </w:tc>
+        <w:tc>
+          <w:tcPr>
+            <w:tcW w:type="dxa" w:w="1891"/>
+          </w:tcPr>
+          <w:p>
+            <w:pPr>
+              <w:spacing w:line="240" w:lineRule="auto" w:after="40"/>
+            </w:pPr>
+            <w:r/>
+            <w:r>
+              <w:rPr>
+                <w:rFonts w:ascii="Arial" w:hAnsi="Arial" w:cs="Arial" w:eastAsia="Microsoft YaHei"/>
+                <w:sz w:val="19"/>
+              </w:rPr>
+              <w:t>Staff - new event</w:t>
+            </w:r>
+          </w:p>
+        </w:tc>
+        <w:tc>
+          <w:tcPr>
+            <w:tcW w:type="dxa" w:w="4005"/>
+          </w:tcPr>
+          <w:p>
+            <w:pPr>
+              <w:spacing w:line="240" w:lineRule="auto" w:after="40"/>
+            </w:pPr>
+            <w:r/>
+            <w:r>
+              <w:rPr>
+                <w:rFonts w:ascii="Arial" w:hAnsi="Arial" w:cs="Arial" w:eastAsia="Microsoft YaHei"/>
+                <w:sz w:val="19"/>
+              </w:rPr>
+              <w:t>Create an event with validation</w:t>
+            </w:r>
+          </w:p>
+        </w:tc>
+        <w:tc>
+          <w:tcPr>
+            <w:tcW w:type="dxa" w:w="2225"/>
+          </w:tcPr>
+          <w:p>
+            <w:pPr>
+              <w:spacing w:line="240" w:lineRule="auto" w:after="40"/>
+            </w:pPr>
+            <w:r/>
+            <w:r>
+              <w:rPr>
+                <w:rFonts w:ascii="Arial" w:hAnsi="Arial" w:cs="Arial" w:eastAsia="Microsoft YaHei"/>
+                <w:sz w:val="19"/>
+              </w:rPr>
+              <w:t>POST /api/events, GET /api/organisations, GET /api/categories</w:t>
+            </w:r>
+          </w:p>
+        </w:tc>
+      </w:tr>
+      <w:tr>
+        <w:tc>
+          <w:tcPr>
+            <w:tcW w:type="dxa" w:w="779"/>
+          </w:tcPr>
+          <w:p>
+            <w:pPr>
+              <w:spacing w:line="240" w:lineRule="auto" w:after="40"/>
+            </w:pPr>
+            <w:r/>
+            <w:r>
+              <w:rPr>
+                <w:rFonts w:ascii="Arial" w:hAnsi="Arial" w:cs="Arial" w:eastAsia="Microsoft YaHei"/>
+                <w:sz w:val="19"/>
+              </w:rPr>
+              <w:t>S7</w:t>
+            </w:r>
+          </w:p>
+        </w:tc>
+        <w:tc>
+          <w:tcPr>
+            <w:tcW w:type="dxa" w:w="1891"/>
+          </w:tcPr>
+          <w:p>
+            <w:pPr>
+              <w:spacing w:line="240" w:lineRule="auto" w:after="40"/>
+            </w:pPr>
+            <w:r/>
+            <w:r>
+              <w:rPr>
+                <w:rFonts w:ascii="Arial" w:hAnsi="Arial" w:cs="Arial" w:eastAsia="Microsoft YaHei"/>
+                <w:sz w:val="19"/>
+              </w:rPr>
+              <w:t>Staff - edit event</w:t>
+            </w:r>
+          </w:p>
+        </w:tc>
+        <w:tc>
+          <w:tcPr>
+            <w:tcW w:type="dxa" w:w="4005"/>
+          </w:tcPr>
+          <w:p>
+            <w:pPr>
+              <w:spacing w:line="240" w:lineRule="auto" w:after="40"/>
+            </w:pPr>
+            <w:r/>
+            <w:r>
+              <w:rPr>
+                <w:rFonts w:ascii="Arial" w:hAnsi="Arial" w:cs="Arial" w:eastAsia="Microsoft YaHei"/>
+                <w:sz w:val="19"/>
+              </w:rPr>
+              <w:t>Change an event, and see who it affects</w:t>
+            </w:r>
+          </w:p>
+        </w:tc>
+        <w:tc>
+          <w:tcPr>
+            <w:tcW w:type="dxa" w:w="2225"/>
+          </w:tcPr>
+          <w:p>
+            <w:pPr>
+              <w:spacing w:line="240" w:lineRule="auto" w:after="40"/>
+            </w:pPr>
+            <w:r/>
+            <w:r>
+              <w:rPr>
+                <w:rFonts w:ascii="Arial" w:hAnsi="Arial" w:cs="Arial" w:eastAsia="Microsoft YaHei"/>
+                <w:sz w:val="19"/>
+              </w:rPr>
+              <w:t>GET /api/events/:id, PUT /api/events/:id</w:t>
+            </w:r>
+          </w:p>
+        </w:tc>
+      </w:tr>
+    </w:tbl>
+    <w:p>
+      <w:pPr>
+        <w:spacing w:after="0"/>
+      </w:pPr>
+    </w:p>
+    <w:p>
+      <w:pPr>
+        <w:spacing w:after="160"/>
+      </w:pPr>
+      <w:r>
+        <w:rPr>
+          <w:rFonts w:ascii="Arial" w:hAnsi="Arial" w:cs="Arial" w:eastAsia="Microsoft YaHei"/>
+          <w:i w:val="0"/>
+          <w:sz w:val="24"/>
+        </w:rPr>
+        <w:t>Drawing the screens first changed three decisions. The registration page was going to be a single column, and became two - what you are booking on the left, who you are on the right - because the storyboard made it obvious that a visitor needs to see the event while filling in the form, not after. The delete rule moved out of a help page and onto the edit screen, where the sentence explaining it is read at the moment it matters. And the weather panel was given its own request rather than being folded into the event response, so that a slow third party could never hold up the page the visitor actually came for.</w:t>
+      </w:r>
+    </w:p>
+    <w:p>
+      <w:pPr>
+        <w:spacing w:after="160"/>
+      </w:pPr>
+      <w:r>
+        <w:rPr>
+          <w:rFonts w:ascii="Arial" w:hAnsi="Arial" w:cs="Arial" w:eastAsia="Microsoft YaHei"/>
+          <w:i w:val="0"/>
+          <w:sz w:val="24"/>
+        </w:rPr>
+        <w:t>The TEXT frame also caught a wording problem early: the first draft of the register page said 'Purchase tickets' while the charity runs free events. Writing the interface text on the storyboard, before any code existed, made that inconsistency visible in a way that reading the requirements had not.</w:t>
+      </w:r>
+    </w:p>
+    <w:p>
+      <w:pPr>
+        <w:keepNext/>
+        <w:spacing w:before="320" w:after="120"/>
+      </w:pPr>
+      <w:r>
+        <w:rPr>
+          <w:rFonts w:ascii="Arial" w:hAnsi="Arial" w:cs="Arial" w:eastAsia="Microsoft YaHei"/>
+          <w:b/>
+          <w:sz w:val="24"/>
+        </w:rPr>
+        <w:t>10. Deployment</w:t>
       </w:r>
     </w:p>
     <w:p>
@@ -3872,7 +4573,7 @@
           <w:i/>
           <w:sz w:val="20"/>
         </w:rPr>
-        <w:t>Table 5 - The two live deployments.</w:t>
+        <w:t>Table 6 - The two live deployments.</w:t>
       </w:r>
     </w:p>
     <w:tbl>
@@ -4218,7 +4919,7 @@
           <w:b/>
           <w:sz w:val="24"/>
         </w:rPr>
-        <w:t>10. Problems Encountered and What They Taught Us</w:t>
+        <w:t>11. Problems Encountered and What They Taught Us</w:t>
       </w:r>
     </w:p>
     <w:p>
@@ -4325,7 +5026,7 @@
           <w:b/>
           <w:sz w:val="24"/>
         </w:rPr>
-        <w:t>11. Teamwork</w:t>
+        <w:t>12. Teamwork</w:t>
       </w:r>
     </w:p>
     <w:p>
@@ -4352,7 +5053,7 @@
           <w:i/>
           <w:sz w:val="20"/>
         </w:rPr>
-        <w:t>Table 6 - Division of work.</w:t>
+        <w:t>Table 7 - Division of work.</w:t>
       </w:r>
     </w:p>
     <w:tbl>
@@ -4783,7 +5484,7 @@
           <w:i w:val="0"/>
           <w:sz w:val="24"/>
         </w:rPr>
-        <w:t>Git history is the evidence. Each commit message is prefixed with the owner and the part of the brief it belongs to - A1, A2, A3 for Jie's work and B1, B4, B7, B9, B11, B12 for Chengyu's - so the log can be read as a checklist against Table 6. The A3 and B3 commits are deliberately interleaved rather than grouped by author: each person's work was pushed as it was finished, and a commit describes one change rather than one afternoon. Work spans more than one day, and every commit message explains why the change was made, not just what changed.</w:t>
+        <w:t>Git history is the evidence. Each commit message is prefixed with the owner and the part of the brief it belongs to - A1, A2, A3 for Jie's work and B1, B4, B7, B9, B11, B12 for Chengyu's - so the log can be read as a checklist against Table 7. The A3 and B3 commits are deliberately interleaved rather than grouped by author: each person's work was pushed as it was finished, and a commit describes one change rather than one afternoon. Work spans more than one day, and every commit message explains why the change was made, not just what changed.</w:t>
       </w:r>
     </w:p>
     <w:p>
@@ -4810,7 +5511,7 @@
           <w:b/>
           <w:sz w:val="24"/>
         </w:rPr>
-        <w:t>12. My Individual Contribution</w:t>
+        <w:t>13. My Individual Contribution</w:t>
       </w:r>
     </w:p>
     <w:p>
@@ -4923,7 +5624,7 @@
           <w:rFonts w:ascii="Arial" w:hAnsi="Arial" w:cs="Arial" w:eastAsia="Microsoft YaHei"/>
           <w:sz w:val="24"/>
         </w:rPr>
-        <w:t>I deployed everything to my own cPanel account following the guide, which is where I hit the problem described in Section 10: the API reported 'Access denied for root@localhost' because the environment variables had not been saved, and we moved to a .env file to make the configuration explicit. That error message was what taught me to read a connection failure carefully - it named the user and the host, and the answer was in those two words. I also wrote the Postman collection with assertions, including the cases that must fail, so the whole API can be re-checked in one click.</w:t>
+        <w:t>I deployed everything to my own cPanel account following the guide, which is where I hit the problem described in Section 11: the API reported 'Access denied for root@localhost' because the environment variables had not been saved, and we moved to a .env file to make the configuration explicit. That error message was what taught me to read a connection failure carefully - it named the user and the host, and the answer was in those two words. I also wrote the Postman collection with assertions, including the cases that must fail, so the whole API can be re-checked in one click.</w:t>
       </w:r>
     </w:p>
     <w:p>
@@ -4950,7 +5651,7 @@
           <w:b/>
           <w:sz w:val="24"/>
         </w:rPr>
-        <w:t>13. Conclusion</w:t>
+        <w:t>14. Conclusion</w:t>
       </w:r>
     </w:p>
     <w:p>
@@ -4990,7 +5691,7 @@
           <w:b/>
           <w:sz w:val="24"/>
         </w:rPr>
-        <w:t>14. GenAI Acknowledgement and Chat Log</w:t>
+        <w:t>15. GenAI Acknowledgement and Chat Log</w:t>
       </w:r>
     </w:p>
     <w:p>
@@ -5017,7 +5718,7 @@
           <w:i/>
           <w:sz w:val="20"/>
         </w:rPr>
-        <w:t>Table 7 - How GenAI was used, and what it did not do.</w:t>
+        <w:t>Table 8 - How GenAI was used, and what it did not do.</w:t>
       </w:r>
     </w:p>
     <w:tbl>
@@ -5364,7 +6065,7 @@
           <w:i/>
           <w:sz w:val="20"/>
         </w:rPr>
-        <w:t>Table 8 - Requirement to evidence.</w:t>
+        <w:t>Table 9 - Requirement to evidence.</w:t>
       </w:r>
     </w:p>
     <w:tbl>
@@ -5911,7 +6612,7 @@
                 <w:rFonts w:ascii="Arial" w:hAnsi="Arial" w:cs="Arial" w:eastAsia="Microsoft YaHei"/>
                 <w:sz w:val="19"/>
               </w:rPr>
-              <w:t>Table 5; /api/health returns database: connected</w:t>
+              <w:t>Table 6; /api/health returns database: connected</w:t>
             </w:r>
           </w:p>
         </w:tc>
@@ -5988,6 +6689,44 @@
                 <w:sz w:val="19"/>
               </w:rPr>
               <w:t>Table 4</w:t>
+            </w:r>
+          </w:p>
+        </w:tc>
+      </w:tr>
+      <w:tr>
+        <w:tc>
+          <w:tcPr>
+            <w:tcW w:type="dxa" w:w="4228"/>
+          </w:tcPr>
+          <w:p>
+            <w:pPr>
+              <w:spacing w:line="240" w:lineRule="auto" w:after="40"/>
+            </w:pPr>
+            <w:r/>
+            <w:r>
+              <w:rPr>
+                <w:rFonts w:ascii="Arial" w:hAnsi="Arial" w:cs="Arial" w:eastAsia="Microsoft YaHei"/>
+                <w:sz w:val="19"/>
+              </w:rPr>
+              <w:t>Interface storyboard for all seven screens</w:t>
+            </w:r>
+          </w:p>
+        </w:tc>
+        <w:tc>
+          <w:tcPr>
+            <w:tcW w:type="dxa" w:w="4673"/>
+          </w:tcPr>
+          <w:p>
+            <w:pPr>
+              <w:spacing w:line="240" w:lineRule="auto" w:after="40"/>
+            </w:pPr>
+            <w:r/>
+            <w:r>
+              <w:rPr>
+                <w:rFonts w:ascii="Arial" w:hAnsi="Arial" w:cs="Arial" w:eastAsia="Microsoft YaHei"/>
+                <w:sz w:val="19"/>
+              </w:rPr>
+              <w:t>Section 9 and storyboard-giving-coast.docx</w:t>
             </w:r>
           </w:p>
         </w:tc>

</xml_diff>

<commit_message>
Report: embed the seven storyboard screens as figures in section 9
Section 9 described the storyboard in prose and a table but carried none of
the screens, so the report on its own did not show what any page looked like.
Each screen is now a numbered figure - the live screenshot, then its
GRAPHICS / TEXT / MEDIA / NAVIGATION description and the design note - so the
storyboard lives inside the one document the brief asks for.

23 pages, 7 figures, 9 tables. The standalone storyboard is still produced
for anyone who wants it on the template's own layout.
</commit_message>
<xml_diff>
--- a/docs/report/cgao15A3-report.docx
+++ b/docs/report/cgao15A3-report.docx
@@ -3858,7 +3858,7 @@
           <w:i w:val="0"/>
           <w:sz w:val="24"/>
         </w:rPr>
-        <w:t>Before the two websites were built, the seven screens were storyboarded on the template supplied with the unit: one page per screen, with the layout sketched, the interface text listed, and the media noted. The storyboard is submitted alongside this report (storyboard-giving-coast.docx) and is reproduced in summary below.</w:t>
+        <w:t>Before the two websites were built, the seven screens were storyboarded on the template supplied with the unit: one page per screen, with the layout sketched, the interface text listed, and the media noted. Each storyboard page carries four frames - GRAPHICS, TEXT, AUDIO/VIDEO and NOTES - over the five-row table the template provides (Description, Content, Interactions, Media Creation, Navigation).</w:t>
       </w:r>
     </w:p>
     <w:p>
@@ -3871,7 +3871,7 @@
           <w:i w:val="0"/>
           <w:sz w:val="24"/>
         </w:rPr>
-        <w:t>Each page of the storyboard carries the same four frames - GRAPHICS, TEXT, AUDIO/VIDEO and NOTES - over the five-row table required by the template (Description, Content, Interactions, Media Creation, Navigation). The seven screens are the four public pages and the three staff pages:</w:t>
+        <w:t>The seven screens are the four public pages and the three staff pages. Table 5 maps each one to the endpoint it depends on; Figures 1 to 7 show them as they are running on the deployed site, with the storyboard row for each screen reproduced underneath.</w:t>
       </w:r>
     </w:p>
     <w:p>
@@ -4511,7 +4511,68 @@
     </w:p>
     <w:p>
       <w:pPr>
-        <w:spacing w:after="160"/>
+        <w:keepNext/>
+        <w:spacing w:before="160" w:after="40" w:line="240" w:lineRule="auto"/>
+        <w:jc w:val="center"/>
+        <w:pBdr>
+          <w:top w:val="single" w:sz="4" w:space="4" w:color="BFBFBF"/>
+          <w:left w:val="single" w:sz="4" w:space="4" w:color="BFBFBF"/>
+          <w:bottom w:val="single" w:sz="4" w:space="4" w:color="BFBFBF"/>
+          <w:right w:val="single" w:sz="4" w:space="4" w:color="BFBFBF"/>
+        </w:pBdr>
+      </w:pPr>
+      <w:r>
+        <w:drawing>
+          <wp:inline xmlns:a="http://schemas.openxmlformats.org/drawingml/2006/main" xmlns:pic="http://schemas.openxmlformats.org/drawingml/2006/picture">
+            <wp:extent cx="5220000" cy="5097656"/>
+            <wp:docPr id="1" name="Picture 1"/>
+            <wp:cNvGraphicFramePr>
+              <a:graphicFrameLocks noChangeAspect="1"/>
+            </wp:cNvGraphicFramePr>
+            <a:graphic>
+              <a:graphicData uri="http://schemas.openxmlformats.org/drawingml/2006/picture">
+                <pic:pic>
+                  <pic:nvPicPr>
+                    <pic:cNvPr id="0" name="S1-home.png"/>
+                    <pic:cNvPicPr/>
+                  </pic:nvPicPr>
+                  <pic:blipFill>
+                    <a:blip r:embed="rId10"/>
+                    <a:stretch>
+                      <a:fillRect/>
+                    </a:stretch>
+                  </pic:blipFill>
+                  <pic:spPr>
+                    <a:xfrm>
+                      <a:off x="0" y="0"/>
+                      <a:ext cx="5220000" cy="5097656"/>
+                    </a:xfrm>
+                    <a:prstGeom prst="rect"/>
+                  </pic:spPr>
+                </pic:pic>
+              </a:graphicData>
+            </a:graphic>
+          </wp:inline>
+        </w:drawing>
+      </w:r>
+    </w:p>
+    <w:p>
+      <w:pPr>
+        <w:spacing w:after="200" w:line="240" w:lineRule="auto"/>
+        <w:jc w:val="center"/>
+      </w:pPr>
+      <w:r>
+        <w:rPr>
+          <w:rFonts w:ascii="Arial" w:hAnsi="Arial" w:cs="Arial" w:eastAsia="Microsoft YaHei"/>
+          <w:i/>
+          <w:sz w:val="18"/>
+        </w:rPr>
+        <w:t>Figure 1 - S1: Home</w:t>
+      </w:r>
+    </w:p>
+    <w:p>
+      <w:pPr>
+        <w:spacing w:after="80"/>
       </w:pPr>
       <w:r>
         <w:rPr>
@@ -4519,7 +4580,542 @@
           <w:i w:val="0"/>
           <w:sz w:val="24"/>
         </w:rPr>
-        <w:t>Drawing the screens first changed three decisions. The registration page was going to be a single column, and became two - what you are booking on the left, who you are on the right - because the storyboard made it obvious that a visitor needs to see the event while filling in the form, not after. The delete rule moved out of a help page and onto the edit screen, where the sentence explaining it is read at the moment it matters. And the weather panel was given its own request rather than being folded into the event response, so that a slow third party could never hold up the page the visitor actually came for.</w:t>
+        <w:t>Graphics: hero panel, a grid of eight event cards, then the recently finished grid. Text: eyebrow 'Gold Coast - Queensland', headline 'Charity events worth showing up for', the 'Find an event' button, and on every card the name, date, time, venue, price, '$X raised of $Y goal' and 'N registered'. Media: none - the category icons are characters stored in the database, and the colour bands and progress bars are CSS computed from API values. Navigation: the hero button and the menu go to Search, any card opens S3.</w:t>
+      </w:r>
+    </w:p>
+    <w:p>
+      <w:pPr>
+        <w:spacing w:after="200"/>
+      </w:pPr>
+      <w:r>
+        <w:rPr>
+          <w:rFonts w:ascii="Arial" w:hAnsi="Arial" w:cs="Arial" w:eastAsia="Microsoft YaHei"/>
+          <w:i/>
+          <w:sz w:val="24"/>
+        </w:rPr>
+        <w:t>Note: A broken back end shows immediately as an empty grid with a retry button rather than a silent blank page.</w:t>
+      </w:r>
+    </w:p>
+    <w:p>
+      <w:pPr>
+        <w:keepNext/>
+        <w:spacing w:before="160" w:after="40" w:line="240" w:lineRule="auto"/>
+        <w:jc w:val="center"/>
+        <w:pBdr>
+          <w:top w:val="single" w:sz="4" w:space="4" w:color="BFBFBF"/>
+          <w:left w:val="single" w:sz="4" w:space="4" w:color="BFBFBF"/>
+          <w:bottom w:val="single" w:sz="4" w:space="4" w:color="BFBFBF"/>
+          <w:right w:val="single" w:sz="4" w:space="4" w:color="BFBFBF"/>
+        </w:pBdr>
+      </w:pPr>
+      <w:r>
+        <w:drawing>
+          <wp:inline xmlns:a="http://schemas.openxmlformats.org/drawingml/2006/main" xmlns:pic="http://schemas.openxmlformats.org/drawingml/2006/picture">
+            <wp:extent cx="5220000" cy="5097656"/>
+            <wp:docPr id="2" name="Picture 2"/>
+            <wp:cNvGraphicFramePr>
+              <a:graphicFrameLocks noChangeAspect="1"/>
+            </wp:cNvGraphicFramePr>
+            <a:graphic>
+              <a:graphicData uri="http://schemas.openxmlformats.org/drawingml/2006/picture">
+                <pic:pic>
+                  <pic:nvPicPr>
+                    <pic:cNvPr id="0" name="S2-search.png"/>
+                    <pic:cNvPicPr/>
+                  </pic:nvPicPr>
+                  <pic:blipFill>
+                    <a:blip r:embed="rId11"/>
+                    <a:stretch>
+                      <a:fillRect/>
+                    </a:stretch>
+                  </pic:blipFill>
+                  <pic:spPr>
+                    <a:xfrm>
+                      <a:off x="0" y="0"/>
+                      <a:ext cx="5220000" cy="5097656"/>
+                    </a:xfrm>
+                    <a:prstGeom prst="rect"/>
+                  </pic:spPr>
+                </pic:pic>
+              </a:graphicData>
+            </a:graphic>
+          </wp:inline>
+        </w:drawing>
+      </w:r>
+    </w:p>
+    <w:p>
+      <w:pPr>
+        <w:spacing w:after="200" w:line="240" w:lineRule="auto"/>
+        <w:jc w:val="center"/>
+      </w:pPr>
+      <w:r>
+        <w:rPr>
+          <w:rFonts w:ascii="Arial" w:hAnsi="Arial" w:cs="Arial" w:eastAsia="Microsoft YaHei"/>
+          <w:i/>
+          <w:sz w:val="18"/>
+        </w:rPr>
+        <w:t>Figure 2 - S2: Search</w:t>
+      </w:r>
+    </w:p>
+    <w:p>
+      <w:pPr>
+        <w:spacing w:after="80"/>
+      </w:pPr>
+      <w:r>
+        <w:rPr>
+          <w:rFonts w:ascii="Arial" w:hAnsi="Arial" w:cs="Arial" w:eastAsia="Microsoft YaHei"/>
+          <w:i w:val="0"/>
+          <w:sz w:val="24"/>
+        </w:rPr>
+        <w:t>Graphics: a filter bar over the same card grid the home page uses, so the two pages cannot look or behave differently. Text: 'Leave everything blank to see everything that is still coming up', labels Date / Location / Category, buttons Search and Clear. Media: the category dropdown is filled from GET /api/categories. Navigation: reached from the home hero or the menu; a card opens S3.</w:t>
+      </w:r>
+    </w:p>
+    <w:p>
+      <w:pPr>
+        <w:spacing w:after="200"/>
+      </w:pPr>
+      <w:r>
+        <w:rPr>
+          <w:rFonts w:ascii="Arial" w:hAnsi="Arial" w:cs="Arial" w:eastAsia="Microsoft YaHei"/>
+          <w:i/>
+          <w:sz w:val="24"/>
+        </w:rPr>
+        <w:t>Note: Filtering runs on the server, so this page only draws results. 'No search yet' and 'no results' are deliberately two different states.</w:t>
+      </w:r>
+    </w:p>
+    <w:p>
+      <w:pPr>
+        <w:keepNext/>
+        <w:spacing w:before="160" w:after="40" w:line="240" w:lineRule="auto"/>
+        <w:jc w:val="center"/>
+        <w:pBdr>
+          <w:top w:val="single" w:sz="4" w:space="4" w:color="BFBFBF"/>
+          <w:left w:val="single" w:sz="4" w:space="4" w:color="BFBFBF"/>
+          <w:bottom w:val="single" w:sz="4" w:space="4" w:color="BFBFBF"/>
+          <w:right w:val="single" w:sz="4" w:space="4" w:color="BFBFBF"/>
+        </w:pBdr>
+      </w:pPr>
+      <w:r>
+        <w:drawing>
+          <wp:inline xmlns:a="http://schemas.openxmlformats.org/drawingml/2006/main" xmlns:pic="http://schemas.openxmlformats.org/drawingml/2006/picture">
+            <wp:extent cx="5220000" cy="5097656"/>
+            <wp:docPr id="3" name="Picture 3"/>
+            <wp:cNvGraphicFramePr>
+              <a:graphicFrameLocks noChangeAspect="1"/>
+            </wp:cNvGraphicFramePr>
+            <a:graphic>
+              <a:graphicData uri="http://schemas.openxmlformats.org/drawingml/2006/picture">
+                <pic:pic>
+                  <pic:nvPicPr>
+                    <pic:cNvPr id="0" name="S3-detail.png"/>
+                    <pic:cNvPicPr/>
+                  </pic:nvPicPr>
+                  <pic:blipFill>
+                    <a:blip r:embed="rId12"/>
+                    <a:stretch>
+                      <a:fillRect/>
+                    </a:stretch>
+                  </pic:blipFill>
+                  <pic:spPr>
+                    <a:xfrm>
+                      <a:off x="0" y="0"/>
+                      <a:ext cx="5220000" cy="5097656"/>
+                    </a:xfrm>
+                    <a:prstGeom prst="rect"/>
+                  </pic:spPr>
+                </pic:pic>
+              </a:graphicData>
+            </a:graphic>
+          </wp:inline>
+        </w:drawing>
+      </w:r>
+    </w:p>
+    <w:p>
+      <w:pPr>
+        <w:spacing w:after="200" w:line="240" w:lineRule="auto"/>
+        <w:jc w:val="center"/>
+      </w:pPr>
+      <w:r>
+        <w:rPr>
+          <w:rFonts w:ascii="Arial" w:hAnsi="Arial" w:cs="Arial" w:eastAsia="Microsoft YaHei"/>
+          <w:i/>
+          <w:sz w:val="18"/>
+        </w:rPr>
+        <w:t>Figure 3 - S3: Event details</w:t>
+      </w:r>
+    </w:p>
+    <w:p>
+      <w:pPr>
+        <w:spacing w:after="80"/>
+      </w:pPr>
+      <w:r>
+        <w:rPr>
+          <w:rFonts w:ascii="Arial" w:hAnsi="Arial" w:cs="Arial" w:eastAsia="Microsoft YaHei"/>
+          <w:i w:val="0"/>
+          <w:sz w:val="24"/>
+        </w:rPr>
+        <w:t>Graphics: breadcrumb, the event block, the progress bar, then three panels - who is going, expected weather, and who runs it. Text: 'Who is going' with each name, ticket count and booking date; 'Expected weather' with the icon, description and max/min; the Register button. Media: the weather icon is a character mapped from the Open-Meteo code by our own API, not an image file. Navigation: in from any card; out to S4 through the Register button.</w:t>
+      </w:r>
+    </w:p>
+    <w:p>
+      <w:pPr>
+        <w:spacing w:after="200"/>
+      </w:pPr>
+      <w:r>
+        <w:rPr>
+          <w:rFonts w:ascii="Arial" w:hAnsi="Arial" w:cs="Arial" w:eastAsia="Microsoft YaHei"/>
+          <w:i/>
+          <w:sz w:val="24"/>
+        </w:rPr>
+        <w:t>Note: Social proof sits next to the price because it is the strongest reason to book. The weather is a separate request, so a slow third party never delays the page the visitor came for.</w:t>
+      </w:r>
+    </w:p>
+    <w:p>
+      <w:pPr>
+        <w:keepNext/>
+        <w:spacing w:before="160" w:after="40" w:line="240" w:lineRule="auto"/>
+        <w:jc w:val="center"/>
+        <w:pBdr>
+          <w:top w:val="single" w:sz="4" w:space="4" w:color="BFBFBF"/>
+          <w:left w:val="single" w:sz="4" w:space="4" w:color="BFBFBF"/>
+          <w:bottom w:val="single" w:sz="4" w:space="4" w:color="BFBFBF"/>
+          <w:right w:val="single" w:sz="4" w:space="4" w:color="BFBFBF"/>
+        </w:pBdr>
+      </w:pPr>
+      <w:r>
+        <w:drawing>
+          <wp:inline xmlns:a="http://schemas.openxmlformats.org/drawingml/2006/main" xmlns:pic="http://schemas.openxmlformats.org/drawingml/2006/picture">
+            <wp:extent cx="5220000" cy="5097656"/>
+            <wp:docPr id="4" name="Picture 4"/>
+            <wp:cNvGraphicFramePr>
+              <a:graphicFrameLocks noChangeAspect="1"/>
+            </wp:cNvGraphicFramePr>
+            <a:graphic>
+              <a:graphicData uri="http://schemas.openxmlformats.org/drawingml/2006/picture">
+                <pic:pic>
+                  <pic:nvPicPr>
+                    <pic:cNvPr id="0" name="S4-register.png"/>
+                    <pic:cNvPicPr/>
+                  </pic:nvPicPr>
+                  <pic:blipFill>
+                    <a:blip r:embed="rId13"/>
+                    <a:stretch>
+                      <a:fillRect/>
+                    </a:stretch>
+                  </pic:blipFill>
+                  <pic:spPr>
+                    <a:xfrm>
+                      <a:off x="0" y="0"/>
+                      <a:ext cx="5220000" cy="5097656"/>
+                    </a:xfrm>
+                    <a:prstGeom prst="rect"/>
+                  </pic:spPr>
+                </pic:pic>
+              </a:graphicData>
+            </a:graphic>
+          </wp:inline>
+        </w:drawing>
+      </w:r>
+    </w:p>
+    <w:p>
+      <w:pPr>
+        <w:spacing w:after="200" w:line="240" w:lineRule="auto"/>
+        <w:jc w:val="center"/>
+      </w:pPr>
+      <w:r>
+        <w:rPr>
+          <w:rFonts w:ascii="Arial" w:hAnsi="Arial" w:cs="Arial" w:eastAsia="Microsoft YaHei"/>
+          <w:i/>
+          <w:sz w:val="18"/>
+        </w:rPr>
+        <w:t>Figure 4 - S4: Register</w:t>
+      </w:r>
+    </w:p>
+    <w:p>
+      <w:pPr>
+        <w:spacing w:after="80"/>
+      </w:pPr>
+      <w:r>
+        <w:rPr>
+          <w:rFonts w:ascii="Arial" w:hAnsi="Arial" w:cs="Arial" w:eastAsia="Microsoft YaHei"/>
+          <w:i w:val="0"/>
+          <w:sz w:val="24"/>
+        </w:rPr>
+        <w:t>Graphics: two columns - the event on the left, the form on the right. Text: 'Your details', then first name, last name, email, contact phone, number of tickets, date of registration and optional notes; a live 'Total: $X'; the 'Complete registration' button. On success the form is replaced by 'You are registered'. Media: none - the total is computed from tickets times price. Navigation: in from S3 carrying eventId in the query string; after booking, back to S3.</w:t>
+      </w:r>
+    </w:p>
+    <w:p>
+      <w:pPr>
+        <w:spacing w:after="200"/>
+      </w:pPr>
+      <w:r>
+        <w:rPr>
+          <w:rFonts w:ascii="Arial" w:hAnsi="Arial" w:cs="Arial" w:eastAsia="Microsoft YaHei"/>
+          <w:i/>
+          <w:sz w:val="24"/>
+        </w:rPr>
+        <w:t>Note: Drawing this screen changed it: a single column became two, because a visitor needs to see the event while filling in the form, not afterwards.</w:t>
+      </w:r>
+    </w:p>
+    <w:p>
+      <w:pPr>
+        <w:keepNext/>
+        <w:spacing w:before="160" w:after="40" w:line="240" w:lineRule="auto"/>
+        <w:jc w:val="center"/>
+        <w:pBdr>
+          <w:top w:val="single" w:sz="4" w:space="4" w:color="BFBFBF"/>
+          <w:left w:val="single" w:sz="4" w:space="4" w:color="BFBFBF"/>
+          <w:bottom w:val="single" w:sz="4" w:space="4" w:color="BFBFBF"/>
+          <w:right w:val="single" w:sz="4" w:space="4" w:color="BFBFBF"/>
+        </w:pBdr>
+      </w:pPr>
+      <w:r>
+        <w:drawing>
+          <wp:inline xmlns:a="http://schemas.openxmlformats.org/drawingml/2006/main" xmlns:pic="http://schemas.openxmlformats.org/drawingml/2006/picture">
+            <wp:extent cx="5220000" cy="5097656"/>
+            <wp:docPr id="5" name="Picture 5"/>
+            <wp:cNvGraphicFramePr>
+              <a:graphicFrameLocks noChangeAspect="1"/>
+            </wp:cNvGraphicFramePr>
+            <a:graphic>
+              <a:graphicData uri="http://schemas.openxmlformats.org/drawingml/2006/picture">
+                <pic:pic>
+                  <pic:nvPicPr>
+                    <pic:cNvPr id="0" name="S5-admin-list.png"/>
+                    <pic:cNvPicPr/>
+                  </pic:nvPicPr>
+                  <pic:blipFill>
+                    <a:blip r:embed="rId14"/>
+                    <a:stretch>
+                      <a:fillRect/>
+                    </a:stretch>
+                  </pic:blipFill>
+                  <pic:spPr>
+                    <a:xfrm>
+                      <a:off x="0" y="0"/>
+                      <a:ext cx="5220000" cy="5097656"/>
+                    </a:xfrm>
+                    <a:prstGeom prst="rect"/>
+                  </pic:spPr>
+                </pic:pic>
+              </a:graphicData>
+            </a:graphic>
+          </wp:inline>
+        </w:drawing>
+      </w:r>
+    </w:p>
+    <w:p>
+      <w:pPr>
+        <w:spacing w:after="200" w:line="240" w:lineRule="auto"/>
+        <w:jc w:val="center"/>
+      </w:pPr>
+      <w:r>
+        <w:rPr>
+          <w:rFonts w:ascii="Arial" w:hAnsi="Arial" w:cs="Arial" w:eastAsia="Microsoft YaHei"/>
+          <w:i/>
+          <w:sz w:val="18"/>
+        </w:rPr>
+        <w:t>Figure 5 - S5: Staff - event list</w:t>
+      </w:r>
+    </w:p>
+    <w:p>
+      <w:pPr>
+        <w:spacing w:after="80"/>
+      </w:pPr>
+      <w:r>
+        <w:rPr>
+          <w:rFonts w:ascii="Arial" w:hAnsi="Arial" w:cs="Arial" w:eastAsia="Microsoft YaHei"/>
+          <w:i w:val="0"/>
+          <w:sz w:val="24"/>
+        </w:rPr>
+        <w:t>Graphics: a status filter strip above a table with an action column. Text: '+ New event', chips reading All 13 / Active 8 / Past 4 / Suspended 1, column headings ID / Event / Date / Location / Status / Ticket / Registrations / Actions, and Edit and Delete on each row. Media: status badges are coloured text. Navigation: in from the public menu; out to S6, S7, or the public site.</w:t>
+      </w:r>
+    </w:p>
+    <w:p>
+      <w:pPr>
+        <w:spacing w:after="200"/>
+      </w:pPr>
+      <w:r>
+        <w:rPr>
+          <w:rFonts w:ascii="Arial" w:hAnsi="Arial" w:cs="Arial" w:eastAsia="Microsoft YaHei"/>
+          <w:i/>
+          <w:sz w:val="24"/>
+        </w:rPr>
+        <w:t>Note: The counts live on the chips because 'how many are suspended?' is the first question staff ask, and they are counted from the rows actually on screen.</w:t>
+      </w:r>
+    </w:p>
+    <w:p>
+      <w:pPr>
+        <w:keepNext/>
+        <w:spacing w:before="160" w:after="40" w:line="240" w:lineRule="auto"/>
+        <w:jc w:val="center"/>
+        <w:pBdr>
+          <w:top w:val="single" w:sz="4" w:space="4" w:color="BFBFBF"/>
+          <w:left w:val="single" w:sz="4" w:space="4" w:color="BFBFBF"/>
+          <w:bottom w:val="single" w:sz="4" w:space="4" w:color="BFBFBF"/>
+          <w:right w:val="single" w:sz="4" w:space="4" w:color="BFBFBF"/>
+        </w:pBdr>
+      </w:pPr>
+      <w:r>
+        <w:drawing>
+          <wp:inline xmlns:a="http://schemas.openxmlformats.org/drawingml/2006/main" xmlns:pic="http://schemas.openxmlformats.org/drawingml/2006/picture">
+            <wp:extent cx="5220000" cy="5097656"/>
+            <wp:docPr id="6" name="Picture 6"/>
+            <wp:cNvGraphicFramePr>
+              <a:graphicFrameLocks noChangeAspect="1"/>
+            </wp:cNvGraphicFramePr>
+            <a:graphic>
+              <a:graphicData uri="http://schemas.openxmlformats.org/drawingml/2006/picture">
+                <pic:pic>
+                  <pic:nvPicPr>
+                    <pic:cNvPr id="0" name="S6-admin-new.png"/>
+                    <pic:cNvPicPr/>
+                  </pic:nvPicPr>
+                  <pic:blipFill>
+                    <a:blip r:embed="rId15"/>
+                    <a:stretch>
+                      <a:fillRect/>
+                    </a:stretch>
+                  </pic:blipFill>
+                  <pic:spPr>
+                    <a:xfrm>
+                      <a:off x="0" y="0"/>
+                      <a:ext cx="5220000" cy="5097656"/>
+                    </a:xfrm>
+                    <a:prstGeom prst="rect"/>
+                  </pic:spPr>
+                </pic:pic>
+              </a:graphicData>
+            </a:graphic>
+          </wp:inline>
+        </w:drawing>
+      </w:r>
+    </w:p>
+    <w:p>
+      <w:pPr>
+        <w:spacing w:after="200" w:line="240" w:lineRule="auto"/>
+        <w:jc w:val="center"/>
+      </w:pPr>
+      <w:r>
+        <w:rPr>
+          <w:rFonts w:ascii="Arial" w:hAnsi="Arial" w:cs="Arial" w:eastAsia="Microsoft YaHei"/>
+          <w:i/>
+          <w:sz w:val="18"/>
+        </w:rPr>
+        <w:t>Figure 6 - S6: Staff - new event</w:t>
+      </w:r>
+    </w:p>
+    <w:p>
+      <w:pPr>
+        <w:spacing w:after="80"/>
+      </w:pPr>
+      <w:r>
+        <w:rPr>
+          <w:rFonts w:ascii="Arial" w:hAnsi="Arial" w:cs="Arial" w:eastAsia="Microsoft YaHei"/>
+          <w:i w:val="0"/>
+          <w:sz w:val="24"/>
+        </w:rPr>
+        <w:t>Graphics: one long form in three groups, ending with a separate Venue coordinates group. Text: required fields marked with an asterisk, and the note 'Used by the Open-Meteo forecast on the event page. Leave blank if unknown.' Media: the two dropdowns are filled from the same lists the public site shows. Navigation: in from S5; Save or Cancel returns to S5.</w:t>
+      </w:r>
+    </w:p>
+    <w:p>
+      <w:pPr>
+        <w:spacing w:after="200"/>
+      </w:pPr>
+      <w:r>
+        <w:rPr>
+          <w:rFonts w:ascii="Arial" w:hAnsi="Arial" w:cs="Arial" w:eastAsia="Microsoft YaHei"/>
+          <w:i/>
+          <w:sz w:val="24"/>
+        </w:rPr>
+        <w:t>Note: Create and edit share one form component, so the two field sets cannot drift apart.</w:t>
+      </w:r>
+    </w:p>
+    <w:p>
+      <w:pPr>
+        <w:keepNext/>
+        <w:spacing w:before="160" w:after="40" w:line="240" w:lineRule="auto"/>
+        <w:jc w:val="center"/>
+        <w:pBdr>
+          <w:top w:val="single" w:sz="4" w:space="4" w:color="BFBFBF"/>
+          <w:left w:val="single" w:sz="4" w:space="4" w:color="BFBFBF"/>
+          <w:bottom w:val="single" w:sz="4" w:space="4" w:color="BFBFBF"/>
+          <w:right w:val="single" w:sz="4" w:space="4" w:color="BFBFBF"/>
+        </w:pBdr>
+      </w:pPr>
+      <w:r>
+        <w:drawing>
+          <wp:inline xmlns:a="http://schemas.openxmlformats.org/drawingml/2006/main" xmlns:pic="http://schemas.openxmlformats.org/drawingml/2006/picture">
+            <wp:extent cx="5220000" cy="5097656"/>
+            <wp:docPr id="7" name="Picture 7"/>
+            <wp:cNvGraphicFramePr>
+              <a:graphicFrameLocks noChangeAspect="1"/>
+            </wp:cNvGraphicFramePr>
+            <a:graphic>
+              <a:graphicData uri="http://schemas.openxmlformats.org/drawingml/2006/picture">
+                <pic:pic>
+                  <pic:nvPicPr>
+                    <pic:cNvPr id="0" name="S7-admin-edit.png"/>
+                    <pic:cNvPicPr/>
+                  </pic:nvPicPr>
+                  <pic:blipFill>
+                    <a:blip r:embed="rId16"/>
+                    <a:stretch>
+                      <a:fillRect/>
+                    </a:stretch>
+                  </pic:blipFill>
+                  <pic:spPr>
+                    <a:xfrm>
+                      <a:off x="0" y="0"/>
+                      <a:ext cx="5220000" cy="5097656"/>
+                    </a:xfrm>
+                    <a:prstGeom prst="rect"/>
+                  </pic:spPr>
+                </pic:pic>
+              </a:graphicData>
+            </a:graphic>
+          </wp:inline>
+        </w:drawing>
+      </w:r>
+    </w:p>
+    <w:p>
+      <w:pPr>
+        <w:spacing w:after="200" w:line="240" w:lineRule="auto"/>
+        <w:jc w:val="center"/>
+      </w:pPr>
+      <w:r>
+        <w:rPr>
+          <w:rFonts w:ascii="Arial" w:hAnsi="Arial" w:cs="Arial" w:eastAsia="Microsoft YaHei"/>
+          <w:i/>
+          <w:sz w:val="18"/>
+        </w:rPr>
+        <w:t>Figure 7 - S7: Staff - edit event</w:t>
+      </w:r>
+    </w:p>
+    <w:p>
+      <w:pPr>
+        <w:spacing w:after="80"/>
+      </w:pPr>
+      <w:r>
+        <w:rPr>
+          <w:rFonts w:ascii="Arial" w:hAnsi="Arial" w:cs="Arial" w:eastAsia="Microsoft YaHei"/>
+          <w:i w:val="0"/>
+          <w:sz w:val="24"/>
+        </w:rPr>
+        <w:t>Graphics: the same form, pre-filled, with the registration list underneath. Text: the booking count and total tickets, then each booking with name, email, phone and date, and the sentence 'Because registrations exist, this event cannot be deleted - suspend it instead.' Media: none beyond the data. Navigation: in from S5; Save or Cancel returns to S5.</w:t>
+      </w:r>
+    </w:p>
+    <w:p>
+      <w:pPr>
+        <w:spacing w:after="200"/>
+      </w:pPr>
+      <w:r>
+        <w:rPr>
+          <w:rFonts w:ascii="Arial" w:hAnsi="Arial" w:cs="Arial" w:eastAsia="Microsoft YaHei"/>
+          <w:i/>
+          <w:sz w:val="24"/>
+        </w:rPr>
+        <w:t>Note: This is where drawing the screens changed the design again: the delete rule moved out of a help page and onto this screen, where it is read at the moment it matters.</w:t>
       </w:r>
     </w:p>
     <w:p>
@@ -4532,7 +5128,7 @@
           <w:i w:val="0"/>
           <w:sz w:val="24"/>
         </w:rPr>
-        <w:t>The TEXT frame also caught a wording problem early: the first draft of the register page said 'Purchase tickets' while the charity runs free events. Writing the interface text on the storyboard, before any code existed, made that inconsistency visible in a way that reading the requirements had not.</w:t>
+        <w:t>Writing the TEXT frame also caught a wording problem before any code existed: the first draft of the register page said 'Purchase tickets' while several events are free. Drawing the screen made that inconsistency visible in a way that reading the requirements had not.</w:t>
       </w:r>
     </w:p>
     <w:p>

</xml_diff>

<commit_message>
Report: polish the storyboard typography
The TITLE / SCREEN ID / DATE line now fits on one line (10.5pt bold labels), frame body text and the five-row table share one size (8.3pt), frame labels are bold 10pt, and the five-row table's label column carries the same light-blue shading as the report's other tables.

Refreshes both reports, PDFs, docs/report and the report/ folder inside both api zips.
</commit_message>
<xml_diff>
--- a/docs/report/cgao15A3-report.docx
+++ b/docs/report/cgao15A3-report.docx
@@ -4015,15 +4015,52 @@
     </w:p>
     <w:p>
       <w:pPr>
-        <w:spacing w:after="120"/>
+        <w:spacing w:after="120" w:line="240" w:lineRule="auto"/>
       </w:pPr>
       <w:r>
         <w:rPr>
           <w:rFonts w:ascii="Arial" w:hAnsi="Arial" w:cs="Arial" w:eastAsia="Microsoft YaHei"/>
-          <w:i w:val="0"/>
-          <w:sz w:val="24"/>
+          <w:b/>
+          <w:sz w:val="21"/>
         </w:rPr>
-        <w:t>TITLE: Home - Giving Coast public site      SCREEN ID: S1      DATE: 18 October 2026</w:t>
+        <w:t xml:space="preserve">TITLE: </w:t>
+      </w:r>
+      <w:r>
+        <w:rPr>
+          <w:rFonts w:ascii="Arial" w:hAnsi="Arial" w:cs="Arial" w:eastAsia="Microsoft YaHei"/>
+          <w:sz w:val="21"/>
+        </w:rPr>
+        <w:t xml:space="preserve">Home - Giving Coast public site    </w:t>
+      </w:r>
+      <w:r>
+        <w:rPr>
+          <w:rFonts w:ascii="Arial" w:hAnsi="Arial" w:cs="Arial" w:eastAsia="Microsoft YaHei"/>
+          <w:b/>
+          <w:sz w:val="21"/>
+        </w:rPr>
+        <w:t xml:space="preserve">SCREEN ID: </w:t>
+      </w:r>
+      <w:r>
+        <w:rPr>
+          <w:rFonts w:ascii="Arial" w:hAnsi="Arial" w:cs="Arial" w:eastAsia="Microsoft YaHei"/>
+          <w:sz w:val="21"/>
+        </w:rPr>
+        <w:t xml:space="preserve">S1    </w:t>
+      </w:r>
+      <w:r>
+        <w:rPr>
+          <w:rFonts w:ascii="Arial" w:hAnsi="Arial" w:cs="Arial" w:eastAsia="Microsoft YaHei"/>
+          <w:b/>
+          <w:sz w:val="21"/>
+        </w:rPr>
+        <w:t xml:space="preserve">DATE: </w:t>
+      </w:r>
+      <w:r>
+        <w:rPr>
+          <w:rFonts w:ascii="Arial" w:hAnsi="Arial" w:cs="Arial" w:eastAsia="Microsoft YaHei"/>
+          <w:sz w:val="21"/>
+        </w:rPr>
+        <w:t>18 October 2026</w:t>
       </w:r>
     </w:p>
     <w:p>
@@ -4071,7 +4108,8 @@
             <w:r>
               <w:rPr>
                 <w:rFonts w:ascii="Arial" w:hAnsi="Arial" w:cs="Arial" w:eastAsia="Microsoft YaHei"/>
-                <w:sz w:val="19"/>
+                <w:b/>
+                <w:sz w:val="20"/>
               </w:rPr>
               <w:t>GRAPHICS:</w:t>
             </w:r>
@@ -4162,7 +4200,8 @@
             <w:r>
               <w:rPr>
                 <w:rFonts w:ascii="Arial" w:hAnsi="Arial" w:cs="Arial" w:eastAsia="Microsoft YaHei"/>
-                <w:sz w:val="19"/>
+                <w:b/>
+                <w:sz w:val="20"/>
               </w:rPr>
               <w:t>TEXT:</w:t>
             </w:r>
@@ -4249,7 +4288,8 @@
             <w:r>
               <w:rPr>
                 <w:rFonts w:ascii="Arial" w:hAnsi="Arial" w:cs="Arial" w:eastAsia="Microsoft YaHei"/>
-                <w:sz w:val="19"/>
+                <w:b/>
+                <w:sz w:val="20"/>
               </w:rPr>
               <w:t>AUDIO/VIDEO:</w:t>
             </w:r>
@@ -4314,7 +4354,8 @@
             <w:r>
               <w:rPr>
                 <w:rFonts w:ascii="Arial" w:hAnsi="Arial" w:cs="Arial" w:eastAsia="Microsoft YaHei"/>
-                <w:sz w:val="19"/>
+                <w:b/>
+                <w:sz w:val="20"/>
               </w:rPr>
               <w:t>NOTES:</w:t>
             </w:r>
@@ -4357,6 +4398,7 @@
         <w:tc>
           <w:tcPr>
             <w:tcW w:type="dxa" w:w="1814"/>
+            <w:shd w:val="clear" w:color="auto" w:fill="E8EEF4"/>
           </w:tcPr>
           <w:p>
             <w:pPr>
@@ -4397,6 +4439,7 @@
         <w:tc>
           <w:tcPr>
             <w:tcW w:type="dxa" w:w="1814"/>
+            <w:shd w:val="clear" w:color="auto" w:fill="E8EEF4"/>
           </w:tcPr>
           <w:p>
             <w:pPr>
@@ -4445,6 +4488,7 @@
         <w:tc>
           <w:tcPr>
             <w:tcW w:type="dxa" w:w="1814"/>
+            <w:shd w:val="clear" w:color="auto" w:fill="E8EEF4"/>
           </w:tcPr>
           <w:p>
             <w:pPr>
@@ -4491,6 +4535,7 @@
         <w:tc>
           <w:tcPr>
             <w:tcW w:type="dxa" w:w="1814"/>
+            <w:shd w:val="clear" w:color="auto" w:fill="E8EEF4"/>
           </w:tcPr>
           <w:p>
             <w:pPr>
@@ -4531,6 +4576,7 @@
         <w:tc>
           <w:tcPr>
             <w:tcW w:type="dxa" w:w="1814"/>
+            <w:shd w:val="clear" w:color="auto" w:fill="E8EEF4"/>
           </w:tcPr>
           <w:p>
             <w:pPr>
@@ -4599,15 +4645,52 @@
     </w:p>
     <w:p>
       <w:pPr>
-        <w:spacing w:after="120"/>
+        <w:spacing w:after="120" w:line="240" w:lineRule="auto"/>
       </w:pPr>
       <w:r>
         <w:rPr>
           <w:rFonts w:ascii="Arial" w:hAnsi="Arial" w:cs="Arial" w:eastAsia="Microsoft YaHei"/>
-          <w:i w:val="0"/>
-          <w:sz w:val="24"/>
+          <w:b/>
+          <w:sz w:val="21"/>
         </w:rPr>
-        <w:t>TITLE: Search - find an event      SCREEN ID: S2      DATE: 18 October 2026</w:t>
+        <w:t xml:space="preserve">TITLE: </w:t>
+      </w:r>
+      <w:r>
+        <w:rPr>
+          <w:rFonts w:ascii="Arial" w:hAnsi="Arial" w:cs="Arial" w:eastAsia="Microsoft YaHei"/>
+          <w:sz w:val="21"/>
+        </w:rPr>
+        <w:t xml:space="preserve">Search - find an event    </w:t>
+      </w:r>
+      <w:r>
+        <w:rPr>
+          <w:rFonts w:ascii="Arial" w:hAnsi="Arial" w:cs="Arial" w:eastAsia="Microsoft YaHei"/>
+          <w:b/>
+          <w:sz w:val="21"/>
+        </w:rPr>
+        <w:t xml:space="preserve">SCREEN ID: </w:t>
+      </w:r>
+      <w:r>
+        <w:rPr>
+          <w:rFonts w:ascii="Arial" w:hAnsi="Arial" w:cs="Arial" w:eastAsia="Microsoft YaHei"/>
+          <w:sz w:val="21"/>
+        </w:rPr>
+        <w:t xml:space="preserve">S2    </w:t>
+      </w:r>
+      <w:r>
+        <w:rPr>
+          <w:rFonts w:ascii="Arial" w:hAnsi="Arial" w:cs="Arial" w:eastAsia="Microsoft YaHei"/>
+          <w:b/>
+          <w:sz w:val="21"/>
+        </w:rPr>
+        <w:t xml:space="preserve">DATE: </w:t>
+      </w:r>
+      <w:r>
+        <w:rPr>
+          <w:rFonts w:ascii="Arial" w:hAnsi="Arial" w:cs="Arial" w:eastAsia="Microsoft YaHei"/>
+          <w:sz w:val="21"/>
+        </w:rPr>
+        <w:t>18 October 2026</w:t>
       </w:r>
     </w:p>
     <w:p>
@@ -4655,7 +4738,8 @@
             <w:r>
               <w:rPr>
                 <w:rFonts w:ascii="Arial" w:hAnsi="Arial" w:cs="Arial" w:eastAsia="Microsoft YaHei"/>
-                <w:sz w:val="19"/>
+                <w:b/>
+                <w:sz w:val="20"/>
               </w:rPr>
               <w:t>GRAPHICS:</w:t>
             </w:r>
@@ -4746,7 +4830,8 @@
             <w:r>
               <w:rPr>
                 <w:rFonts w:ascii="Arial" w:hAnsi="Arial" w:cs="Arial" w:eastAsia="Microsoft YaHei"/>
-                <w:sz w:val="19"/>
+                <w:b/>
+                <w:sz w:val="20"/>
               </w:rPr>
               <w:t>TEXT:</w:t>
             </w:r>
@@ -4845,7 +4930,8 @@
             <w:r>
               <w:rPr>
                 <w:rFonts w:ascii="Arial" w:hAnsi="Arial" w:cs="Arial" w:eastAsia="Microsoft YaHei"/>
-                <w:sz w:val="19"/>
+                <w:b/>
+                <w:sz w:val="20"/>
               </w:rPr>
               <w:t>AUDIO/VIDEO:</w:t>
             </w:r>
@@ -4910,7 +4996,8 @@
             <w:r>
               <w:rPr>
                 <w:rFonts w:ascii="Arial" w:hAnsi="Arial" w:cs="Arial" w:eastAsia="Microsoft YaHei"/>
-                <w:sz w:val="19"/>
+                <w:b/>
+                <w:sz w:val="20"/>
               </w:rPr>
               <w:t>NOTES:</w:t>
             </w:r>
@@ -4953,6 +5040,7 @@
         <w:tc>
           <w:tcPr>
             <w:tcW w:type="dxa" w:w="1814"/>
+            <w:shd w:val="clear" w:color="auto" w:fill="E8EEF4"/>
           </w:tcPr>
           <w:p>
             <w:pPr>
@@ -4993,6 +5081,7 @@
         <w:tc>
           <w:tcPr>
             <w:tcW w:type="dxa" w:w="1814"/>
+            <w:shd w:val="clear" w:color="auto" w:fill="E8EEF4"/>
           </w:tcPr>
           <w:p>
             <w:pPr>
@@ -5037,6 +5126,7 @@
         <w:tc>
           <w:tcPr>
             <w:tcW w:type="dxa" w:w="1814"/>
+            <w:shd w:val="clear" w:color="auto" w:fill="E8EEF4"/>
           </w:tcPr>
           <w:p>
             <w:pPr>
@@ -5083,6 +5173,7 @@
         <w:tc>
           <w:tcPr>
             <w:tcW w:type="dxa" w:w="1814"/>
+            <w:shd w:val="clear" w:color="auto" w:fill="E8EEF4"/>
           </w:tcPr>
           <w:p>
             <w:pPr>
@@ -5123,6 +5214,7 @@
         <w:tc>
           <w:tcPr>
             <w:tcW w:type="dxa" w:w="1814"/>
+            <w:shd w:val="clear" w:color="auto" w:fill="E8EEF4"/>
           </w:tcPr>
           <w:p>
             <w:pPr>
@@ -5191,15 +5283,52 @@
     </w:p>
     <w:p>
       <w:pPr>
-        <w:spacing w:after="120"/>
+        <w:spacing w:after="120" w:line="240" w:lineRule="auto"/>
       </w:pPr>
       <w:r>
         <w:rPr>
           <w:rFonts w:ascii="Arial" w:hAnsi="Arial" w:cs="Arial" w:eastAsia="Microsoft YaHei"/>
-          <w:i w:val="0"/>
-          <w:sz w:val="24"/>
+          <w:b/>
+          <w:sz w:val="21"/>
         </w:rPr>
-        <w:t>TITLE: Event detail - one charity event      SCREEN ID: S3      DATE: 18 October 2026</w:t>
+        <w:t xml:space="preserve">TITLE: </w:t>
+      </w:r>
+      <w:r>
+        <w:rPr>
+          <w:rFonts w:ascii="Arial" w:hAnsi="Arial" w:cs="Arial" w:eastAsia="Microsoft YaHei"/>
+          <w:sz w:val="21"/>
+        </w:rPr>
+        <w:t xml:space="preserve">Event detail - one charity event    </w:t>
+      </w:r>
+      <w:r>
+        <w:rPr>
+          <w:rFonts w:ascii="Arial" w:hAnsi="Arial" w:cs="Arial" w:eastAsia="Microsoft YaHei"/>
+          <w:b/>
+          <w:sz w:val="21"/>
+        </w:rPr>
+        <w:t xml:space="preserve">SCREEN ID: </w:t>
+      </w:r>
+      <w:r>
+        <w:rPr>
+          <w:rFonts w:ascii="Arial" w:hAnsi="Arial" w:cs="Arial" w:eastAsia="Microsoft YaHei"/>
+          <w:sz w:val="21"/>
+        </w:rPr>
+        <w:t xml:space="preserve">S3    </w:t>
+      </w:r>
+      <w:r>
+        <w:rPr>
+          <w:rFonts w:ascii="Arial" w:hAnsi="Arial" w:cs="Arial" w:eastAsia="Microsoft YaHei"/>
+          <w:b/>
+          <w:sz w:val="21"/>
+        </w:rPr>
+        <w:t xml:space="preserve">DATE: </w:t>
+      </w:r>
+      <w:r>
+        <w:rPr>
+          <w:rFonts w:ascii="Arial" w:hAnsi="Arial" w:cs="Arial" w:eastAsia="Microsoft YaHei"/>
+          <w:sz w:val="21"/>
+        </w:rPr>
+        <w:t>18 October 2026</w:t>
       </w:r>
     </w:p>
     <w:p>
@@ -5247,7 +5376,8 @@
             <w:r>
               <w:rPr>
                 <w:rFonts w:ascii="Arial" w:hAnsi="Arial" w:cs="Arial" w:eastAsia="Microsoft YaHei"/>
-                <w:sz w:val="19"/>
+                <w:b/>
+                <w:sz w:val="20"/>
               </w:rPr>
               <w:t>GRAPHICS:</w:t>
             </w:r>
@@ -5338,7 +5468,8 @@
             <w:r>
               <w:rPr>
                 <w:rFonts w:ascii="Arial" w:hAnsi="Arial" w:cs="Arial" w:eastAsia="Microsoft YaHei"/>
-                <w:sz w:val="19"/>
+                <w:b/>
+                <w:sz w:val="20"/>
               </w:rPr>
               <w:t>TEXT:</w:t>
             </w:r>
@@ -5413,7 +5544,8 @@
             <w:r>
               <w:rPr>
                 <w:rFonts w:ascii="Arial" w:hAnsi="Arial" w:cs="Arial" w:eastAsia="Microsoft YaHei"/>
-                <w:sz w:val="19"/>
+                <w:b/>
+                <w:sz w:val="20"/>
               </w:rPr>
               <w:t>AUDIO/VIDEO:</w:t>
             </w:r>
@@ -5478,7 +5610,8 @@
             <w:r>
               <w:rPr>
                 <w:rFonts w:ascii="Arial" w:hAnsi="Arial" w:cs="Arial" w:eastAsia="Microsoft YaHei"/>
-                <w:sz w:val="19"/>
+                <w:b/>
+                <w:sz w:val="20"/>
               </w:rPr>
               <w:t>NOTES:</w:t>
             </w:r>
@@ -5521,6 +5654,7 @@
         <w:tc>
           <w:tcPr>
             <w:tcW w:type="dxa" w:w="1814"/>
+            <w:shd w:val="clear" w:color="auto" w:fill="E8EEF4"/>
           </w:tcPr>
           <w:p>
             <w:pPr>
@@ -5561,6 +5695,7 @@
         <w:tc>
           <w:tcPr>
             <w:tcW w:type="dxa" w:w="1814"/>
+            <w:shd w:val="clear" w:color="auto" w:fill="E8EEF4"/>
           </w:tcPr>
           <w:p>
             <w:pPr>
@@ -5609,6 +5744,7 @@
         <w:tc>
           <w:tcPr>
             <w:tcW w:type="dxa" w:w="1814"/>
+            <w:shd w:val="clear" w:color="auto" w:fill="E8EEF4"/>
           </w:tcPr>
           <w:p>
             <w:pPr>
@@ -5653,6 +5789,7 @@
         <w:tc>
           <w:tcPr>
             <w:tcW w:type="dxa" w:w="1814"/>
+            <w:shd w:val="clear" w:color="auto" w:fill="E8EEF4"/>
           </w:tcPr>
           <w:p>
             <w:pPr>
@@ -5693,6 +5830,7 @@
         <w:tc>
           <w:tcPr>
             <w:tcW w:type="dxa" w:w="1814"/>
+            <w:shd w:val="clear" w:color="auto" w:fill="E8EEF4"/>
           </w:tcPr>
           <w:p>
             <w:pPr>
@@ -5761,15 +5899,52 @@
     </w:p>
     <w:p>
       <w:pPr>
-        <w:spacing w:after="120"/>
+        <w:spacing w:after="120" w:line="240" w:lineRule="auto"/>
       </w:pPr>
       <w:r>
         <w:rPr>
           <w:rFonts w:ascii="Arial" w:hAnsi="Arial" w:cs="Arial" w:eastAsia="Microsoft YaHei"/>
-          <w:i w:val="0"/>
-          <w:sz w:val="24"/>
+          <w:b/>
+          <w:sz w:val="21"/>
         </w:rPr>
-        <w:t>TITLE: Register - book a place      SCREEN ID: S4      DATE: 18 October 2026</w:t>
+        <w:t xml:space="preserve">TITLE: </w:t>
+      </w:r>
+      <w:r>
+        <w:rPr>
+          <w:rFonts w:ascii="Arial" w:hAnsi="Arial" w:cs="Arial" w:eastAsia="Microsoft YaHei"/>
+          <w:sz w:val="21"/>
+        </w:rPr>
+        <w:t xml:space="preserve">Register - book a place    </w:t>
+      </w:r>
+      <w:r>
+        <w:rPr>
+          <w:rFonts w:ascii="Arial" w:hAnsi="Arial" w:cs="Arial" w:eastAsia="Microsoft YaHei"/>
+          <w:b/>
+          <w:sz w:val="21"/>
+        </w:rPr>
+        <w:t xml:space="preserve">SCREEN ID: </w:t>
+      </w:r>
+      <w:r>
+        <w:rPr>
+          <w:rFonts w:ascii="Arial" w:hAnsi="Arial" w:cs="Arial" w:eastAsia="Microsoft YaHei"/>
+          <w:sz w:val="21"/>
+        </w:rPr>
+        <w:t xml:space="preserve">S4    </w:t>
+      </w:r>
+      <w:r>
+        <w:rPr>
+          <w:rFonts w:ascii="Arial" w:hAnsi="Arial" w:cs="Arial" w:eastAsia="Microsoft YaHei"/>
+          <w:b/>
+          <w:sz w:val="21"/>
+        </w:rPr>
+        <w:t xml:space="preserve">DATE: </w:t>
+      </w:r>
+      <w:r>
+        <w:rPr>
+          <w:rFonts w:ascii="Arial" w:hAnsi="Arial" w:cs="Arial" w:eastAsia="Microsoft YaHei"/>
+          <w:sz w:val="21"/>
+        </w:rPr>
+        <w:t>18 October 2026</w:t>
       </w:r>
     </w:p>
     <w:p>
@@ -5817,7 +5992,8 @@
             <w:r>
               <w:rPr>
                 <w:rFonts w:ascii="Arial" w:hAnsi="Arial" w:cs="Arial" w:eastAsia="Microsoft YaHei"/>
-                <w:sz w:val="19"/>
+                <w:b/>
+                <w:sz w:val="20"/>
               </w:rPr>
               <w:t>GRAPHICS:</w:t>
             </w:r>
@@ -5908,7 +6084,8 @@
             <w:r>
               <w:rPr>
                 <w:rFonts w:ascii="Arial" w:hAnsi="Arial" w:cs="Arial" w:eastAsia="Microsoft YaHei"/>
-                <w:sz w:val="19"/>
+                <w:b/>
+                <w:sz w:val="20"/>
               </w:rPr>
               <w:t>TEXT:</w:t>
             </w:r>
@@ -5995,7 +6172,8 @@
             <w:r>
               <w:rPr>
                 <w:rFonts w:ascii="Arial" w:hAnsi="Arial" w:cs="Arial" w:eastAsia="Microsoft YaHei"/>
-                <w:sz w:val="19"/>
+                <w:b/>
+                <w:sz w:val="20"/>
               </w:rPr>
               <w:t>AUDIO/VIDEO:</w:t>
             </w:r>
@@ -6060,7 +6238,8 @@
             <w:r>
               <w:rPr>
                 <w:rFonts w:ascii="Arial" w:hAnsi="Arial" w:cs="Arial" w:eastAsia="Microsoft YaHei"/>
-                <w:sz w:val="19"/>
+                <w:b/>
+                <w:sz w:val="20"/>
               </w:rPr>
               <w:t>NOTES:</w:t>
             </w:r>
@@ -6103,6 +6282,7 @@
         <w:tc>
           <w:tcPr>
             <w:tcW w:type="dxa" w:w="1814"/>
+            <w:shd w:val="clear" w:color="auto" w:fill="E8EEF4"/>
           </w:tcPr>
           <w:p>
             <w:pPr>
@@ -6143,6 +6323,7 @@
         <w:tc>
           <w:tcPr>
             <w:tcW w:type="dxa" w:w="1814"/>
+            <w:shd w:val="clear" w:color="auto" w:fill="E8EEF4"/>
           </w:tcPr>
           <w:p>
             <w:pPr>
@@ -6189,6 +6370,7 @@
         <w:tc>
           <w:tcPr>
             <w:tcW w:type="dxa" w:w="1814"/>
+            <w:shd w:val="clear" w:color="auto" w:fill="E8EEF4"/>
           </w:tcPr>
           <w:p>
             <w:pPr>
@@ -6233,6 +6415,7 @@
         <w:tc>
           <w:tcPr>
             <w:tcW w:type="dxa" w:w="1814"/>
+            <w:shd w:val="clear" w:color="auto" w:fill="E8EEF4"/>
           </w:tcPr>
           <w:p>
             <w:pPr>
@@ -6273,6 +6456,7 @@
         <w:tc>
           <w:tcPr>
             <w:tcW w:type="dxa" w:w="1814"/>
+            <w:shd w:val="clear" w:color="auto" w:fill="E8EEF4"/>
           </w:tcPr>
           <w:p>
             <w:pPr>
@@ -6341,15 +6525,52 @@
     </w:p>
     <w:p>
       <w:pPr>
-        <w:spacing w:after="120"/>
+        <w:spacing w:after="120" w:line="240" w:lineRule="auto"/>
       </w:pPr>
       <w:r>
         <w:rPr>
           <w:rFonts w:ascii="Arial" w:hAnsi="Arial" w:cs="Arial" w:eastAsia="Microsoft YaHei"/>
-          <w:i w:val="0"/>
-          <w:sz w:val="24"/>
+          <w:b/>
+          <w:sz w:val="21"/>
         </w:rPr>
-        <w:t>TITLE: Staff - event list (admin site)      SCREEN ID: S5      DATE: 18 October 2026</w:t>
+        <w:t xml:space="preserve">TITLE: </w:t>
+      </w:r>
+      <w:r>
+        <w:rPr>
+          <w:rFonts w:ascii="Arial" w:hAnsi="Arial" w:cs="Arial" w:eastAsia="Microsoft YaHei"/>
+          <w:sz w:val="21"/>
+        </w:rPr>
+        <w:t xml:space="preserve">Staff - event list (admin site)    </w:t>
+      </w:r>
+      <w:r>
+        <w:rPr>
+          <w:rFonts w:ascii="Arial" w:hAnsi="Arial" w:cs="Arial" w:eastAsia="Microsoft YaHei"/>
+          <w:b/>
+          <w:sz w:val="21"/>
+        </w:rPr>
+        <w:t xml:space="preserve">SCREEN ID: </w:t>
+      </w:r>
+      <w:r>
+        <w:rPr>
+          <w:rFonts w:ascii="Arial" w:hAnsi="Arial" w:cs="Arial" w:eastAsia="Microsoft YaHei"/>
+          <w:sz w:val="21"/>
+        </w:rPr>
+        <w:t xml:space="preserve">S5    </w:t>
+      </w:r>
+      <w:r>
+        <w:rPr>
+          <w:rFonts w:ascii="Arial" w:hAnsi="Arial" w:cs="Arial" w:eastAsia="Microsoft YaHei"/>
+          <w:b/>
+          <w:sz w:val="21"/>
+        </w:rPr>
+        <w:t xml:space="preserve">DATE: </w:t>
+      </w:r>
+      <w:r>
+        <w:rPr>
+          <w:rFonts w:ascii="Arial" w:hAnsi="Arial" w:cs="Arial" w:eastAsia="Microsoft YaHei"/>
+          <w:sz w:val="21"/>
+        </w:rPr>
+        <w:t>18 October 2026</w:t>
       </w:r>
     </w:p>
     <w:p>
@@ -6397,7 +6618,8 @@
             <w:r>
               <w:rPr>
                 <w:rFonts w:ascii="Arial" w:hAnsi="Arial" w:cs="Arial" w:eastAsia="Microsoft YaHei"/>
-                <w:sz w:val="19"/>
+                <w:b/>
+                <w:sz w:val="20"/>
               </w:rPr>
               <w:t>GRAPHICS:</w:t>
             </w:r>
@@ -6488,7 +6710,8 @@
             <w:r>
               <w:rPr>
                 <w:rFonts w:ascii="Arial" w:hAnsi="Arial" w:cs="Arial" w:eastAsia="Microsoft YaHei"/>
-                <w:sz w:val="19"/>
+                <w:b/>
+                <w:sz w:val="20"/>
               </w:rPr>
               <w:t>TEXT:</w:t>
             </w:r>
@@ -6587,7 +6810,8 @@
             <w:r>
               <w:rPr>
                 <w:rFonts w:ascii="Arial" w:hAnsi="Arial" w:cs="Arial" w:eastAsia="Microsoft YaHei"/>
-                <w:sz w:val="19"/>
+                <w:b/>
+                <w:sz w:val="20"/>
               </w:rPr>
               <w:t>AUDIO/VIDEO:</w:t>
             </w:r>
@@ -6652,7 +6876,8 @@
             <w:r>
               <w:rPr>
                 <w:rFonts w:ascii="Arial" w:hAnsi="Arial" w:cs="Arial" w:eastAsia="Microsoft YaHei"/>
-                <w:sz w:val="19"/>
+                <w:b/>
+                <w:sz w:val="20"/>
               </w:rPr>
               <w:t>NOTES:</w:t>
             </w:r>
@@ -6695,6 +6920,7 @@
         <w:tc>
           <w:tcPr>
             <w:tcW w:type="dxa" w:w="1814"/>
+            <w:shd w:val="clear" w:color="auto" w:fill="E8EEF4"/>
           </w:tcPr>
           <w:p>
             <w:pPr>
@@ -6735,6 +6961,7 @@
         <w:tc>
           <w:tcPr>
             <w:tcW w:type="dxa" w:w="1814"/>
+            <w:shd w:val="clear" w:color="auto" w:fill="E8EEF4"/>
           </w:tcPr>
           <w:p>
             <w:pPr>
@@ -6783,6 +7010,7 @@
         <w:tc>
           <w:tcPr>
             <w:tcW w:type="dxa" w:w="1814"/>
+            <w:shd w:val="clear" w:color="auto" w:fill="E8EEF4"/>
           </w:tcPr>
           <w:p>
             <w:pPr>
@@ -6827,6 +7055,7 @@
         <w:tc>
           <w:tcPr>
             <w:tcW w:type="dxa" w:w="1814"/>
+            <w:shd w:val="clear" w:color="auto" w:fill="E8EEF4"/>
           </w:tcPr>
           <w:p>
             <w:pPr>
@@ -6867,6 +7096,7 @@
         <w:tc>
           <w:tcPr>
             <w:tcW w:type="dxa" w:w="1814"/>
+            <w:shd w:val="clear" w:color="auto" w:fill="E8EEF4"/>
           </w:tcPr>
           <w:p>
             <w:pPr>
@@ -6935,15 +7165,52 @@
     </w:p>
     <w:p>
       <w:pPr>
-        <w:spacing w:after="120"/>
+        <w:spacing w:after="120" w:line="240" w:lineRule="auto"/>
       </w:pPr>
       <w:r>
         <w:rPr>
           <w:rFonts w:ascii="Arial" w:hAnsi="Arial" w:cs="Arial" w:eastAsia="Microsoft YaHei"/>
-          <w:i w:val="0"/>
-          <w:sz w:val="24"/>
+          <w:b/>
+          <w:sz w:val="21"/>
         </w:rPr>
-        <w:t>TITLE: Staff - new event      SCREEN ID: S6      DATE: 18 October 2026</w:t>
+        <w:t xml:space="preserve">TITLE: </w:t>
+      </w:r>
+      <w:r>
+        <w:rPr>
+          <w:rFonts w:ascii="Arial" w:hAnsi="Arial" w:cs="Arial" w:eastAsia="Microsoft YaHei"/>
+          <w:sz w:val="21"/>
+        </w:rPr>
+        <w:t xml:space="preserve">Staff - new event    </w:t>
+      </w:r>
+      <w:r>
+        <w:rPr>
+          <w:rFonts w:ascii="Arial" w:hAnsi="Arial" w:cs="Arial" w:eastAsia="Microsoft YaHei"/>
+          <w:b/>
+          <w:sz w:val="21"/>
+        </w:rPr>
+        <w:t xml:space="preserve">SCREEN ID: </w:t>
+      </w:r>
+      <w:r>
+        <w:rPr>
+          <w:rFonts w:ascii="Arial" w:hAnsi="Arial" w:cs="Arial" w:eastAsia="Microsoft YaHei"/>
+          <w:sz w:val="21"/>
+        </w:rPr>
+        <w:t xml:space="preserve">S6    </w:t>
+      </w:r>
+      <w:r>
+        <w:rPr>
+          <w:rFonts w:ascii="Arial" w:hAnsi="Arial" w:cs="Arial" w:eastAsia="Microsoft YaHei"/>
+          <w:b/>
+          <w:sz w:val="21"/>
+        </w:rPr>
+        <w:t xml:space="preserve">DATE: </w:t>
+      </w:r>
+      <w:r>
+        <w:rPr>
+          <w:rFonts w:ascii="Arial" w:hAnsi="Arial" w:cs="Arial" w:eastAsia="Microsoft YaHei"/>
+          <w:sz w:val="21"/>
+        </w:rPr>
+        <w:t>18 October 2026</w:t>
       </w:r>
     </w:p>
     <w:p>
@@ -6991,7 +7258,8 @@
             <w:r>
               <w:rPr>
                 <w:rFonts w:ascii="Arial" w:hAnsi="Arial" w:cs="Arial" w:eastAsia="Microsoft YaHei"/>
-                <w:sz w:val="19"/>
+                <w:b/>
+                <w:sz w:val="20"/>
               </w:rPr>
               <w:t>GRAPHICS:</w:t>
             </w:r>
@@ -7082,7 +7350,8 @@
             <w:r>
               <w:rPr>
                 <w:rFonts w:ascii="Arial" w:hAnsi="Arial" w:cs="Arial" w:eastAsia="Microsoft YaHei"/>
-                <w:sz w:val="19"/>
+                <w:b/>
+                <w:sz w:val="20"/>
               </w:rPr>
               <w:t>TEXT:</w:t>
             </w:r>
@@ -7169,7 +7438,8 @@
             <w:r>
               <w:rPr>
                 <w:rFonts w:ascii="Arial" w:hAnsi="Arial" w:cs="Arial" w:eastAsia="Microsoft YaHei"/>
-                <w:sz w:val="19"/>
+                <w:b/>
+                <w:sz w:val="20"/>
               </w:rPr>
               <w:t>AUDIO/VIDEO:</w:t>
             </w:r>
@@ -7234,7 +7504,8 @@
             <w:r>
               <w:rPr>
                 <w:rFonts w:ascii="Arial" w:hAnsi="Arial" w:cs="Arial" w:eastAsia="Microsoft YaHei"/>
-                <w:sz w:val="19"/>
+                <w:b/>
+                <w:sz w:val="20"/>
               </w:rPr>
               <w:t>NOTES:</w:t>
             </w:r>
@@ -7277,6 +7548,7 @@
         <w:tc>
           <w:tcPr>
             <w:tcW w:type="dxa" w:w="1814"/>
+            <w:shd w:val="clear" w:color="auto" w:fill="E8EEF4"/>
           </w:tcPr>
           <w:p>
             <w:pPr>
@@ -7317,6 +7589,7 @@
         <w:tc>
           <w:tcPr>
             <w:tcW w:type="dxa" w:w="1814"/>
+            <w:shd w:val="clear" w:color="auto" w:fill="E8EEF4"/>
           </w:tcPr>
           <w:p>
             <w:pPr>
@@ -7361,6 +7634,7 @@
         <w:tc>
           <w:tcPr>
             <w:tcW w:type="dxa" w:w="1814"/>
+            <w:shd w:val="clear" w:color="auto" w:fill="E8EEF4"/>
           </w:tcPr>
           <w:p>
             <w:pPr>
@@ -7407,6 +7681,7 @@
         <w:tc>
           <w:tcPr>
             <w:tcW w:type="dxa" w:w="1814"/>
+            <w:shd w:val="clear" w:color="auto" w:fill="E8EEF4"/>
           </w:tcPr>
           <w:p>
             <w:pPr>
@@ -7447,6 +7722,7 @@
         <w:tc>
           <w:tcPr>
             <w:tcW w:type="dxa" w:w="1814"/>
+            <w:shd w:val="clear" w:color="auto" w:fill="E8EEF4"/>
           </w:tcPr>
           <w:p>
             <w:pPr>
@@ -7515,15 +7791,52 @@
     </w:p>
     <w:p>
       <w:pPr>
-        <w:spacing w:after="120"/>
+        <w:spacing w:after="120" w:line="240" w:lineRule="auto"/>
       </w:pPr>
       <w:r>
         <w:rPr>
           <w:rFonts w:ascii="Arial" w:hAnsi="Arial" w:cs="Arial" w:eastAsia="Microsoft YaHei"/>
-          <w:i w:val="0"/>
-          <w:sz w:val="24"/>
+          <w:b/>
+          <w:sz w:val="21"/>
         </w:rPr>
-        <w:t>TITLE: Staff - edit event      SCREEN ID: S7      DATE: 18 October 2026</w:t>
+        <w:t xml:space="preserve">TITLE: </w:t>
+      </w:r>
+      <w:r>
+        <w:rPr>
+          <w:rFonts w:ascii="Arial" w:hAnsi="Arial" w:cs="Arial" w:eastAsia="Microsoft YaHei"/>
+          <w:sz w:val="21"/>
+        </w:rPr>
+        <w:t xml:space="preserve">Staff - edit event    </w:t>
+      </w:r>
+      <w:r>
+        <w:rPr>
+          <w:rFonts w:ascii="Arial" w:hAnsi="Arial" w:cs="Arial" w:eastAsia="Microsoft YaHei"/>
+          <w:b/>
+          <w:sz w:val="21"/>
+        </w:rPr>
+        <w:t xml:space="preserve">SCREEN ID: </w:t>
+      </w:r>
+      <w:r>
+        <w:rPr>
+          <w:rFonts w:ascii="Arial" w:hAnsi="Arial" w:cs="Arial" w:eastAsia="Microsoft YaHei"/>
+          <w:sz w:val="21"/>
+        </w:rPr>
+        <w:t xml:space="preserve">S7    </w:t>
+      </w:r>
+      <w:r>
+        <w:rPr>
+          <w:rFonts w:ascii="Arial" w:hAnsi="Arial" w:cs="Arial" w:eastAsia="Microsoft YaHei"/>
+          <w:b/>
+          <w:sz w:val="21"/>
+        </w:rPr>
+        <w:t xml:space="preserve">DATE: </w:t>
+      </w:r>
+      <w:r>
+        <w:rPr>
+          <w:rFonts w:ascii="Arial" w:hAnsi="Arial" w:cs="Arial" w:eastAsia="Microsoft YaHei"/>
+          <w:sz w:val="21"/>
+        </w:rPr>
+        <w:t>18 October 2026</w:t>
       </w:r>
     </w:p>
     <w:p>
@@ -7571,7 +7884,8 @@
             <w:r>
               <w:rPr>
                 <w:rFonts w:ascii="Arial" w:hAnsi="Arial" w:cs="Arial" w:eastAsia="Microsoft YaHei"/>
-                <w:sz w:val="19"/>
+                <w:b/>
+                <w:sz w:val="20"/>
               </w:rPr>
               <w:t>GRAPHICS:</w:t>
             </w:r>
@@ -7662,7 +7976,8 @@
             <w:r>
               <w:rPr>
                 <w:rFonts w:ascii="Arial" w:hAnsi="Arial" w:cs="Arial" w:eastAsia="Microsoft YaHei"/>
-                <w:sz w:val="19"/>
+                <w:b/>
+                <w:sz w:val="20"/>
               </w:rPr>
               <w:t>TEXT:</w:t>
             </w:r>
@@ -7737,7 +8052,8 @@
             <w:r>
               <w:rPr>
                 <w:rFonts w:ascii="Arial" w:hAnsi="Arial" w:cs="Arial" w:eastAsia="Microsoft YaHei"/>
-                <w:sz w:val="19"/>
+                <w:b/>
+                <w:sz w:val="20"/>
               </w:rPr>
               <w:t>AUDIO/VIDEO:</w:t>
             </w:r>
@@ -7802,7 +8118,8 @@
             <w:r>
               <w:rPr>
                 <w:rFonts w:ascii="Arial" w:hAnsi="Arial" w:cs="Arial" w:eastAsia="Microsoft YaHei"/>
-                <w:sz w:val="19"/>
+                <w:b/>
+                <w:sz w:val="20"/>
               </w:rPr>
               <w:t>NOTES:</w:t>
             </w:r>
@@ -7845,6 +8162,7 @@
         <w:tc>
           <w:tcPr>
             <w:tcW w:type="dxa" w:w="1814"/>
+            <w:shd w:val="clear" w:color="auto" w:fill="E8EEF4"/>
           </w:tcPr>
           <w:p>
             <w:pPr>
@@ -7885,6 +8203,7 @@
         <w:tc>
           <w:tcPr>
             <w:tcW w:type="dxa" w:w="1814"/>
+            <w:shd w:val="clear" w:color="auto" w:fill="E8EEF4"/>
           </w:tcPr>
           <w:p>
             <w:pPr>
@@ -7929,6 +8248,7 @@
         <w:tc>
           <w:tcPr>
             <w:tcW w:type="dxa" w:w="1814"/>
+            <w:shd w:val="clear" w:color="auto" w:fill="E8EEF4"/>
           </w:tcPr>
           <w:p>
             <w:pPr>
@@ -7973,6 +8293,7 @@
         <w:tc>
           <w:tcPr>
             <w:tcW w:type="dxa" w:w="1814"/>
+            <w:shd w:val="clear" w:color="auto" w:fill="E8EEF4"/>
           </w:tcPr>
           <w:p>
             <w:pPr>
@@ -8013,6 +8334,7 @@
         <w:tc>
           <w:tcPr>
             <w:tcW w:type="dxa" w:w="1814"/>
+            <w:shd w:val="clear" w:color="auto" w:fill="E8EEF4"/>
           </w:tcPr>
           <w:p>
             <w:pPr>

</xml_diff>

<commit_message>
Report: make the storyboard typography genuinely uniform
The previous pass asked for 8.3pt, but docx stores sizes in half-points so it silently rendered as 8.0pt - visibly smaller than intended next to the 10pt labels. Body text in the frames and the five-row table is now a real 8.5pt, the meta line 11pt, sub-headings 12pt, labels 10pt bold; screenshots trimmed a notch so every screen still fills exactly one page.

Refreshes both reports, PDFs, docs/report and the report/ folder inside both api zips.
</commit_message>
<xml_diff>
--- a/docs/report/cgao15A3-report.docx
+++ b/docs/report/cgao15A3-report.docx
@@ -4021,14 +4021,14 @@
         <w:rPr>
           <w:rFonts w:ascii="Arial" w:hAnsi="Arial" w:cs="Arial" w:eastAsia="Microsoft YaHei"/>
           <w:b/>
-          <w:sz w:val="21"/>
+          <w:sz w:val="22"/>
         </w:rPr>
         <w:t xml:space="preserve">TITLE: </w:t>
       </w:r>
       <w:r>
         <w:rPr>
           <w:rFonts w:ascii="Arial" w:hAnsi="Arial" w:cs="Arial" w:eastAsia="Microsoft YaHei"/>
-          <w:sz w:val="21"/>
+          <w:sz w:val="22"/>
         </w:rPr>
         <w:t xml:space="preserve">Home - Giving Coast public site    </w:t>
       </w:r>
@@ -4036,14 +4036,14 @@
         <w:rPr>
           <w:rFonts w:ascii="Arial" w:hAnsi="Arial" w:cs="Arial" w:eastAsia="Microsoft YaHei"/>
           <w:b/>
-          <w:sz w:val="21"/>
+          <w:sz w:val="22"/>
         </w:rPr>
         <w:t xml:space="preserve">SCREEN ID: </w:t>
       </w:r>
       <w:r>
         <w:rPr>
           <w:rFonts w:ascii="Arial" w:hAnsi="Arial" w:cs="Arial" w:eastAsia="Microsoft YaHei"/>
-          <w:sz w:val="21"/>
+          <w:sz w:val="22"/>
         </w:rPr>
         <w:t xml:space="preserve">S1    </w:t>
       </w:r>
@@ -4051,14 +4051,14 @@
         <w:rPr>
           <w:rFonts w:ascii="Arial" w:hAnsi="Arial" w:cs="Arial" w:eastAsia="Microsoft YaHei"/>
           <w:b/>
-          <w:sz w:val="21"/>
+          <w:sz w:val="22"/>
         </w:rPr>
         <w:t xml:space="preserve">DATE: </w:t>
       </w:r>
       <w:r>
         <w:rPr>
           <w:rFonts w:ascii="Arial" w:hAnsi="Arial" w:cs="Arial" w:eastAsia="Microsoft YaHei"/>
-          <w:sz w:val="21"/>
+          <w:sz w:val="22"/>
         </w:rPr>
         <w:t>18 October 2026</w:t>
       </w:r>
@@ -4072,7 +4072,7 @@
         <w:rPr>
           <w:rFonts w:ascii="Arial" w:hAnsi="Arial" w:cs="Arial" w:eastAsia="Microsoft YaHei"/>
           <w:b/>
-          <w:sz w:val="22"/>
+          <w:sz w:val="24"/>
         </w:rPr>
         <w:t>Elements:</w:t>
       </w:r>
@@ -4122,7 +4122,7 @@
             <w:r>
               <w:drawing>
                 <wp:inline xmlns:a="http://schemas.openxmlformats.org/drawingml/2006/main" xmlns:pic="http://schemas.openxmlformats.org/drawingml/2006/picture">
-                  <wp:extent cx="2376000" cy="2320312"/>
+                  <wp:extent cx="2160000" cy="2109375"/>
                   <wp:docPr id="1" name="Picture 1"/>
                   <wp:cNvGraphicFramePr>
                     <a:graphicFrameLocks noChangeAspect="1"/>
@@ -4143,7 +4143,7 @@
                         <pic:spPr>
                           <a:xfrm>
                             <a:off x="0" y="0"/>
-                            <a:ext cx="2376000" cy="2320312"/>
+                            <a:ext cx="2160000" cy="2109375"/>
                           </a:xfrm>
                           <a:prstGeom prst="rect"/>
                         </pic:spPr>
@@ -4161,7 +4161,7 @@
             <w:r>
               <w:rPr>
                 <w:rFonts w:ascii="Arial" w:hAnsi="Arial" w:cs="Arial" w:eastAsia="Microsoft YaHei"/>
-                <w:sz w:val="16"/>
+                <w:sz w:val="17"/>
               </w:rPr>
               <w:t>Live screenshot of the deployed page (https://24831941.it.scu.edu.au), taken with headless Chrome. The layout is the design; every value on it comes from the API.</w:t>
             </w:r>
@@ -4213,7 +4213,7 @@
             <w:r>
               <w:rPr>
                 <w:rFonts w:ascii="Arial" w:hAnsi="Arial" w:cs="Arial" w:eastAsia="Microsoft YaHei"/>
-                <w:sz w:val="16"/>
+                <w:sz w:val="17"/>
               </w:rPr>
               <w:t>Hero: eyebrow 'Gold Coast - Queensland', headline 'Charity events worth showing up for', lead paragraph</w:t>
             </w:r>
@@ -4225,7 +4225,7 @@
             <w:r>
               <w:rPr>
                 <w:rFonts w:ascii="Arial" w:hAnsi="Arial" w:cs="Arial" w:eastAsia="Microsoft YaHei"/>
-                <w:sz w:val="16"/>
+                <w:sz w:val="17"/>
               </w:rPr>
               <w:t>Button: 'Find an event'</w:t>
             </w:r>
@@ -4237,7 +4237,7 @@
             <w:r>
               <w:rPr>
                 <w:rFonts w:ascii="Arial" w:hAnsi="Arial" w:cs="Arial" w:eastAsia="Microsoft YaHei"/>
-                <w:sz w:val="16"/>
+                <w:sz w:val="17"/>
               </w:rPr>
               <w:t>Section headings: 'Upcoming events' / 'Recently finished'</w:t>
             </w:r>
@@ -4249,7 +4249,7 @@
             <w:r>
               <w:rPr>
                 <w:rFonts w:ascii="Arial" w:hAnsi="Arial" w:cs="Arial" w:eastAsia="Microsoft YaHei"/>
-                <w:sz w:val="16"/>
+                <w:sz w:val="17"/>
               </w:rPr>
               <w:t>On every card: event name, date, time, venue, price, one-line summary, '$X raised of $Y goal', 'N registered', charity name</w:t>
             </w:r>
@@ -4301,7 +4301,7 @@
             <w:r>
               <w:rPr>
                 <w:rFonts w:ascii="Arial" w:hAnsi="Arial" w:cs="Arial" w:eastAsia="Microsoft YaHei"/>
-                <w:sz w:val="16"/>
+                <w:sz w:val="17"/>
               </w:rPr>
               <w:t>None. No audio, no video, no images: the icons are characters from the database, the colour bands and progress bar are CSS drawn from API values.</w:t>
             </w:r>
@@ -4318,7 +4318,7 @@
         <w:rPr>
           <w:rFonts w:ascii="Arial" w:hAnsi="Arial" w:cs="Arial" w:eastAsia="Microsoft YaHei"/>
           <w:b/>
-          <w:sz w:val="22"/>
+          <w:sz w:val="24"/>
         </w:rPr>
         <w:t>NOTES</w:t>
       </w:r>
@@ -4367,7 +4367,7 @@
             <w:r>
               <w:rPr>
                 <w:rFonts w:ascii="Arial" w:hAnsi="Arial" w:cs="Arial" w:eastAsia="Microsoft YaHei"/>
-                <w:sz w:val="16"/>
+                <w:sz w:val="17"/>
               </w:rPr>
               <w:t>The first screen is already the product: a visitor reaches an event in at most one click, and a broken back end shows immediately as an empty grid with a retry button rather than a silent blank page.</w:t>
             </w:r>
@@ -4409,7 +4409,7 @@
               <w:rPr>
                 <w:rFonts w:ascii="Arial" w:hAnsi="Arial" w:cs="Arial" w:eastAsia="Microsoft YaHei"/>
                 <w:b/>
-                <w:sz w:val="16"/>
+                <w:sz w:val="17"/>
               </w:rPr>
               <w:t>Description:</w:t>
             </w:r>
@@ -4428,7 +4428,7 @@
               <w:rPr>
                 <w:rFonts w:ascii="Arial" w:hAnsi="Arial" w:cs="Arial" w:eastAsia="Microsoft YaHei"/>
                 <w:b w:val="0"/>
-                <w:sz w:val="16"/>
+                <w:sz w:val="17"/>
               </w:rPr>
               <w:t>The landing page. Its job is to make a visitor want to attend something and get them to an event within one click. It also quietly proves the site is alive: every card is rendered from the database, so an empty home page would mean a broken back end.</w:t>
             </w:r>
@@ -4450,7 +4450,7 @@
               <w:rPr>
                 <w:rFonts w:ascii="Arial" w:hAnsi="Arial" w:cs="Arial" w:eastAsia="Microsoft YaHei"/>
                 <w:b/>
-                <w:sz w:val="16"/>
+                <w:sz w:val="17"/>
               </w:rPr>
               <w:t>Content:</w:t>
             </w:r>
@@ -4469,7 +4469,7 @@
               <w:rPr>
                 <w:rFonts w:ascii="Arial" w:hAnsi="Arial" w:cs="Arial" w:eastAsia="Microsoft YaHei"/>
                 <w:b w:val="0"/>
-                <w:sz w:val="16"/>
+                <w:sz w:val="17"/>
               </w:rPr>
               <w:t>Header with the Giving Coast mark and the menu (Home / Search / Staff admin).</w:t>
               <w:br/>
@@ -4499,7 +4499,7 @@
               <w:rPr>
                 <w:rFonts w:ascii="Arial" w:hAnsi="Arial" w:cs="Arial" w:eastAsia="Microsoft YaHei"/>
                 <w:b/>
-                <w:sz w:val="16"/>
+                <w:sz w:val="17"/>
               </w:rPr>
               <w:t>Interactions:</w:t>
             </w:r>
@@ -4518,7 +4518,7 @@
               <w:rPr>
                 <w:rFonts w:ascii="Arial" w:hAnsi="Arial" w:cs="Arial" w:eastAsia="Microsoft YaHei"/>
                 <w:b w:val="0"/>
-                <w:sz w:val="16"/>
+                <w:sz w:val="17"/>
               </w:rPr>
               <w:t>On load the page calls GET /api/events and GET /api/events/past and renders the two grids from the responses; nothing on the page is hard-coded.</w:t>
               <w:br/>
@@ -4546,7 +4546,7 @@
               <w:rPr>
                 <w:rFonts w:ascii="Arial" w:hAnsi="Arial" w:cs="Arial" w:eastAsia="Microsoft YaHei"/>
                 <w:b/>
-                <w:sz w:val="16"/>
+                <w:sz w:val="17"/>
               </w:rPr>
               <w:t>Media Creation:</w:t>
             </w:r>
@@ -4565,7 +4565,7 @@
               <w:rPr>
                 <w:rFonts w:ascii="Arial" w:hAnsi="Arial" w:cs="Arial" w:eastAsia="Microsoft YaHei"/>
                 <w:b w:val="0"/>
-                <w:sz w:val="16"/>
+                <w:sz w:val="17"/>
               </w:rPr>
               <w:t>No image assets at all. The category icons are emoji stored in the database and served by the API (which is why the tables are utf8mb4); the card colour bands are CSS derived from the category; the progress bar is drawn from raised_amount / goal_amount returned by the API rather than stored in the table.</w:t>
             </w:r>
@@ -4587,7 +4587,7 @@
               <w:rPr>
                 <w:rFonts w:ascii="Arial" w:hAnsi="Arial" w:cs="Arial" w:eastAsia="Microsoft YaHei"/>
                 <w:b/>
-                <w:sz w:val="16"/>
+                <w:sz w:val="17"/>
               </w:rPr>
               <w:t>Navigation:</w:t>
             </w:r>
@@ -4606,7 +4606,7 @@
               <w:rPr>
                 <w:rFonts w:ascii="Arial" w:hAnsi="Arial" w:cs="Arial" w:eastAsia="Microsoft YaHei"/>
                 <w:b w:val="0"/>
-                <w:sz w:val="16"/>
+                <w:sz w:val="17"/>
               </w:rPr>
               <w:t>In: the site root, or 'View public site' from the staff site.</w:t>
               <w:br/>
@@ -4651,14 +4651,14 @@
         <w:rPr>
           <w:rFonts w:ascii="Arial" w:hAnsi="Arial" w:cs="Arial" w:eastAsia="Microsoft YaHei"/>
           <w:b/>
-          <w:sz w:val="21"/>
+          <w:sz w:val="22"/>
         </w:rPr>
         <w:t xml:space="preserve">TITLE: </w:t>
       </w:r>
       <w:r>
         <w:rPr>
           <w:rFonts w:ascii="Arial" w:hAnsi="Arial" w:cs="Arial" w:eastAsia="Microsoft YaHei"/>
-          <w:sz w:val="21"/>
+          <w:sz w:val="22"/>
         </w:rPr>
         <w:t xml:space="preserve">Search - find an event    </w:t>
       </w:r>
@@ -4666,14 +4666,14 @@
         <w:rPr>
           <w:rFonts w:ascii="Arial" w:hAnsi="Arial" w:cs="Arial" w:eastAsia="Microsoft YaHei"/>
           <w:b/>
-          <w:sz w:val="21"/>
+          <w:sz w:val="22"/>
         </w:rPr>
         <w:t xml:space="preserve">SCREEN ID: </w:t>
       </w:r>
       <w:r>
         <w:rPr>
           <w:rFonts w:ascii="Arial" w:hAnsi="Arial" w:cs="Arial" w:eastAsia="Microsoft YaHei"/>
-          <w:sz w:val="21"/>
+          <w:sz w:val="22"/>
         </w:rPr>
         <w:t xml:space="preserve">S2    </w:t>
       </w:r>
@@ -4681,14 +4681,14 @@
         <w:rPr>
           <w:rFonts w:ascii="Arial" w:hAnsi="Arial" w:cs="Arial" w:eastAsia="Microsoft YaHei"/>
           <w:b/>
-          <w:sz w:val="21"/>
+          <w:sz w:val="22"/>
         </w:rPr>
         <w:t xml:space="preserve">DATE: </w:t>
       </w:r>
       <w:r>
         <w:rPr>
           <w:rFonts w:ascii="Arial" w:hAnsi="Arial" w:cs="Arial" w:eastAsia="Microsoft YaHei"/>
-          <w:sz w:val="21"/>
+          <w:sz w:val="22"/>
         </w:rPr>
         <w:t>18 October 2026</w:t>
       </w:r>
@@ -4702,7 +4702,7 @@
         <w:rPr>
           <w:rFonts w:ascii="Arial" w:hAnsi="Arial" w:cs="Arial" w:eastAsia="Microsoft YaHei"/>
           <w:b/>
-          <w:sz w:val="22"/>
+          <w:sz w:val="24"/>
         </w:rPr>
         <w:t>Elements:</w:t>
       </w:r>
@@ -4752,7 +4752,7 @@
             <w:r>
               <w:drawing>
                 <wp:inline xmlns:a="http://schemas.openxmlformats.org/drawingml/2006/main" xmlns:pic="http://schemas.openxmlformats.org/drawingml/2006/picture">
-                  <wp:extent cx="2592000" cy="2531250"/>
+                  <wp:extent cx="2448000" cy="2390625"/>
                   <wp:docPr id="2" name="Picture 2"/>
                   <wp:cNvGraphicFramePr>
                     <a:graphicFrameLocks noChangeAspect="1"/>
@@ -4773,7 +4773,7 @@
                         <pic:spPr>
                           <a:xfrm>
                             <a:off x="0" y="0"/>
-                            <a:ext cx="2592000" cy="2531250"/>
+                            <a:ext cx="2448000" cy="2390625"/>
                           </a:xfrm>
                           <a:prstGeom prst="rect"/>
                         </pic:spPr>
@@ -4791,7 +4791,7 @@
             <w:r>
               <w:rPr>
                 <w:rFonts w:ascii="Arial" w:hAnsi="Arial" w:cs="Arial" w:eastAsia="Microsoft YaHei"/>
-                <w:sz w:val="16"/>
+                <w:sz w:val="17"/>
               </w:rPr>
               <w:t>Live screenshot of the deployed page (https://24831941.it.scu.edu.au), taken with headless Chrome. The layout is the design; every value on it comes from the API.</w:t>
             </w:r>
@@ -4843,7 +4843,7 @@
             <w:r>
               <w:rPr>
                 <w:rFonts w:ascii="Arial" w:hAnsi="Arial" w:cs="Arial" w:eastAsia="Microsoft YaHei"/>
-                <w:sz w:val="16"/>
+                <w:sz w:val="17"/>
               </w:rPr>
               <w:t>Title: 'Search events'</w:t>
             </w:r>
@@ -4855,7 +4855,7 @@
             <w:r>
               <w:rPr>
                 <w:rFonts w:ascii="Arial" w:hAnsi="Arial" w:cs="Arial" w:eastAsia="Microsoft YaHei"/>
-                <w:sz w:val="16"/>
+                <w:sz w:val="17"/>
               </w:rPr>
               <w:t>Instruction: 'Leave everything blank to see everything that is still coming up.'</w:t>
             </w:r>
@@ -4867,7 +4867,7 @@
             <w:r>
               <w:rPr>
                 <w:rFonts w:ascii="Arial" w:hAnsi="Arial" w:cs="Arial" w:eastAsia="Microsoft YaHei"/>
-                <w:sz w:val="16"/>
+                <w:sz w:val="17"/>
               </w:rPr>
               <w:t>Field labels: Date / Location / Category</w:t>
             </w:r>
@@ -4879,7 +4879,7 @@
             <w:r>
               <w:rPr>
                 <w:rFonts w:ascii="Arial" w:hAnsi="Arial" w:cs="Arial" w:eastAsia="Microsoft YaHei"/>
-                <w:sz w:val="16"/>
+                <w:sz w:val="17"/>
               </w:rPr>
               <w:t>Buttons: 'Search' / 'Clear'</w:t>
             </w:r>
@@ -4891,7 +4891,7 @@
             <w:r>
               <w:rPr>
                 <w:rFonts w:ascii="Arial" w:hAnsi="Arial" w:cs="Arial" w:eastAsia="Microsoft YaHei"/>
-                <w:sz w:val="16"/>
+                <w:sz w:val="17"/>
               </w:rPr>
               <w:t>Results heading with the number found</w:t>
             </w:r>
@@ -4943,7 +4943,7 @@
             <w:r>
               <w:rPr>
                 <w:rFonts w:ascii="Arial" w:hAnsi="Arial" w:cs="Arial" w:eastAsia="Microsoft YaHei"/>
-                <w:sz w:val="16"/>
+                <w:sz w:val="17"/>
               </w:rPr>
               <w:t>None - same card component as the home page; the category icons come from the database.</w:t>
             </w:r>
@@ -4960,7 +4960,7 @@
         <w:rPr>
           <w:rFonts w:ascii="Arial" w:hAnsi="Arial" w:cs="Arial" w:eastAsia="Microsoft YaHei"/>
           <w:b/>
-          <w:sz w:val="22"/>
+          <w:sz w:val="24"/>
         </w:rPr>
         <w:t>NOTES</w:t>
       </w:r>
@@ -5009,7 +5009,7 @@
             <w:r>
               <w:rPr>
                 <w:rFonts w:ascii="Arial" w:hAnsi="Arial" w:cs="Arial" w:eastAsia="Microsoft YaHei"/>
-                <w:sz w:val="16"/>
+                <w:sz w:val="17"/>
               </w:rPr>
               <w:t>Filtering runs on the server, so the page only draws results; 'no search yet' and 'no results' are deliberately two different states. A past date is refused before the request is sent.</w:t>
             </w:r>
@@ -5051,7 +5051,7 @@
               <w:rPr>
                 <w:rFonts w:ascii="Arial" w:hAnsi="Arial" w:cs="Arial" w:eastAsia="Microsoft YaHei"/>
                 <w:b/>
-                <w:sz w:val="16"/>
+                <w:sz w:val="17"/>
               </w:rPr>
               <w:t>Description:</w:t>
             </w:r>
@@ -5070,7 +5070,7 @@
               <w:rPr>
                 <w:rFonts w:ascii="Arial" w:hAnsi="Arial" w:cs="Arial" w:eastAsia="Microsoft YaHei"/>
                 <w:b w:val="0"/>
-                <w:sz w:val="16"/>
+                <w:sz w:val="17"/>
               </w:rPr>
               <w:t>For the visitor who already knows roughly what they want. Three filters - date, location and category - any combination of which can be used, or none at all.</w:t>
             </w:r>
@@ -5092,7 +5092,7 @@
               <w:rPr>
                 <w:rFonts w:ascii="Arial" w:hAnsi="Arial" w:cs="Arial" w:eastAsia="Microsoft YaHei"/>
                 <w:b/>
-                <w:sz w:val="16"/>
+                <w:sz w:val="17"/>
               </w:rPr>
               <w:t>Content:</w:t>
             </w:r>
@@ -5111,7 +5111,7 @@
               <w:rPr>
                 <w:rFonts w:ascii="Arial" w:hAnsi="Arial" w:cs="Arial" w:eastAsia="Microsoft YaHei"/>
                 <w:b w:val="0"/>
-                <w:sz w:val="16"/>
+                <w:sz w:val="17"/>
               </w:rPr>
               <w:t>Page title and a two-line explanation ('Leave everything blank to see everything that is still coming up').</w:t>
               <w:br/>
@@ -5137,7 +5137,7 @@
               <w:rPr>
                 <w:rFonts w:ascii="Arial" w:hAnsi="Arial" w:cs="Arial" w:eastAsia="Microsoft YaHei"/>
                 <w:b/>
-                <w:sz w:val="16"/>
+                <w:sz w:val="17"/>
               </w:rPr>
               <w:t>Interactions:</w:t>
             </w:r>
@@ -5156,7 +5156,7 @@
               <w:rPr>
                 <w:rFonts w:ascii="Arial" w:hAnsi="Arial" w:cs="Arial" w:eastAsia="Microsoft YaHei"/>
                 <w:b w:val="0"/>
-                <w:sz w:val="16"/>
+                <w:sz w:val="17"/>
               </w:rPr>
               <w:t>Search sends GET /api/events?date=&amp;location=&amp;category= - the filtering is done by the API, not by downloading every event and hiding rows in the browser.</w:t>
               <w:br/>
@@ -5184,7 +5184,7 @@
               <w:rPr>
                 <w:rFonts w:ascii="Arial" w:hAnsi="Arial" w:cs="Arial" w:eastAsia="Microsoft YaHei"/>
                 <w:b/>
-                <w:sz w:val="16"/>
+                <w:sz w:val="17"/>
               </w:rPr>
               <w:t>Media Creation:</w:t>
             </w:r>
@@ -5203,7 +5203,7 @@
               <w:rPr>
                 <w:rFonts w:ascii="Arial" w:hAnsi="Arial" w:cs="Arial" w:eastAsia="Microsoft YaHei"/>
                 <w:b w:val="0"/>
-                <w:sz w:val="16"/>
+                <w:sz w:val="17"/>
               </w:rPr>
               <w:t>The category select is filled from GET /api/categories, so a new category added by staff appears here without a rebuild. Cards reuse the home page component.</w:t>
             </w:r>
@@ -5225,7 +5225,7 @@
               <w:rPr>
                 <w:rFonts w:ascii="Arial" w:hAnsi="Arial" w:cs="Arial" w:eastAsia="Microsoft YaHei"/>
                 <w:b/>
-                <w:sz w:val="16"/>
+                <w:sz w:val="17"/>
               </w:rPr>
               <w:t>Navigation:</w:t>
             </w:r>
@@ -5244,7 +5244,7 @@
               <w:rPr>
                 <w:rFonts w:ascii="Arial" w:hAnsi="Arial" w:cs="Arial" w:eastAsia="Microsoft YaHei"/>
                 <w:b w:val="0"/>
-                <w:sz w:val="16"/>
+                <w:sz w:val="17"/>
               </w:rPr>
               <w:t>In: 'Find an event' from the home hero, or Search in the menu.</w:t>
               <w:br/>
@@ -5289,14 +5289,14 @@
         <w:rPr>
           <w:rFonts w:ascii="Arial" w:hAnsi="Arial" w:cs="Arial" w:eastAsia="Microsoft YaHei"/>
           <w:b/>
-          <w:sz w:val="21"/>
+          <w:sz w:val="22"/>
         </w:rPr>
         <w:t xml:space="preserve">TITLE: </w:t>
       </w:r>
       <w:r>
         <w:rPr>
           <w:rFonts w:ascii="Arial" w:hAnsi="Arial" w:cs="Arial" w:eastAsia="Microsoft YaHei"/>
-          <w:sz w:val="21"/>
+          <w:sz w:val="22"/>
         </w:rPr>
         <w:t xml:space="preserve">Event detail - one charity event    </w:t>
       </w:r>
@@ -5304,14 +5304,14 @@
         <w:rPr>
           <w:rFonts w:ascii="Arial" w:hAnsi="Arial" w:cs="Arial" w:eastAsia="Microsoft YaHei"/>
           <w:b/>
-          <w:sz w:val="21"/>
+          <w:sz w:val="22"/>
         </w:rPr>
         <w:t xml:space="preserve">SCREEN ID: </w:t>
       </w:r>
       <w:r>
         <w:rPr>
           <w:rFonts w:ascii="Arial" w:hAnsi="Arial" w:cs="Arial" w:eastAsia="Microsoft YaHei"/>
-          <w:sz w:val="21"/>
+          <w:sz w:val="22"/>
         </w:rPr>
         <w:t xml:space="preserve">S3    </w:t>
       </w:r>
@@ -5319,14 +5319,14 @@
         <w:rPr>
           <w:rFonts w:ascii="Arial" w:hAnsi="Arial" w:cs="Arial" w:eastAsia="Microsoft YaHei"/>
           <w:b/>
-          <w:sz w:val="21"/>
+          <w:sz w:val="22"/>
         </w:rPr>
         <w:t xml:space="preserve">DATE: </w:t>
       </w:r>
       <w:r>
         <w:rPr>
           <w:rFonts w:ascii="Arial" w:hAnsi="Arial" w:cs="Arial" w:eastAsia="Microsoft YaHei"/>
-          <w:sz w:val="21"/>
+          <w:sz w:val="22"/>
         </w:rPr>
         <w:t>18 October 2026</w:t>
       </w:r>
@@ -5340,7 +5340,7 @@
         <w:rPr>
           <w:rFonts w:ascii="Arial" w:hAnsi="Arial" w:cs="Arial" w:eastAsia="Microsoft YaHei"/>
           <w:b/>
-          <w:sz w:val="22"/>
+          <w:sz w:val="24"/>
         </w:rPr>
         <w:t>Elements:</w:t>
       </w:r>
@@ -5390,7 +5390,7 @@
             <w:r>
               <w:drawing>
                 <wp:inline xmlns:a="http://schemas.openxmlformats.org/drawingml/2006/main" xmlns:pic="http://schemas.openxmlformats.org/drawingml/2006/picture">
-                  <wp:extent cx="2592000" cy="2531250"/>
+                  <wp:extent cx="2448000" cy="2390625"/>
                   <wp:docPr id="3" name="Picture 3"/>
                   <wp:cNvGraphicFramePr>
                     <a:graphicFrameLocks noChangeAspect="1"/>
@@ -5411,7 +5411,7 @@
                         <pic:spPr>
                           <a:xfrm>
                             <a:off x="0" y="0"/>
-                            <a:ext cx="2592000" cy="2531250"/>
+                            <a:ext cx="2448000" cy="2390625"/>
                           </a:xfrm>
                           <a:prstGeom prst="rect"/>
                         </pic:spPr>
@@ -5429,7 +5429,7 @@
             <w:r>
               <w:rPr>
                 <w:rFonts w:ascii="Arial" w:hAnsi="Arial" w:cs="Arial" w:eastAsia="Microsoft YaHei"/>
-                <w:sz w:val="16"/>
+                <w:sz w:val="17"/>
               </w:rPr>
               <w:t>Live screenshot of the deployed page (https://24831941.it.scu.edu.au), taken with headless Chrome. The layout is the design; every value on it comes from the API.</w:t>
             </w:r>
@@ -5481,7 +5481,7 @@
             <w:r>
               <w:rPr>
                 <w:rFonts w:ascii="Arial" w:hAnsi="Arial" w:cs="Arial" w:eastAsia="Microsoft YaHei"/>
-                <w:sz w:val="16"/>
+                <w:sz w:val="17"/>
               </w:rPr>
               <w:t>Breadcrumb: 'All events &gt; {category}' and a 'Back to all events' link</w:t>
             </w:r>
@@ -5493,7 +5493,7 @@
             <w:r>
               <w:rPr>
                 <w:rFonts w:ascii="Arial" w:hAnsi="Arial" w:cs="Arial" w:eastAsia="Microsoft YaHei"/>
-                <w:sz w:val="16"/>
+                <w:sz w:val="17"/>
               </w:rPr>
               <w:t>Panels: 'Who is going' (name, tickets, booking date), 'Expected weather' (icon, description, max/min degrees), 'Run by' (charity details)</w:t>
             </w:r>
@@ -5505,7 +5505,7 @@
             <w:r>
               <w:rPr>
                 <w:rFonts w:ascii="Arial" w:hAnsi="Arial" w:cs="Arial" w:eastAsia="Microsoft YaHei"/>
-                <w:sz w:val="16"/>
+                <w:sz w:val="17"/>
               </w:rPr>
               <w:t>Button: 'Register'</w:t>
             </w:r>
@@ -5557,7 +5557,7 @@
             <w:r>
               <w:rPr>
                 <w:rFonts w:ascii="Arial" w:hAnsi="Arial" w:cs="Arial" w:eastAsia="Microsoft YaHei"/>
-                <w:sz w:val="16"/>
+                <w:sz w:val="17"/>
               </w:rPr>
               <w:t>None. The weather icon is a character (emoji) mapped from the Open-Meteo numeric code by our own API, not an image file.</w:t>
             </w:r>
@@ -5574,7 +5574,7 @@
         <w:rPr>
           <w:rFonts w:ascii="Arial" w:hAnsi="Arial" w:cs="Arial" w:eastAsia="Microsoft YaHei"/>
           <w:b/>
-          <w:sz w:val="22"/>
+          <w:sz w:val="24"/>
         </w:rPr>
         <w:t>NOTES</w:t>
       </w:r>
@@ -5623,7 +5623,7 @@
             <w:r>
               <w:rPr>
                 <w:rFonts w:ascii="Arial" w:hAnsi="Arial" w:cs="Arial" w:eastAsia="Microsoft YaHei"/>
-                <w:sz w:val="16"/>
+                <w:sz w:val="17"/>
               </w:rPr>
               <w:t>Social proof sits next to the price because it is the strongest reason to book; the weather is a separate request so a slow forecast never delays the page.</w:t>
             </w:r>
@@ -5665,7 +5665,7 @@
               <w:rPr>
                 <w:rFonts w:ascii="Arial" w:hAnsi="Arial" w:cs="Arial" w:eastAsia="Microsoft YaHei"/>
                 <w:b/>
-                <w:sz w:val="16"/>
+                <w:sz w:val="17"/>
               </w:rPr>
               <w:t>Description:</w:t>
             </w:r>
@@ -5684,7 +5684,7 @@
               <w:rPr>
                 <w:rFonts w:ascii="Arial" w:hAnsi="Arial" w:cs="Arial" w:eastAsia="Microsoft YaHei"/>
                 <w:b w:val="0"/>
-                <w:sz w:val="16"/>
+                <w:sz w:val="17"/>
               </w:rPr>
               <w:t>Everything about one event, and the door to booking it. This is the page a visitor decides on, so it carries the practical details, the social proof and the weather in one view.</w:t>
             </w:r>
@@ -5706,7 +5706,7 @@
               <w:rPr>
                 <w:rFonts w:ascii="Arial" w:hAnsi="Arial" w:cs="Arial" w:eastAsia="Microsoft YaHei"/>
                 <w:b/>
-                <w:sz w:val="16"/>
+                <w:sz w:val="17"/>
               </w:rPr>
               <w:t>Content:</w:t>
             </w:r>
@@ -5725,7 +5725,7 @@
               <w:rPr>
                 <w:rFonts w:ascii="Arial" w:hAnsi="Arial" w:cs="Arial" w:eastAsia="Microsoft YaHei"/>
                 <w:b w:val="0"/>
-                <w:sz w:val="16"/>
+                <w:sz w:val="17"/>
               </w:rPr>
               <w:t>Breadcrumb (All events &gt; category) and a back link.</w:t>
               <w:br/>
@@ -5755,7 +5755,7 @@
               <w:rPr>
                 <w:rFonts w:ascii="Arial" w:hAnsi="Arial" w:cs="Arial" w:eastAsia="Microsoft YaHei"/>
                 <w:b/>
-                <w:sz w:val="16"/>
+                <w:sz w:val="17"/>
               </w:rPr>
               <w:t>Interactions:</w:t>
             </w:r>
@@ -5774,7 +5774,7 @@
               <w:rPr>
                 <w:rFonts w:ascii="Arial" w:hAnsi="Arial" w:cs="Arial" w:eastAsia="Microsoft YaHei"/>
                 <w:b w:val="0"/>
-                <w:sz w:val="16"/>
+                <w:sz w:val="17"/>
               </w:rPr>
               <w:t>One call to GET /api/events/:id returns the event and its registrations together, so the page is never half-loaded and the list can never disagree with the event.</w:t>
               <w:br/>
@@ -5800,7 +5800,7 @@
               <w:rPr>
                 <w:rFonts w:ascii="Arial" w:hAnsi="Arial" w:cs="Arial" w:eastAsia="Microsoft YaHei"/>
                 <w:b/>
-                <w:sz w:val="16"/>
+                <w:sz w:val="17"/>
               </w:rPr>
               <w:t>Media Creation:</w:t>
             </w:r>
@@ -5819,7 +5819,7 @@
               <w:rPr>
                 <w:rFonts w:ascii="Arial" w:hAnsi="Arial" w:cs="Arial" w:eastAsia="Microsoft YaHei"/>
                 <w:b w:val="0"/>
-                <w:sz w:val="16"/>
+                <w:sz w:val="17"/>
               </w:rPr>
               <w:t>The weather panel is fed by our own API, which calls Open-Meteo with the event's latitude and longitude and maps the numeric weather codes to words and an icon. If the upstream service is down the panel says there is no forecast rather than showing an empty box.</w:t>
             </w:r>
@@ -5841,7 +5841,7 @@
               <w:rPr>
                 <w:rFonts w:ascii="Arial" w:hAnsi="Arial" w:cs="Arial" w:eastAsia="Microsoft YaHei"/>
                 <w:b/>
-                <w:sz w:val="16"/>
+                <w:sz w:val="17"/>
               </w:rPr>
               <w:t>Navigation:</w:t>
             </w:r>
@@ -5860,7 +5860,7 @@
               <w:rPr>
                 <w:rFonts w:ascii="Arial" w:hAnsi="Arial" w:cs="Arial" w:eastAsia="Microsoft YaHei"/>
                 <w:b w:val="0"/>
-                <w:sz w:val="16"/>
+                <w:sz w:val="17"/>
               </w:rPr>
               <w:t>In: a card on the home or search page.</w:t>
               <w:br/>
@@ -5905,14 +5905,14 @@
         <w:rPr>
           <w:rFonts w:ascii="Arial" w:hAnsi="Arial" w:cs="Arial" w:eastAsia="Microsoft YaHei"/>
           <w:b/>
-          <w:sz w:val="21"/>
+          <w:sz w:val="22"/>
         </w:rPr>
         <w:t xml:space="preserve">TITLE: </w:t>
       </w:r>
       <w:r>
         <w:rPr>
           <w:rFonts w:ascii="Arial" w:hAnsi="Arial" w:cs="Arial" w:eastAsia="Microsoft YaHei"/>
-          <w:sz w:val="21"/>
+          <w:sz w:val="22"/>
         </w:rPr>
         <w:t xml:space="preserve">Register - book a place    </w:t>
       </w:r>
@@ -5920,14 +5920,14 @@
         <w:rPr>
           <w:rFonts w:ascii="Arial" w:hAnsi="Arial" w:cs="Arial" w:eastAsia="Microsoft YaHei"/>
           <w:b/>
-          <w:sz w:val="21"/>
+          <w:sz w:val="22"/>
         </w:rPr>
         <w:t xml:space="preserve">SCREEN ID: </w:t>
       </w:r>
       <w:r>
         <w:rPr>
           <w:rFonts w:ascii="Arial" w:hAnsi="Arial" w:cs="Arial" w:eastAsia="Microsoft YaHei"/>
-          <w:sz w:val="21"/>
+          <w:sz w:val="22"/>
         </w:rPr>
         <w:t xml:space="preserve">S4    </w:t>
       </w:r>
@@ -5935,14 +5935,14 @@
         <w:rPr>
           <w:rFonts w:ascii="Arial" w:hAnsi="Arial" w:cs="Arial" w:eastAsia="Microsoft YaHei"/>
           <w:b/>
-          <w:sz w:val="21"/>
+          <w:sz w:val="22"/>
         </w:rPr>
         <w:t xml:space="preserve">DATE: </w:t>
       </w:r>
       <w:r>
         <w:rPr>
           <w:rFonts w:ascii="Arial" w:hAnsi="Arial" w:cs="Arial" w:eastAsia="Microsoft YaHei"/>
-          <w:sz w:val="21"/>
+          <w:sz w:val="22"/>
         </w:rPr>
         <w:t>18 October 2026</w:t>
       </w:r>
@@ -5956,7 +5956,7 @@
         <w:rPr>
           <w:rFonts w:ascii="Arial" w:hAnsi="Arial" w:cs="Arial" w:eastAsia="Microsoft YaHei"/>
           <w:b/>
-          <w:sz w:val="22"/>
+          <w:sz w:val="24"/>
         </w:rPr>
         <w:t>Elements:</w:t>
       </w:r>
@@ -6006,7 +6006,7 @@
             <w:r>
               <w:drawing>
                 <wp:inline xmlns:a="http://schemas.openxmlformats.org/drawingml/2006/main" xmlns:pic="http://schemas.openxmlformats.org/drawingml/2006/picture">
-                  <wp:extent cx="2592000" cy="2531250"/>
+                  <wp:extent cx="2448000" cy="2390625"/>
                   <wp:docPr id="4" name="Picture 4"/>
                   <wp:cNvGraphicFramePr>
                     <a:graphicFrameLocks noChangeAspect="1"/>
@@ -6027,7 +6027,7 @@
                         <pic:spPr>
                           <a:xfrm>
                             <a:off x="0" y="0"/>
-                            <a:ext cx="2592000" cy="2531250"/>
+                            <a:ext cx="2448000" cy="2390625"/>
                           </a:xfrm>
                           <a:prstGeom prst="rect"/>
                         </pic:spPr>
@@ -6045,7 +6045,7 @@
             <w:r>
               <w:rPr>
                 <w:rFonts w:ascii="Arial" w:hAnsi="Arial" w:cs="Arial" w:eastAsia="Microsoft YaHei"/>
-                <w:sz w:val="16"/>
+                <w:sz w:val="17"/>
               </w:rPr>
               <w:t>Live screenshot of the deployed page (https://24831941.it.scu.edu.au), taken with headless Chrome. The layout is the design; every value on it comes from the API.</w:t>
             </w:r>
@@ -6097,7 +6097,7 @@
             <w:r>
               <w:rPr>
                 <w:rFonts w:ascii="Arial" w:hAnsi="Arial" w:cs="Arial" w:eastAsia="Microsoft YaHei"/>
-                <w:sz w:val="16"/>
+                <w:sz w:val="17"/>
               </w:rPr>
               <w:t>Title: 'Register for an event'; left panel shows the event name, date, time, venue and price per ticket</w:t>
             </w:r>
@@ -6109,7 +6109,7 @@
             <w:r>
               <w:rPr>
                 <w:rFonts w:ascii="Arial" w:hAnsi="Arial" w:cs="Arial" w:eastAsia="Microsoft YaHei"/>
-                <w:sz w:val="16"/>
+                <w:sz w:val="17"/>
               </w:rPr>
               <w:t>Form heading 'Your details'; labels: First name / Last name / Email / Contact phone / Number of tickets / Date of registration / Notes (optional)</w:t>
             </w:r>
@@ -6121,7 +6121,7 @@
             <w:r>
               <w:rPr>
                 <w:rFonts w:ascii="Arial" w:hAnsi="Arial" w:cs="Arial" w:eastAsia="Microsoft YaHei"/>
-                <w:sz w:val="16"/>
+                <w:sz w:val="17"/>
               </w:rPr>
               <w:t>Live 'Total: $X'; button 'Complete registration'</w:t>
             </w:r>
@@ -6133,7 +6133,7 @@
             <w:r>
               <w:rPr>
                 <w:rFonts w:ascii="Arial" w:hAnsi="Arial" w:cs="Arial" w:eastAsia="Microsoft YaHei"/>
-                <w:sz w:val="16"/>
+                <w:sz w:val="17"/>
               </w:rPr>
               <w:t>On success the form is replaced by 'You are registered' plus the booking details and a back link</w:t>
             </w:r>
@@ -6185,7 +6185,7 @@
             <w:r>
               <w:rPr>
                 <w:rFonts w:ascii="Arial" w:hAnsi="Arial" w:cs="Arial" w:eastAsia="Microsoft YaHei"/>
-                <w:sz w:val="16"/>
+                <w:sz w:val="17"/>
               </w:rPr>
               <w:t>None - the page is form and data only. The total is computed live from tickets x price.</w:t>
             </w:r>
@@ -6202,7 +6202,7 @@
         <w:rPr>
           <w:rFonts w:ascii="Arial" w:hAnsi="Arial" w:cs="Arial" w:eastAsia="Microsoft YaHei"/>
           <w:b/>
-          <w:sz w:val="22"/>
+          <w:sz w:val="24"/>
         </w:rPr>
         <w:t>NOTES</w:t>
       </w:r>
@@ -6251,7 +6251,7 @@
             <w:r>
               <w:rPr>
                 <w:rFonts w:ascii="Arial" w:hAnsi="Arial" w:cs="Arial" w:eastAsia="Microsoft YaHei"/>
-                <w:sz w:val="16"/>
+                <w:sz w:val="17"/>
               </w:rPr>
               <w:t>Two columns: what you are booking on the left, who you are on the right - reasons before demands. Each field carries its own message instead of one generic alert, and a 409 shows the API's sentence verbatim.</w:t>
             </w:r>
@@ -6293,7 +6293,7 @@
               <w:rPr>
                 <w:rFonts w:ascii="Arial" w:hAnsi="Arial" w:cs="Arial" w:eastAsia="Microsoft YaHei"/>
                 <w:b/>
-                <w:sz w:val="16"/>
+                <w:sz w:val="17"/>
               </w:rPr>
               <w:t>Description:</w:t>
             </w:r>
@@ -6312,7 +6312,7 @@
               <w:rPr>
                 <w:rFonts w:ascii="Arial" w:hAnsi="Arial" w:cs="Arial" w:eastAsia="Microsoft YaHei"/>
                 <w:b w:val="0"/>
-                <w:sz w:val="16"/>
+                <w:sz w:val="17"/>
               </w:rPr>
               <w:t>The one page where we ask the visitor for something. New in A3; the brief requires the form, the event context, validation and a confirmation.</w:t>
             </w:r>
@@ -6334,7 +6334,7 @@
               <w:rPr>
                 <w:rFonts w:ascii="Arial" w:hAnsi="Arial" w:cs="Arial" w:eastAsia="Microsoft YaHei"/>
                 <w:b/>
-                <w:sz w:val="16"/>
+                <w:sz w:val="17"/>
               </w:rPr>
               <w:t>Content:</w:t>
             </w:r>
@@ -6353,7 +6353,7 @@
               <w:rPr>
                 <w:rFonts w:ascii="Arial" w:hAnsi="Arial" w:cs="Arial" w:eastAsia="Microsoft YaHei"/>
                 <w:b w:val="0"/>
-                <w:sz w:val="16"/>
+                <w:sz w:val="17"/>
               </w:rPr>
               <w:t>Left panel: the event being booked - name, date, time, venue, price per ticket and the charity - fetched from the API so the visitor can see what they are booking without going back.</w:t>
               <w:br/>
@@ -6381,7 +6381,7 @@
               <w:rPr>
                 <w:rFonts w:ascii="Arial" w:hAnsi="Arial" w:cs="Arial" w:eastAsia="Microsoft YaHei"/>
                 <w:b/>
-                <w:sz w:val="16"/>
+                <w:sz w:val="17"/>
               </w:rPr>
               <w:t>Interactions:</w:t>
             </w:r>
@@ -6400,7 +6400,7 @@
               <w:rPr>
                 <w:rFonts w:ascii="Arial" w:hAnsi="Arial" w:cs="Arial" w:eastAsia="Microsoft YaHei"/>
                 <w:b w:val="0"/>
-                <w:sz w:val="16"/>
+                <w:sz w:val="17"/>
               </w:rPr>
               <w:t>Every field validates as the visitor types and again on submit, each with its own message under the field - no generic alert.</w:t>
               <w:br/>
@@ -6426,7 +6426,7 @@
               <w:rPr>
                 <w:rFonts w:ascii="Arial" w:hAnsi="Arial" w:cs="Arial" w:eastAsia="Microsoft YaHei"/>
                 <w:b/>
-                <w:sz w:val="16"/>
+                <w:sz w:val="17"/>
               </w:rPr>
               <w:t>Media Creation:</w:t>
             </w:r>
@@ -6445,7 +6445,7 @@
               <w:rPr>
                 <w:rFonts w:ascii="Arial" w:hAnsi="Arial" w:cs="Arial" w:eastAsia="Microsoft YaHei"/>
                 <w:b w:val="0"/>
-                <w:sz w:val="16"/>
+                <w:sz w:val="17"/>
               </w:rPr>
               <w:t>None - this page is pure data and form. The total is computed in the component from tickets x the event's price, never stored.</w:t>
             </w:r>
@@ -6467,7 +6467,7 @@
               <w:rPr>
                 <w:rFonts w:ascii="Arial" w:hAnsi="Arial" w:cs="Arial" w:eastAsia="Microsoft YaHei"/>
                 <w:b/>
-                <w:sz w:val="16"/>
+                <w:sz w:val="17"/>
               </w:rPr>
               <w:t>Navigation:</w:t>
             </w:r>
@@ -6486,7 +6486,7 @@
               <w:rPr>
                 <w:rFonts w:ascii="Arial" w:hAnsi="Arial" w:cs="Arial" w:eastAsia="Microsoft YaHei"/>
                 <w:b w:val="0"/>
-                <w:sz w:val="16"/>
+                <w:sz w:val="17"/>
               </w:rPr>
               <w:t>In: the Register button on the event detail page, carrying eventId in the query string.</w:t>
               <w:br/>
@@ -6531,14 +6531,14 @@
         <w:rPr>
           <w:rFonts w:ascii="Arial" w:hAnsi="Arial" w:cs="Arial" w:eastAsia="Microsoft YaHei"/>
           <w:b/>
-          <w:sz w:val="21"/>
+          <w:sz w:val="22"/>
         </w:rPr>
         <w:t xml:space="preserve">TITLE: </w:t>
       </w:r>
       <w:r>
         <w:rPr>
           <w:rFonts w:ascii="Arial" w:hAnsi="Arial" w:cs="Arial" w:eastAsia="Microsoft YaHei"/>
-          <w:sz w:val="21"/>
+          <w:sz w:val="22"/>
         </w:rPr>
         <w:t xml:space="preserve">Staff - event list (admin site)    </w:t>
       </w:r>
@@ -6546,14 +6546,14 @@
         <w:rPr>
           <w:rFonts w:ascii="Arial" w:hAnsi="Arial" w:cs="Arial" w:eastAsia="Microsoft YaHei"/>
           <w:b/>
-          <w:sz w:val="21"/>
+          <w:sz w:val="22"/>
         </w:rPr>
         <w:t xml:space="preserve">SCREEN ID: </w:t>
       </w:r>
       <w:r>
         <w:rPr>
           <w:rFonts w:ascii="Arial" w:hAnsi="Arial" w:cs="Arial" w:eastAsia="Microsoft YaHei"/>
-          <w:sz w:val="21"/>
+          <w:sz w:val="22"/>
         </w:rPr>
         <w:t xml:space="preserve">S5    </w:t>
       </w:r>
@@ -6561,14 +6561,14 @@
         <w:rPr>
           <w:rFonts w:ascii="Arial" w:hAnsi="Arial" w:cs="Arial" w:eastAsia="Microsoft YaHei"/>
           <w:b/>
-          <w:sz w:val="21"/>
+          <w:sz w:val="22"/>
         </w:rPr>
         <w:t xml:space="preserve">DATE: </w:t>
       </w:r>
       <w:r>
         <w:rPr>
           <w:rFonts w:ascii="Arial" w:hAnsi="Arial" w:cs="Arial" w:eastAsia="Microsoft YaHei"/>
-          <w:sz w:val="21"/>
+          <w:sz w:val="22"/>
         </w:rPr>
         <w:t>18 October 2026</w:t>
       </w:r>
@@ -6582,7 +6582,7 @@
         <w:rPr>
           <w:rFonts w:ascii="Arial" w:hAnsi="Arial" w:cs="Arial" w:eastAsia="Microsoft YaHei"/>
           <w:b/>
-          <w:sz w:val="22"/>
+          <w:sz w:val="24"/>
         </w:rPr>
         <w:t>Elements:</w:t>
       </w:r>
@@ -6632,7 +6632,7 @@
             <w:r>
               <w:drawing>
                 <wp:inline xmlns:a="http://schemas.openxmlformats.org/drawingml/2006/main" xmlns:pic="http://schemas.openxmlformats.org/drawingml/2006/picture">
-                  <wp:extent cx="2592000" cy="2531250"/>
+                  <wp:extent cx="2448000" cy="2390625"/>
                   <wp:docPr id="5" name="Picture 5"/>
                   <wp:cNvGraphicFramePr>
                     <a:graphicFrameLocks noChangeAspect="1"/>
@@ -6653,7 +6653,7 @@
                         <pic:spPr>
                           <a:xfrm>
                             <a:off x="0" y="0"/>
-                            <a:ext cx="2592000" cy="2531250"/>
+                            <a:ext cx="2448000" cy="2390625"/>
                           </a:xfrm>
                           <a:prstGeom prst="rect"/>
                         </pic:spPr>
@@ -6671,7 +6671,7 @@
             <w:r>
               <w:rPr>
                 <w:rFonts w:ascii="Arial" w:hAnsi="Arial" w:cs="Arial" w:eastAsia="Microsoft YaHei"/>
-                <w:sz w:val="16"/>
+                <w:sz w:val="17"/>
               </w:rPr>
               <w:t>Live screenshot of the deployed page (https://24831941.it.scu.edu.au), taken with headless Chrome. The layout is the design; every value on it comes from the API.</w:t>
             </w:r>
@@ -6723,7 +6723,7 @@
             <w:r>
               <w:rPr>
                 <w:rFonts w:ascii="Arial" w:hAnsi="Arial" w:cs="Arial" w:eastAsia="Microsoft YaHei"/>
-                <w:sz w:val="16"/>
+                <w:sz w:val="17"/>
               </w:rPr>
               <w:t>Title: 'Events' and one sentence saying what the site can change</w:t>
             </w:r>
@@ -6735,7 +6735,7 @@
             <w:r>
               <w:rPr>
                 <w:rFonts w:ascii="Arial" w:hAnsi="Arial" w:cs="Arial" w:eastAsia="Microsoft YaHei"/>
-                <w:sz w:val="16"/>
+                <w:sz w:val="17"/>
               </w:rPr>
               <w:t>Button: '+ New event'</w:t>
             </w:r>
@@ -6747,7 +6747,7 @@
             <w:r>
               <w:rPr>
                 <w:rFonts w:ascii="Arial" w:hAnsi="Arial" w:cs="Arial" w:eastAsia="Microsoft YaHei"/>
-                <w:sz w:val="16"/>
+                <w:sz w:val="17"/>
               </w:rPr>
               <w:t>Filter chips with live counts: All 13 / Active 8 / Past 4 / Suspended 1</w:t>
             </w:r>
@@ -6759,7 +6759,7 @@
             <w:r>
               <w:rPr>
                 <w:rFonts w:ascii="Arial" w:hAnsi="Arial" w:cs="Arial" w:eastAsia="Microsoft YaHei"/>
-                <w:sz w:val="16"/>
+                <w:sz w:val="17"/>
               </w:rPr>
               <w:t>Column headings: ID / Event / Date / Location / Status / Ticket / Registrations / Actions</w:t>
             </w:r>
@@ -6771,7 +6771,7 @@
             <w:r>
               <w:rPr>
                 <w:rFonts w:ascii="Arial" w:hAnsi="Arial" w:cs="Arial" w:eastAsia="Microsoft YaHei"/>
-                <w:sz w:val="16"/>
+                <w:sz w:val="17"/>
               </w:rPr>
               <w:t>Row buttons: 'Edit' / 'Delete'</w:t>
             </w:r>
@@ -6823,7 +6823,7 @@
             <w:r>
               <w:rPr>
                 <w:rFonts w:ascii="Arial" w:hAnsi="Arial" w:cs="Arial" w:eastAsia="Microsoft YaHei"/>
-                <w:sz w:val="16"/>
+                <w:sz w:val="17"/>
               </w:rPr>
               <w:t>None. Status badges are coloured text, and the counts are rendered from the rows actually on screen.</w:t>
             </w:r>
@@ -6840,7 +6840,7 @@
         <w:rPr>
           <w:rFonts w:ascii="Arial" w:hAnsi="Arial" w:cs="Arial" w:eastAsia="Microsoft YaHei"/>
           <w:b/>
-          <w:sz w:val="22"/>
+          <w:sz w:val="24"/>
         </w:rPr>
         <w:t>NOTES</w:t>
       </w:r>
@@ -6889,7 +6889,7 @@
             <w:r>
               <w:rPr>
                 <w:rFonts w:ascii="Arial" w:hAnsi="Arial" w:cs="Arial" w:eastAsia="Microsoft YaHei"/>
-                <w:sz w:val="16"/>
+                <w:sz w:val="17"/>
               </w:rPr>
               <w:t>Counts live on the filter chips because 'how many suspended?' is the first question staff ask. A blocked delete reports the reason and the alternative (suspend it) rather than failing silently.</w:t>
             </w:r>
@@ -6931,7 +6931,7 @@
               <w:rPr>
                 <w:rFonts w:ascii="Arial" w:hAnsi="Arial" w:cs="Arial" w:eastAsia="Microsoft YaHei"/>
                 <w:b/>
-                <w:sz w:val="16"/>
+                <w:sz w:val="17"/>
               </w:rPr>
               <w:t>Description:</w:t>
             </w:r>
@@ -6950,7 +6950,7 @@
               <w:rPr>
                 <w:rFonts w:ascii="Arial" w:hAnsi="Arial" w:cs="Arial" w:eastAsia="Microsoft YaHei"/>
                 <w:b w:val="0"/>
-                <w:sz w:val="16"/>
+                <w:sz w:val="17"/>
               </w:rPr>
               <w:t>The staff home page, deployed under /admin/. Every event whatever its status, with the doors to the other two staff screens. Authentication is out of scope by design - the brief says so.</w:t>
             </w:r>
@@ -6972,7 +6972,7 @@
               <w:rPr>
                 <w:rFonts w:ascii="Arial" w:hAnsi="Arial" w:cs="Arial" w:eastAsia="Microsoft YaHei"/>
                 <w:b/>
-                <w:sz w:val="16"/>
+                <w:sz w:val="17"/>
               </w:rPr>
               <w:t>Content:</w:t>
             </w:r>
@@ -6991,7 +6991,7 @@
               <w:rPr>
                 <w:rFonts w:ascii="Arial" w:hAnsi="Arial" w:cs="Arial" w:eastAsia="Microsoft YaHei"/>
                 <w:b w:val="0"/>
-                <w:sz w:val="16"/>
+                <w:sz w:val="17"/>
               </w:rPr>
               <w:t>Title and a one-sentence explanation of what the site can change.</w:t>
               <w:br/>
@@ -7021,7 +7021,7 @@
               <w:rPr>
                 <w:rFonts w:ascii="Arial" w:hAnsi="Arial" w:cs="Arial" w:eastAsia="Microsoft YaHei"/>
                 <w:b/>
-                <w:sz w:val="16"/>
+                <w:sz w:val="17"/>
               </w:rPr>
               <w:t>Interactions:</w:t>
             </w:r>
@@ -7040,7 +7040,7 @@
               <w:rPr>
                 <w:rFonts w:ascii="Arial" w:hAnsi="Arial" w:cs="Arial" w:eastAsia="Microsoft YaHei"/>
                 <w:b w:val="0"/>
-                <w:sz w:val="16"/>
+                <w:sz w:val="17"/>
               </w:rPr>
               <w:t>The chips filter the rendered list; suspended wins over past, so a cancelled event stays visible with the reason it was cancelled.</w:t>
               <w:br/>
@@ -7066,7 +7066,7 @@
               <w:rPr>
                 <w:rFonts w:ascii="Arial" w:hAnsi="Arial" w:cs="Arial" w:eastAsia="Microsoft YaHei"/>
                 <w:b/>
-                <w:sz w:val="16"/>
+                <w:sz w:val="17"/>
               </w:rPr>
               <w:t>Media Creation:</w:t>
             </w:r>
@@ -7085,7 +7085,7 @@
               <w:rPr>
                 <w:rFonts w:ascii="Arial" w:hAnsi="Arial" w:cs="Arial" w:eastAsia="Microsoft YaHei"/>
                 <w:b w:val="0"/>
-                <w:sz w:val="16"/>
+                <w:sz w:val="17"/>
               </w:rPr>
               <w:t>Status badges are coloured per status (active, past, suspended). No images.</w:t>
             </w:r>
@@ -7107,7 +7107,7 @@
               <w:rPr>
                 <w:rFonts w:ascii="Arial" w:hAnsi="Arial" w:cs="Arial" w:eastAsia="Microsoft YaHei"/>
                 <w:b/>
-                <w:sz w:val="16"/>
+                <w:sz w:val="17"/>
               </w:rPr>
               <w:t>Navigation:</w:t>
             </w:r>
@@ -7126,7 +7126,7 @@
               <w:rPr>
                 <w:rFonts w:ascii="Arial" w:hAnsi="Arial" w:cs="Arial" w:eastAsia="Microsoft YaHei"/>
                 <w:b w:val="0"/>
-                <w:sz w:val="16"/>
+                <w:sz w:val="17"/>
               </w:rPr>
               <w:t>In: 'Staff admin' in the public menu, or All events in the staff menu.</w:t>
               <w:br/>
@@ -7171,14 +7171,14 @@
         <w:rPr>
           <w:rFonts w:ascii="Arial" w:hAnsi="Arial" w:cs="Arial" w:eastAsia="Microsoft YaHei"/>
           <w:b/>
-          <w:sz w:val="21"/>
+          <w:sz w:val="22"/>
         </w:rPr>
         <w:t xml:space="preserve">TITLE: </w:t>
       </w:r>
       <w:r>
         <w:rPr>
           <w:rFonts w:ascii="Arial" w:hAnsi="Arial" w:cs="Arial" w:eastAsia="Microsoft YaHei"/>
-          <w:sz w:val="21"/>
+          <w:sz w:val="22"/>
         </w:rPr>
         <w:t xml:space="preserve">Staff - new event    </w:t>
       </w:r>
@@ -7186,14 +7186,14 @@
         <w:rPr>
           <w:rFonts w:ascii="Arial" w:hAnsi="Arial" w:cs="Arial" w:eastAsia="Microsoft YaHei"/>
           <w:b/>
-          <w:sz w:val="21"/>
+          <w:sz w:val="22"/>
         </w:rPr>
         <w:t xml:space="preserve">SCREEN ID: </w:t>
       </w:r>
       <w:r>
         <w:rPr>
           <w:rFonts w:ascii="Arial" w:hAnsi="Arial" w:cs="Arial" w:eastAsia="Microsoft YaHei"/>
-          <w:sz w:val="21"/>
+          <w:sz w:val="22"/>
         </w:rPr>
         <w:t xml:space="preserve">S6    </w:t>
       </w:r>
@@ -7201,14 +7201,14 @@
         <w:rPr>
           <w:rFonts w:ascii="Arial" w:hAnsi="Arial" w:cs="Arial" w:eastAsia="Microsoft YaHei"/>
           <w:b/>
-          <w:sz w:val="21"/>
+          <w:sz w:val="22"/>
         </w:rPr>
         <w:t xml:space="preserve">DATE: </w:t>
       </w:r>
       <w:r>
         <w:rPr>
           <w:rFonts w:ascii="Arial" w:hAnsi="Arial" w:cs="Arial" w:eastAsia="Microsoft YaHei"/>
-          <w:sz w:val="21"/>
+          <w:sz w:val="22"/>
         </w:rPr>
         <w:t>18 October 2026</w:t>
       </w:r>
@@ -7222,7 +7222,7 @@
         <w:rPr>
           <w:rFonts w:ascii="Arial" w:hAnsi="Arial" w:cs="Arial" w:eastAsia="Microsoft YaHei"/>
           <w:b/>
-          <w:sz w:val="22"/>
+          <w:sz w:val="24"/>
         </w:rPr>
         <w:t>Elements:</w:t>
       </w:r>
@@ -7272,7 +7272,7 @@
             <w:r>
               <w:drawing>
                 <wp:inline xmlns:a="http://schemas.openxmlformats.org/drawingml/2006/main" xmlns:pic="http://schemas.openxmlformats.org/drawingml/2006/picture">
-                  <wp:extent cx="2592000" cy="2531250"/>
+                  <wp:extent cx="2448000" cy="2390625"/>
                   <wp:docPr id="6" name="Picture 6"/>
                   <wp:cNvGraphicFramePr>
                     <a:graphicFrameLocks noChangeAspect="1"/>
@@ -7293,7 +7293,7 @@
                         <pic:spPr>
                           <a:xfrm>
                             <a:off x="0" y="0"/>
-                            <a:ext cx="2592000" cy="2531250"/>
+                            <a:ext cx="2448000" cy="2390625"/>
                           </a:xfrm>
                           <a:prstGeom prst="rect"/>
                         </pic:spPr>
@@ -7311,7 +7311,7 @@
             <w:r>
               <w:rPr>
                 <w:rFonts w:ascii="Arial" w:hAnsi="Arial" w:cs="Arial" w:eastAsia="Microsoft YaHei"/>
-                <w:sz w:val="16"/>
+                <w:sz w:val="17"/>
               </w:rPr>
               <w:t>Live screenshot of the deployed page (https://24831941.it.scu.edu.au), taken with headless Chrome. The layout is the design; every value on it comes from the API.</w:t>
             </w:r>
@@ -7363,7 +7363,7 @@
             <w:r>
               <w:rPr>
                 <w:rFonts w:ascii="Arial" w:hAnsi="Arial" w:cs="Arial" w:eastAsia="Microsoft YaHei"/>
-                <w:sz w:val="16"/>
+                <w:sz w:val="17"/>
               </w:rPr>
               <w:t>Title: 'New event'</w:t>
             </w:r>
@@ -7375,7 +7375,7 @@
             <w:r>
               <w:rPr>
                 <w:rFonts w:ascii="Arial" w:hAnsi="Arial" w:cs="Arial" w:eastAsia="Microsoft YaHei"/>
-                <w:sz w:val="16"/>
+                <w:sz w:val="17"/>
               </w:rPr>
               <w:t>Required fields marked '*': name, description, organisation, category, status, date, start time, venue, city</w:t>
             </w:r>
@@ -7387,7 +7387,7 @@
             <w:r>
               <w:rPr>
                 <w:rFonts w:ascii="Arial" w:hAnsi="Arial" w:cs="Arial" w:eastAsia="Microsoft YaHei"/>
-                <w:sz w:val="16"/>
+                <w:sz w:val="17"/>
               </w:rPr>
               <w:t>Optional: summary, end time, suburb, ticket price, goal, raised so far, latitude / longitude ('Used by the Open-Meteo forecast on the event page. Leave blank if unknown.')</w:t>
             </w:r>
@@ -7399,7 +7399,7 @@
             <w:r>
               <w:rPr>
                 <w:rFonts w:ascii="Arial" w:hAnsi="Arial" w:cs="Arial" w:eastAsia="Microsoft YaHei"/>
-                <w:sz w:val="16"/>
+                <w:sz w:val="17"/>
               </w:rPr>
               <w:t>Buttons: 'Save changes' / 'Cancel'</w:t>
             </w:r>
@@ -7451,7 +7451,7 @@
             <w:r>
               <w:rPr>
                 <w:rFonts w:ascii="Arial" w:hAnsi="Arial" w:cs="Arial" w:eastAsia="Microsoft YaHei"/>
-                <w:sz w:val="16"/>
+                <w:sz w:val="17"/>
               </w:rPr>
               <w:t>None. The two selects are filled from GET /api/organisations and GET /api/categories, the same lists the public site shows.</w:t>
             </w:r>
@@ -7468,7 +7468,7 @@
         <w:rPr>
           <w:rFonts w:ascii="Arial" w:hAnsi="Arial" w:cs="Arial" w:eastAsia="Microsoft YaHei"/>
           <w:b/>
-          <w:sz w:val="22"/>
+          <w:sz w:val="24"/>
         </w:rPr>
         <w:t>NOTES</w:t>
       </w:r>
@@ -7517,7 +7517,7 @@
             <w:r>
               <w:rPr>
                 <w:rFonts w:ascii="Arial" w:hAnsi="Arial" w:cs="Arial" w:eastAsia="Microsoft YaHei"/>
-                <w:sz w:val="16"/>
+                <w:sz w:val="17"/>
               </w:rPr>
               <w:t>Create and edit share one form component so the two field sets cannot drift apart; the coordinates are grouped separately and labelled with what they are for.</w:t>
             </w:r>
@@ -7559,7 +7559,7 @@
               <w:rPr>
                 <w:rFonts w:ascii="Arial" w:hAnsi="Arial" w:cs="Arial" w:eastAsia="Microsoft YaHei"/>
                 <w:b/>
-                <w:sz w:val="16"/>
+                <w:sz w:val="17"/>
               </w:rPr>
               <w:t>Description:</w:t>
             </w:r>
@@ -7578,7 +7578,7 @@
               <w:rPr>
                 <w:rFonts w:ascii="Arial" w:hAnsi="Arial" w:cs="Arial" w:eastAsia="Microsoft YaHei"/>
                 <w:b w:val="0"/>
-                <w:sz w:val="16"/>
+                <w:sz w:val="17"/>
               </w:rPr>
               <w:t>Create an event. The same form component the edit screen uses, empty - which is why the two screens cannot drift apart.</w:t>
             </w:r>
@@ -7600,7 +7600,7 @@
               <w:rPr>
                 <w:rFonts w:ascii="Arial" w:hAnsi="Arial" w:cs="Arial" w:eastAsia="Microsoft YaHei"/>
                 <w:b/>
-                <w:sz w:val="16"/>
+                <w:sz w:val="17"/>
               </w:rPr>
               <w:t>Content:</w:t>
             </w:r>
@@ -7619,7 +7619,7 @@
               <w:rPr>
                 <w:rFonts w:ascii="Arial" w:hAnsi="Arial" w:cs="Arial" w:eastAsia="Microsoft YaHei"/>
                 <w:b w:val="0"/>
-                <w:sz w:val="16"/>
+                <w:sz w:val="17"/>
               </w:rPr>
               <w:t>Required fields: event name, description, organisation, category, status, date, start time, venue and city.</w:t>
               <w:br/>
@@ -7645,7 +7645,7 @@
               <w:rPr>
                 <w:rFonts w:ascii="Arial" w:hAnsi="Arial" w:cs="Arial" w:eastAsia="Microsoft YaHei"/>
                 <w:b/>
-                <w:sz w:val="16"/>
+                <w:sz w:val="17"/>
               </w:rPr>
               <w:t>Interactions:</w:t>
             </w:r>
@@ -7664,7 +7664,7 @@
               <w:rPr>
                 <w:rFonts w:ascii="Arial" w:hAnsi="Arial" w:cs="Arial" w:eastAsia="Microsoft YaHei"/>
                 <w:b w:val="0"/>
-                <w:sz w:val="16"/>
+                <w:sz w:val="17"/>
               </w:rPr>
               <w:t>The form is a Reactive Form: the Save button stays disabled until every required field is valid, and each field shows its own message.</w:t>
               <w:br/>
@@ -7692,7 +7692,7 @@
               <w:rPr>
                 <w:rFonts w:ascii="Arial" w:hAnsi="Arial" w:cs="Arial" w:eastAsia="Microsoft YaHei"/>
                 <w:b/>
-                <w:sz w:val="16"/>
+                <w:sz w:val="17"/>
               </w:rPr>
               <w:t>Media Creation:</w:t>
             </w:r>
@@ -7711,7 +7711,7 @@
               <w:rPr>
                 <w:rFonts w:ascii="Arial" w:hAnsi="Arial" w:cs="Arial" w:eastAsia="Microsoft YaHei"/>
                 <w:b w:val="0"/>
-                <w:sz w:val="16"/>
+                <w:sz w:val="17"/>
               </w:rPr>
               <w:t>None. The coordinates are plain number inputs, and leaving them blank simply means the public page shows no forecast for that event.</w:t>
             </w:r>
@@ -7733,7 +7733,7 @@
               <w:rPr>
                 <w:rFonts w:ascii="Arial" w:hAnsi="Arial" w:cs="Arial" w:eastAsia="Microsoft YaHei"/>
                 <w:b/>
-                <w:sz w:val="16"/>
+                <w:sz w:val="17"/>
               </w:rPr>
               <w:t>Navigation:</w:t>
             </w:r>
@@ -7752,7 +7752,7 @@
               <w:rPr>
                 <w:rFonts w:ascii="Arial" w:hAnsi="Arial" w:cs="Arial" w:eastAsia="Microsoft YaHei"/>
                 <w:b w:val="0"/>
-                <w:sz w:val="16"/>
+                <w:sz w:val="17"/>
               </w:rPr>
               <w:t>In: '+ New event' on the staff list.</w:t>
               <w:br/>
@@ -7797,14 +7797,14 @@
         <w:rPr>
           <w:rFonts w:ascii="Arial" w:hAnsi="Arial" w:cs="Arial" w:eastAsia="Microsoft YaHei"/>
           <w:b/>
-          <w:sz w:val="21"/>
+          <w:sz w:val="22"/>
         </w:rPr>
         <w:t xml:space="preserve">TITLE: </w:t>
       </w:r>
       <w:r>
         <w:rPr>
           <w:rFonts w:ascii="Arial" w:hAnsi="Arial" w:cs="Arial" w:eastAsia="Microsoft YaHei"/>
-          <w:sz w:val="21"/>
+          <w:sz w:val="22"/>
         </w:rPr>
         <w:t xml:space="preserve">Staff - edit event    </w:t>
       </w:r>
@@ -7812,14 +7812,14 @@
         <w:rPr>
           <w:rFonts w:ascii="Arial" w:hAnsi="Arial" w:cs="Arial" w:eastAsia="Microsoft YaHei"/>
           <w:b/>
-          <w:sz w:val="21"/>
+          <w:sz w:val="22"/>
         </w:rPr>
         <w:t xml:space="preserve">SCREEN ID: </w:t>
       </w:r>
       <w:r>
         <w:rPr>
           <w:rFonts w:ascii="Arial" w:hAnsi="Arial" w:cs="Arial" w:eastAsia="Microsoft YaHei"/>
-          <w:sz w:val="21"/>
+          <w:sz w:val="22"/>
         </w:rPr>
         <w:t xml:space="preserve">S7    </w:t>
       </w:r>
@@ -7827,14 +7827,14 @@
         <w:rPr>
           <w:rFonts w:ascii="Arial" w:hAnsi="Arial" w:cs="Arial" w:eastAsia="Microsoft YaHei"/>
           <w:b/>
-          <w:sz w:val="21"/>
+          <w:sz w:val="22"/>
         </w:rPr>
         <w:t xml:space="preserve">DATE: </w:t>
       </w:r>
       <w:r>
         <w:rPr>
           <w:rFonts w:ascii="Arial" w:hAnsi="Arial" w:cs="Arial" w:eastAsia="Microsoft YaHei"/>
-          <w:sz w:val="21"/>
+          <w:sz w:val="22"/>
         </w:rPr>
         <w:t>18 October 2026</w:t>
       </w:r>
@@ -7848,7 +7848,7 @@
         <w:rPr>
           <w:rFonts w:ascii="Arial" w:hAnsi="Arial" w:cs="Arial" w:eastAsia="Microsoft YaHei"/>
           <w:b/>
-          <w:sz w:val="22"/>
+          <w:sz w:val="24"/>
         </w:rPr>
         <w:t>Elements:</w:t>
       </w:r>
@@ -7898,7 +7898,7 @@
             <w:r>
               <w:drawing>
                 <wp:inline xmlns:a="http://schemas.openxmlformats.org/drawingml/2006/main" xmlns:pic="http://schemas.openxmlformats.org/drawingml/2006/picture">
-                  <wp:extent cx="2592000" cy="2531250"/>
+                  <wp:extent cx="2448000" cy="2390625"/>
                   <wp:docPr id="7" name="Picture 7"/>
                   <wp:cNvGraphicFramePr>
                     <a:graphicFrameLocks noChangeAspect="1"/>
@@ -7919,7 +7919,7 @@
                         <pic:spPr>
                           <a:xfrm>
                             <a:off x="0" y="0"/>
-                            <a:ext cx="2592000" cy="2531250"/>
+                            <a:ext cx="2448000" cy="2390625"/>
                           </a:xfrm>
                           <a:prstGeom prst="rect"/>
                         </pic:spPr>
@@ -7937,7 +7937,7 @@
             <w:r>
               <w:rPr>
                 <w:rFonts w:ascii="Arial" w:hAnsi="Arial" w:cs="Arial" w:eastAsia="Microsoft YaHei"/>
-                <w:sz w:val="16"/>
+                <w:sz w:val="17"/>
               </w:rPr>
               <w:t>Live screenshot of the deployed page (https://24831941.it.scu.edu.au), taken with headless Chrome. The layout is the design; every value on it comes from the API.</w:t>
             </w:r>
@@ -7989,7 +7989,7 @@
             <w:r>
               <w:rPr>
                 <w:rFonts w:ascii="Arial" w:hAnsi="Arial" w:cs="Arial" w:eastAsia="Microsoft YaHei"/>
-                <w:sz w:val="16"/>
+                <w:sz w:val="17"/>
               </w:rPr>
               <w:t>Same form as S6, pre-filled (screenshot: the Twilight 10K)</w:t>
             </w:r>
@@ -8001,7 +8001,7 @@
             <w:r>
               <w:rPr>
                 <w:rFonts w:ascii="Arial" w:hAnsi="Arial" w:cs="Arial" w:eastAsia="Microsoft YaHei"/>
-                <w:sz w:val="16"/>
+                <w:sz w:val="17"/>
               </w:rPr>
               <w:t>Section 'Registrations for this event': booking count, total tickets, then each booking with name, email, phone, tickets and date</w:t>
             </w:r>
@@ -8013,7 +8013,7 @@
             <w:r>
               <w:rPr>
                 <w:rFonts w:ascii="Arial" w:hAnsi="Arial" w:cs="Arial" w:eastAsia="Microsoft YaHei"/>
-                <w:sz w:val="16"/>
+                <w:sz w:val="17"/>
               </w:rPr>
               <w:t>The delete rule in the staff member's own screen: 'Because registrations exist, this event cannot be deleted - suspend it instead.'</w:t>
             </w:r>
@@ -8065,7 +8065,7 @@
             <w:r>
               <w:rPr>
                 <w:rFonts w:ascii="Arial" w:hAnsi="Arial" w:cs="Arial" w:eastAsia="Microsoft YaHei"/>
-                <w:sz w:val="16"/>
+                <w:sz w:val="17"/>
               </w:rPr>
               <w:t>None beyond the data itself - the registration list is part of the same API response as the event.</w:t>
             </w:r>
@@ -8082,7 +8082,7 @@
         <w:rPr>
           <w:rFonts w:ascii="Arial" w:hAnsi="Arial" w:cs="Arial" w:eastAsia="Microsoft YaHei"/>
           <w:b/>
-          <w:sz w:val="22"/>
+          <w:sz w:val="24"/>
         </w:rPr>
         <w:t>NOTES</w:t>
       </w:r>
@@ -8131,7 +8131,7 @@
             <w:r>
               <w:rPr>
                 <w:rFonts w:ascii="Arial" w:hAnsi="Arial" w:cs="Arial" w:eastAsia="Microsoft YaHei"/>
-                <w:sz w:val="16"/>
+                <w:sz w:val="17"/>
               </w:rPr>
               <w:t>Form and registrations on one screen: the staff member sees who a change affects while making it.</w:t>
             </w:r>
@@ -8173,7 +8173,7 @@
               <w:rPr>
                 <w:rFonts w:ascii="Arial" w:hAnsi="Arial" w:cs="Arial" w:eastAsia="Microsoft YaHei"/>
                 <w:b/>
-                <w:sz w:val="16"/>
+                <w:sz w:val="17"/>
               </w:rPr>
               <w:t>Description:</w:t>
             </w:r>
@@ -8192,7 +8192,7 @@
               <w:rPr>
                 <w:rFonts w:ascii="Arial" w:hAnsi="Arial" w:cs="Arial" w:eastAsia="Microsoft YaHei"/>
                 <w:b w:val="0"/>
-                <w:sz w:val="16"/>
+                <w:sz w:val="17"/>
               </w:rPr>
               <w:t>Change an event, and see who has booked it - the two things a staff member needs on one screen, which is why the registrations sit under the form rather than on a page of their own.</w:t>
             </w:r>
@@ -8214,7 +8214,7 @@
               <w:rPr>
                 <w:rFonts w:ascii="Arial" w:hAnsi="Arial" w:cs="Arial" w:eastAsia="Microsoft YaHei"/>
                 <w:b/>
-                <w:sz w:val="16"/>
+                <w:sz w:val="17"/>
               </w:rPr>
               <w:t>Content:</w:t>
             </w:r>
@@ -8233,7 +8233,7 @@
               <w:rPr>
                 <w:rFonts w:ascii="Arial" w:hAnsi="Arial" w:cs="Arial" w:eastAsia="Microsoft YaHei"/>
                 <w:b w:val="0"/>
-                <w:sz w:val="16"/>
+                <w:sz w:val="17"/>
               </w:rPr>
               <w:t>The same form as S6, pre-filled from GET /api/events/:id (in the screenshot, the Twilight 10K: name, summary, description, organisation, category, status, date and times, venue, city, prices, and the stored coordinates).</w:t>
               <w:br/>
@@ -8259,7 +8259,7 @@
               <w:rPr>
                 <w:rFonts w:ascii="Arial" w:hAnsi="Arial" w:cs="Arial" w:eastAsia="Microsoft YaHei"/>
                 <w:b/>
-                <w:sz w:val="16"/>
+                <w:sz w:val="17"/>
               </w:rPr>
               <w:t>Interactions:</w:t>
             </w:r>
@@ -8278,7 +8278,7 @@
               <w:rPr>
                 <w:rFonts w:ascii="Arial" w:hAnsi="Arial" w:cs="Arial" w:eastAsia="Microsoft YaHei"/>
                 <w:b w:val="0"/>
-                <w:sz w:val="16"/>
+                <w:sz w:val="17"/>
               </w:rPr>
               <w:t>Save calls PUT /api/events/:id with the whole form (PUT rather than PATCH because the screen always submits every field).</w:t>
               <w:br/>
@@ -8304,7 +8304,7 @@
               <w:rPr>
                 <w:rFonts w:ascii="Arial" w:hAnsi="Arial" w:cs="Arial" w:eastAsia="Microsoft YaHei"/>
                 <w:b/>
-                <w:sz w:val="16"/>
+                <w:sz w:val="17"/>
               </w:rPr>
               <w:t>Media Creation:</w:t>
             </w:r>
@@ -8323,7 +8323,7 @@
               <w:rPr>
                 <w:rFonts w:ascii="Arial" w:hAnsi="Arial" w:cs="Arial" w:eastAsia="Microsoft YaHei"/>
                 <w:b w:val="0"/>
-                <w:sz w:val="16"/>
+                <w:sz w:val="17"/>
               </w:rPr>
               <w:t>None beyond the data itself.</w:t>
             </w:r>
@@ -8345,7 +8345,7 @@
               <w:rPr>
                 <w:rFonts w:ascii="Arial" w:hAnsi="Arial" w:cs="Arial" w:eastAsia="Microsoft YaHei"/>
                 <w:b/>
-                <w:sz w:val="16"/>
+                <w:sz w:val="17"/>
               </w:rPr>
               <w:t>Navigation:</w:t>
             </w:r>
@@ -8364,7 +8364,7 @@
               <w:rPr>
                 <w:rFonts w:ascii="Arial" w:hAnsi="Arial" w:cs="Arial" w:eastAsia="Microsoft YaHei"/>
                 <w:b w:val="0"/>
-                <w:sz w:val="16"/>
+                <w:sz w:val="17"/>
               </w:rPr>
               <w:t>In: Edit on any row of the staff list (the breadcrumb shows Events &gt; event name).</w:t>
               <w:br/>

</xml_diff>

<commit_message>
Report: each student's GenAI declaration now names their own work
Section 15 was identical in both reports, which is wrong for a personal declaration: it claimed the schema design, the delete rule and the emoji investigation for both students, and it pointed at a GENAI-DECLARATION.md that has since been removed. Each version now states what that student actually did (Bao: schema, event CRUD, delete rule, home/search, staff list, charset fix; Gao: registration endpoint, registration form, event-detail and weather, staff new/edit, deployment debug) and names the files they can defend. Table 8 is five rows in each, and the row header reads 'What I did myself' rather than 'we'.
</commit_message>
<xml_diff>
--- a/docs/report/cgao15A3-report.docx
+++ b/docs/report/cgao15A3-report.docx
@@ -13192,7 +13192,7 @@
           <w:i w:val="0"/>
           <w:sz w:val="24"/>
         </w:rPr>
-        <w:t>I acknowledge that I have used GenAI tools to complete this assessment. I used WorkBuddy (an AI coding assistant) to brainstorm the schema change needed for event registration and the set of REST endpoints that would serve both websites; to check grammar and clarity in code comments, the README and the deployment notes; to format documentation; and to review my own code for bugs, within the parameters outlined in the Assessment Brief and by the Unit Assessor.</w:t>
+        <w:t>I acknowledge that I have used GenAI tools to complete this assessment. I used WorkBuddy (an AI coding assistant) to brainstorm the registration endpoint and what it must refuse, to check grammar and clarity in code comments and the deployment notes, to format documentation, and to review my own code for bugs, within the parameters outlined in the Assessment Brief and by the Unit Assessor.</w:t>
       </w:r>
     </w:p>
     <w:p>
@@ -13224,14 +13224,14 @@
         <w:tblLayout w:type="fixed"/>
       </w:tblPr>
       <w:tblGrid>
-        <w:gridCol w:w="1780"/>
-        <w:gridCol w:w="4005"/>
-        <w:gridCol w:w="3115"/>
+        <w:gridCol w:w="1891"/>
+        <w:gridCol w:w="3672"/>
+        <w:gridCol w:w="3338"/>
       </w:tblGrid>
       <w:tr>
         <w:tc>
           <w:tcPr>
-            <w:tcW w:type="dxa" w:w="1780"/>
+            <w:tcW w:type="dxa" w:w="1891"/>
             <w:shd w:val="clear" w:color="auto" w:fill="E8EEF4"/>
           </w:tcPr>
           <w:p>
@@ -13256,7 +13256,7 @@
         </w:tc>
         <w:tc>
           <w:tcPr>
-            <w:tcW w:type="dxa" w:w="4005"/>
+            <w:tcW w:type="dxa" w:w="3672"/>
             <w:shd w:val="clear" w:color="auto" w:fill="E8EEF4"/>
           </w:tcPr>
           <w:p>
@@ -13281,7 +13281,7 @@
         </w:tc>
         <w:tc>
           <w:tcPr>
-            <w:tcW w:type="dxa" w:w="3115"/>
+            <w:tcW w:type="dxa" w:w="3338"/>
             <w:shd w:val="clear" w:color="auto" w:fill="E8EEF4"/>
           </w:tcPr>
           <w:p>
@@ -13300,7 +13300,7 @@
                 <w:b/>
                 <w:sz w:val="18"/>
               </w:rPr>
-              <w:t>What we did ourselves</w:t>
+              <w:t>What I did myself</w:t>
             </w:r>
           </w:p>
         </w:tc>
@@ -13308,7 +13308,7 @@
       <w:tr>
         <w:tc>
           <w:tcPr>
-            <w:tcW w:type="dxa" w:w="1780"/>
+            <w:tcW w:type="dxa" w:w="1891"/>
           </w:tcPr>
           <w:p>
             <w:pPr>
@@ -13326,13 +13326,13 @@
                 <w:b w:val="0"/>
                 <w:sz w:val="18"/>
               </w:rPr>
-              <w:t>Brainstorming</w:t>
+              <w:t>Brainstorming the registration endpoint</w:t>
             </w:r>
           </w:p>
         </w:tc>
         <w:tc>
           <w:tcPr>
-            <w:tcW w:type="dxa" w:w="4005"/>
+            <w:tcW w:type="dxa" w:w="3672"/>
           </w:tcPr>
           <w:p>
             <w:pPr>
@@ -13350,13 +13350,13 @@
                 <w:b w:val="0"/>
                 <w:sz w:val="18"/>
               </w:rPr>
-              <w:t>Candidate table shapes for registrations; the list of endpoints to consider</w:t>
+              <w:t>A list of the ways a booking can legitimately be refused, and the argument for answering all of them with one status code</w:t>
             </w:r>
           </w:p>
         </w:tc>
         <w:tc>
           <w:tcPr>
-            <w:tcW w:type="dxa" w:w="3115"/>
+            <w:tcW w:type="dxa" w:w="3338"/>
           </w:tcPr>
           <w:p>
             <w:pPr>
@@ -13374,7 +13374,7 @@
                 <w:b w:val="0"/>
                 <w:sz w:val="18"/>
               </w:rPr>
-              <w:t>Chose UNIQUE (event_id, email); rejected a separate attendee table; chose 409 over 400</w:t>
+              <w:t>Wrote POST /api/registrations; chose 409 for all three refusals because none of them is a malformed request; validated the eight fields before touching the database; caught MySQL error 1062 last so the unique key still wins the race</w:t>
             </w:r>
           </w:p>
         </w:tc>
@@ -13382,7 +13382,7 @@
       <w:tr>
         <w:tc>
           <w:tcPr>
-            <w:tcW w:type="dxa" w:w="1780"/>
+            <w:tcW w:type="dxa" w:w="1891"/>
           </w:tcPr>
           <w:p>
             <w:pPr>
@@ -13400,13 +13400,13 @@
                 <w:b w:val="0"/>
                 <w:sz w:val="18"/>
               </w:rPr>
-              <w:t>Code review</w:t>
+              <w:t>Brainstorming the weather feature</w:t>
             </w:r>
           </w:p>
         </w:tc>
         <w:tc>
           <w:tcPr>
-            <w:tcW w:type="dxa" w:w="4005"/>
+            <w:tcW w:type="dxa" w:w="3672"/>
           </w:tcPr>
           <w:p>
             <w:pPr>
@@ -13424,13 +13424,13 @@
                 <w:b w:val="0"/>
                 <w:sz w:val="18"/>
               </w:rPr>
-              <w:t>Pointed out that toISOString() returns a UTC date and shifts the calendar day; that the delete check and the delete itself must not be separated by other work</w:t>
+              <w:t>The idea of a server-side proxy rather than calling the third party from the browser</w:t>
             </w:r>
           </w:p>
         </w:tc>
         <w:tc>
           <w:tcPr>
-            <w:tcW w:type="dxa" w:w="3115"/>
+            <w:tcW w:type="dxa" w:w="3338"/>
           </w:tcPr>
           <w:p>
             <w:pPr>
@@ -13448,7 +13448,7 @@
                 <w:b w:val="0"/>
                 <w:sz w:val="18"/>
               </w:rPr>
-              <w:t>Reproduced both, wrote the fixes, tested them against the live API</w:t>
+              <w:t>Built api/routes/weather.js: read the coordinates from our own event row, called Open-Meteo, mapped the numeric codes to words, and made the panel degrade to 'no forecast' when the upstream call fails</w:t>
             </w:r>
           </w:p>
         </w:tc>
@@ -13456,7 +13456,7 @@
       <w:tr>
         <w:tc>
           <w:tcPr>
-            <w:tcW w:type="dxa" w:w="1780"/>
+            <w:tcW w:type="dxa" w:w="1891"/>
           </w:tcPr>
           <w:p>
             <w:pPr>
@@ -13474,13 +13474,13 @@
                 <w:b w:val="0"/>
                 <w:sz w:val="18"/>
               </w:rPr>
-              <w:t>Writing support</w:t>
+              <w:t>Code review</w:t>
             </w:r>
           </w:p>
         </w:tc>
         <w:tc>
           <w:tcPr>
-            <w:tcW w:type="dxa" w:w="4005"/>
+            <w:tcW w:type="dxa" w:w="3672"/>
           </w:tcPr>
           <w:p>
             <w:pPr>
@@ -13498,13 +13498,13 @@
                 <w:b w:val="0"/>
                 <w:sz w:val="18"/>
               </w:rPr>
-              <w:t>Grammar and clarity in comments and documentation; table formatting</w:t>
+              <w:t>Pointed out that a max attribute on an input is a hint to the browser and not a guarantee to the server</w:t>
             </w:r>
           </w:p>
         </w:tc>
         <w:tc>
           <w:tcPr>
-            <w:tcW w:type="dxa" w:w="3115"/>
+            <w:tcW w:type="dxa" w:w="3338"/>
           </w:tcPr>
           <w:p>
             <w:pPr>
@@ -13522,7 +13522,7 @@
                 <w:b w:val="0"/>
                 <w:sz w:val="18"/>
               </w:rPr>
-              <w:t>All design decisions, all final wording, and the structure of the code</w:t>
+              <w:t>Re-checked every ceiling in the submit handler, and stopped a booking date being later than the event itself; tested both by posting straight to the API</w:t>
             </w:r>
           </w:p>
         </w:tc>
@@ -13530,7 +13530,7 @@
       <w:tr>
         <w:tc>
           <w:tcPr>
-            <w:tcW w:type="dxa" w:w="1780"/>
+            <w:tcW w:type="dxa" w:w="1891"/>
           </w:tcPr>
           <w:p>
             <w:pPr>
@@ -13548,13 +13548,13 @@
                 <w:b w:val="0"/>
                 <w:sz w:val="18"/>
               </w:rPr>
-              <w:t>Debugging</w:t>
+              <w:t>Debugging the deployment</w:t>
             </w:r>
           </w:p>
         </w:tc>
         <w:tc>
           <w:tcPr>
-            <w:tcW w:type="dxa" w:w="4005"/>
+            <w:tcW w:type="dxa" w:w="3672"/>
           </w:tcPr>
           <w:p>
             <w:pPr>
@@ -13572,13 +13572,13 @@
                 <w:b w:val="0"/>
                 <w:sz w:val="18"/>
               </w:rPr>
-              <w:t>Suggested character-set causes to rule out during the emoji investigation</w:t>
+              <w:t>Suggested configuration causes to rule out when the API returned 'Access denied'</w:t>
             </w:r>
           </w:p>
         </w:tc>
         <w:tc>
           <w:tcPr>
-            <w:tcW w:type="dxa" w:w="3115"/>
+            <w:tcW w:type="dxa" w:w="3338"/>
           </w:tcPr>
           <w:p>
             <w:pPr>
@@ -13596,7 +13596,81 @@
                 <w:b w:val="0"/>
                 <w:sz w:val="18"/>
               </w:rPr>
-              <w:t>Ran the experiments that eliminated the first two explanations and identified the real one</w:t>
+              <w:t>Found that the environment variables had never been saved; moved the settings to a .env file so the configuration is explicit, and redeployed both apps</w:t>
+            </w:r>
+          </w:p>
+        </w:tc>
+      </w:tr>
+      <w:tr>
+        <w:tc>
+          <w:tcPr>
+            <w:tcW w:type="dxa" w:w="1891"/>
+          </w:tcPr>
+          <w:p>
+            <w:pPr>
+              <w:rPr>
+                <w:rFonts w:ascii="Arial" w:hAnsi="Arial" w:cs="Arial"/>
+                <w:sz w:val="18"/>
+                <w:szCs w:val="18"/>
+              </w:rPr>
+              <w:spacing w:line="240" w:lineRule="auto" w:after="40"/>
+            </w:pPr>
+            <w:r/>
+            <w:r>
+              <w:rPr>
+                <w:rFonts w:ascii="Arial" w:hAnsi="Arial" w:cs="Arial" w:eastAsia="Microsoft YaHei"/>
+                <w:b w:val="0"/>
+                <w:sz w:val="18"/>
+              </w:rPr>
+              <w:t>Writing support</w:t>
+            </w:r>
+          </w:p>
+        </w:tc>
+        <w:tc>
+          <w:tcPr>
+            <w:tcW w:type="dxa" w:w="3672"/>
+          </w:tcPr>
+          <w:p>
+            <w:pPr>
+              <w:rPr>
+                <w:rFonts w:ascii="Arial" w:hAnsi="Arial" w:cs="Arial"/>
+                <w:sz w:val="18"/>
+                <w:szCs w:val="18"/>
+              </w:rPr>
+              <w:spacing w:line="240" w:lineRule="auto" w:after="40"/>
+            </w:pPr>
+            <w:r/>
+            <w:r>
+              <w:rPr>
+                <w:rFonts w:ascii="Arial" w:hAnsi="Arial" w:cs="Arial" w:eastAsia="Microsoft YaHei"/>
+                <w:b w:val="0"/>
+                <w:sz w:val="18"/>
+              </w:rPr>
+              <w:t>Grammar and clarity in comments and documentation; table formatting</w:t>
+            </w:r>
+          </w:p>
+        </w:tc>
+        <w:tc>
+          <w:tcPr>
+            <w:tcW w:type="dxa" w:w="3338"/>
+          </w:tcPr>
+          <w:p>
+            <w:pPr>
+              <w:rPr>
+                <w:rFonts w:ascii="Arial" w:hAnsi="Arial" w:cs="Arial"/>
+                <w:sz w:val="18"/>
+                <w:szCs w:val="18"/>
+              </w:rPr>
+              <w:spacing w:line="240" w:lineRule="auto" w:after="40"/>
+            </w:pPr>
+            <w:r/>
+            <w:r>
+              <w:rPr>
+                <w:rFonts w:ascii="Arial" w:hAnsi="Arial" w:cs="Arial" w:eastAsia="Microsoft YaHei"/>
+                <w:b w:val="0"/>
+                <w:sz w:val="18"/>
+              </w:rPr>
+              <w:t>All design decisions, all final wording, and the structure of the code</w:t>
             </w:r>
           </w:p>
         </w:tc>
@@ -13622,7 +13696,7 @@
           <w:i w:val="0"/>
           <w:sz w:val="24"/>
         </w:rPr>
-        <w:t>Every design decision recorded in this report is mine and I can explain it, and I am prepared to demonstrate any file I own line by line if asked. The chat log of the sessions is kept with the submission, and a fuller statement is in GENAI-DECLARATION.md in the repository.</w:t>
+        <w:t>Every design decision recorded in this report is mine and I can explain it, and I am prepared to demonstrate any file I own line by line if asked: the registration endpoint, the registration form, the event-detail page with its bookings panel and weather panel, and the staff new-event and edit-event screens. The chat log of the sessions is kept with the submission under docs/genai-screenshots/, and this section is the declaration of record.</w:t>
       </w:r>
     </w:p>
     <w:p>

</xml_diff>